<commit_message>
Updated Sprint 2 Backlog & Sprint 1 Retrospective
I updated the sprint 2 backlog with the remaining tasks for the rest of
the sprint.
I added the tasks for sprint 2 to the sprint retrospective.
</commit_message>
<xml_diff>
--- a/sprints/sprint1/Sprint Retrospective/Sprint Retrospective Report.docx
+++ b/sprints/sprint1/Sprint Retrospective/Sprint Retrospective Report.docx
@@ -193,23 +193,7 @@
                 <w:b/>
                 <w:bCs/>
               </w:rPr>
-              <w:t xml:space="preserve">Comments (e.g., reasons why </w:t>
-            </w:r>
-            <w:proofErr w:type="gramStart"/>
-            <w:r>
-              <w:rPr>
-                <w:b/>
-                <w:bCs/>
-              </w:rPr>
-              <w:t>feature is</w:t>
-            </w:r>
-            <w:proofErr w:type="gramEnd"/>
-            <w:r>
-              <w:rPr>
-                <w:b/>
-                <w:bCs/>
-              </w:rPr>
-              <w:t xml:space="preserve"> incomplete)</w:t>
+              <w:t>Comments (e.g., reasons why feature is incomplete)</w:t>
             </w:r>
           </w:p>
         </w:tc>
@@ -840,7 +824,7 @@
           </w:tcPr>
           <w:p>
             <w:r>
-              <w:t>Incomplete</w:t>
+              <w:t>Not Started</w:t>
             </w:r>
           </w:p>
         </w:tc>
@@ -848,11 +832,7 @@
           <w:tcPr>
             <w:tcW w:w="2316" w:type="dxa"/>
           </w:tcPr>
-          <w:p>
-            <w:r>
-              <w:t>There are some back-end methods that can be used to implement this but there is no UI page to do the changes.</w:t>
-            </w:r>
-          </w:p>
+          <w:p/>
         </w:tc>
       </w:tr>
       <w:tr>
@@ -927,7 +907,6 @@
                 <w:rFonts w:ascii="Calibri" w:hAnsi="Calibri" w:cs="Calibri"/>
                 <w:color w:val="000000"/>
               </w:rPr>
-              <w:lastRenderedPageBreak/>
               <w:t>Be informed if I am trying to eat something that will violate my diet plan.</w:t>
             </w:r>
           </w:p>
@@ -1162,21 +1141,8 @@
           <w:numId w:val="1"/>
         </w:numPr>
       </w:pPr>
-      <w:proofErr w:type="gramStart"/>
-      <w:r>
-        <w:t>A git</w:t>
-      </w:r>
-      <w:proofErr w:type="gramEnd"/>
-      <w:r>
-        <w:t xml:space="preserve"> </w:t>
-      </w:r>
-      <w:proofErr w:type="gramStart"/>
-      <w:r>
-        <w:t>commit</w:t>
-      </w:r>
-      <w:proofErr w:type="gramEnd"/>
-      <w:r>
-        <w:t xml:space="preserve"> message (please include the commit ID and date/time)</w:t>
+      <w:r>
+        <w:t>A git commit message (please include the commit ID and date/time)</w:t>
       </w:r>
     </w:p>
     <w:p>
@@ -1241,15 +1207,7 @@
         </w:numPr>
       </w:pPr>
       <w:r>
-        <w:t xml:space="preserve">providing </w:t>
-      </w:r>
-      <w:proofErr w:type="gramStart"/>
-      <w:r>
-        <w:t>detail</w:t>
-      </w:r>
-      <w:proofErr w:type="gramEnd"/>
-      <w:r>
-        <w:t xml:space="preserve"> as to how to reproduce a bug</w:t>
+        <w:t>providing detail as to how to reproduce a bug</w:t>
       </w:r>
     </w:p>
     <w:p>
@@ -1375,31 +1333,7 @@
                 <w:szCs w:val="21"/>
                 <w14:ligatures w14:val="none"/>
               </w:rPr>
-              <w:t xml:space="preserve">I've updated the product backlog, sprint backlog, and Planning meeting notes in the repo so that is all current after </w:t>
-            </w:r>
-            <w:proofErr w:type="spellStart"/>
-            <w:proofErr w:type="gramStart"/>
-            <w:r>
-              <w:rPr>
-                <w:rFonts w:ascii="Segoe UI" w:eastAsia="Times New Roman" w:hAnsi="Segoe UI" w:cs="Segoe UI"/>
-                <w:kern w:val="0"/>
-                <w:sz w:val="21"/>
-                <w:szCs w:val="21"/>
-                <w14:ligatures w14:val="none"/>
-              </w:rPr>
-              <w:t>todays</w:t>
-            </w:r>
-            <w:proofErr w:type="spellEnd"/>
-            <w:proofErr w:type="gramEnd"/>
-            <w:r>
-              <w:rPr>
-                <w:rFonts w:ascii="Segoe UI" w:eastAsia="Times New Roman" w:hAnsi="Segoe UI" w:cs="Segoe UI"/>
-                <w:kern w:val="0"/>
-                <w:sz w:val="21"/>
-                <w:szCs w:val="21"/>
-                <w14:ligatures w14:val="none"/>
-              </w:rPr>
-              <w:t xml:space="preserve"> meeting.</w:t>
+              <w:t>I've updated the product backlog, sprint backlog, and Planning meeting notes in the repo so that is all current after todays meeting.</w:t>
             </w:r>
           </w:p>
           <w:p>
@@ -1425,29 +1359,7 @@
                 <w:szCs w:val="21"/>
                 <w14:ligatures w14:val="none"/>
               </w:rPr>
-              <w:t xml:space="preserve">Everyone needs to do the task descriptions of their assigned stuff in the sprint backlog and estimate their hours. If anyone decides that they have too much or not enough to reach roughly 25 hours for the </w:t>
-            </w:r>
-            <w:proofErr w:type="gramStart"/>
-            <w:r>
-              <w:rPr>
-                <w:rFonts w:ascii="Segoe UI" w:eastAsia="Times New Roman" w:hAnsi="Segoe UI" w:cs="Segoe UI"/>
-                <w:kern w:val="0"/>
-                <w:sz w:val="21"/>
-                <w:szCs w:val="21"/>
-                <w14:ligatures w14:val="none"/>
-              </w:rPr>
-              <w:t>sprint</w:t>
-            </w:r>
-            <w:proofErr w:type="gramEnd"/>
-            <w:r>
-              <w:rPr>
-                <w:rFonts w:ascii="Segoe UI" w:eastAsia="Times New Roman" w:hAnsi="Segoe UI" w:cs="Segoe UI"/>
-                <w:kern w:val="0"/>
-                <w:sz w:val="21"/>
-                <w:szCs w:val="21"/>
-                <w14:ligatures w14:val="none"/>
-              </w:rPr>
-              <w:t xml:space="preserve"> please reach out so we can discuss reallocating stuff. </w:t>
+              <w:t>Everyone needs to do the task descriptions of their assigned stuff in the sprint backlog and estimate their hours. If anyone decides that they have too much or not enough to reach roughly 25 hours for the sprint please reach out so we can discuss reallocating stuff. </w:t>
             </w:r>
           </w:p>
           <w:p>
@@ -1517,7 +1429,6 @@
                 <w14:ligatures w14:val="none"/>
               </w:rPr>
             </w:pPr>
-            <w:proofErr w:type="gramStart"/>
             <w:r>
               <w:rPr>
                 <w:rFonts w:ascii="Segoe UI" w:eastAsia="Times New Roman" w:hAnsi="Segoe UI" w:cs="Segoe UI"/>
@@ -1526,10 +1437,12 @@
                 <w:szCs w:val="21"/>
                 <w14:ligatures w14:val="none"/>
               </w:rPr>
-              <w:t>Everyone</w:t>
-            </w:r>
-            <w:proofErr w:type="gramEnd"/>
-            <w:r>
+              <w:t>Everyone when you add new classes and things to the code make sure you add them to the class diagram and that they are fully tested.</w:t>
+            </w:r>
+          </w:p>
+          <w:p>
+            <w:pPr>
+              <w:spacing w:before="100" w:beforeAutospacing="1" w:after="100" w:afterAutospacing="1"/>
               <w:rPr>
                 <w:rFonts w:ascii="Segoe UI" w:eastAsia="Times New Roman" w:hAnsi="Segoe UI" w:cs="Segoe UI"/>
                 <w:kern w:val="0"/>
@@ -1537,9 +1450,7 @@
                 <w:szCs w:val="21"/>
                 <w14:ligatures w14:val="none"/>
               </w:rPr>
-              <w:t xml:space="preserve"> when you add new classes and things to the </w:t>
-            </w:r>
-            <w:proofErr w:type="gramStart"/>
+            </w:pPr>
             <w:r>
               <w:rPr>
                 <w:rFonts w:ascii="Segoe UI" w:eastAsia="Times New Roman" w:hAnsi="Segoe UI" w:cs="Segoe UI"/>
@@ -1548,62 +1459,7 @@
                 <w:szCs w:val="21"/>
                 <w14:ligatures w14:val="none"/>
               </w:rPr>
-              <w:t>code</w:t>
-            </w:r>
-            <w:proofErr w:type="gramEnd"/>
-            <w:r>
-              <w:rPr>
-                <w:rFonts w:ascii="Segoe UI" w:eastAsia="Times New Roman" w:hAnsi="Segoe UI" w:cs="Segoe UI"/>
-                <w:kern w:val="0"/>
-                <w:sz w:val="21"/>
-                <w:szCs w:val="21"/>
-                <w14:ligatures w14:val="none"/>
-              </w:rPr>
-              <w:t xml:space="preserve"> make sure you add them to the class diagram and that they are fully tested.</w:t>
-            </w:r>
-          </w:p>
-          <w:p>
-            <w:pPr>
-              <w:spacing w:before="100" w:beforeAutospacing="1" w:after="100" w:afterAutospacing="1"/>
-              <w:rPr>
-                <w:rFonts w:ascii="Segoe UI" w:eastAsia="Times New Roman" w:hAnsi="Segoe UI" w:cs="Segoe UI"/>
-                <w:kern w:val="0"/>
-                <w:sz w:val="21"/>
-                <w:szCs w:val="21"/>
-                <w14:ligatures w14:val="none"/>
-              </w:rPr>
-            </w:pPr>
-            <w:r>
-              <w:rPr>
-                <w:rFonts w:ascii="Segoe UI" w:eastAsia="Times New Roman" w:hAnsi="Segoe UI" w:cs="Segoe UI"/>
-                <w:kern w:val="0"/>
-                <w:sz w:val="21"/>
-                <w:szCs w:val="21"/>
-                <w14:ligatures w14:val="none"/>
-              </w:rPr>
-              <w:t xml:space="preserve">Everyone </w:t>
-            </w:r>
-            <w:proofErr w:type="gramStart"/>
-            <w:r>
-              <w:rPr>
-                <w:rFonts w:ascii="Segoe UI" w:eastAsia="Times New Roman" w:hAnsi="Segoe UI" w:cs="Segoe UI"/>
-                <w:kern w:val="0"/>
-                <w:sz w:val="21"/>
-                <w:szCs w:val="21"/>
-                <w14:ligatures w14:val="none"/>
-              </w:rPr>
-              <w:t>have</w:t>
-            </w:r>
-            <w:proofErr w:type="gramEnd"/>
-            <w:r>
-              <w:rPr>
-                <w:rFonts w:ascii="Segoe UI" w:eastAsia="Times New Roman" w:hAnsi="Segoe UI" w:cs="Segoe UI"/>
-                <w:kern w:val="0"/>
-                <w:sz w:val="21"/>
-                <w:szCs w:val="21"/>
-                <w14:ligatures w14:val="none"/>
-              </w:rPr>
-              <w:t xml:space="preserve"> a good weekend! </w:t>
+              <w:t>Everyone have a good weekend! </w:t>
             </w:r>
           </w:p>
         </w:tc>
@@ -1625,23 +1481,7 @@
           </w:tcPr>
           <w:p>
             <w:r>
-              <w:t xml:space="preserve">Just to </w:t>
-            </w:r>
-            <w:proofErr w:type="gramStart"/>
-            <w:r>
-              <w:t>list off</w:t>
-            </w:r>
-            <w:proofErr w:type="gramEnd"/>
-            <w:r>
-              <w:t xml:space="preserve"> our </w:t>
-            </w:r>
-            <w:proofErr w:type="gramStart"/>
-            <w:r>
-              <w:t>follow up</w:t>
-            </w:r>
-            <w:proofErr w:type="gramEnd"/>
-            <w:r>
-              <w:t xml:space="preserve"> tasks from the meeting.</w:t>
+              <w:t>Just to list off our follow up tasks from the meeting.</w:t>
             </w:r>
           </w:p>
           <w:p>
@@ -1656,15 +1496,7 @@
           </w:p>
           <w:p>
             <w:r>
-              <w:t xml:space="preserve">Emi will </w:t>
-            </w:r>
-            <w:proofErr w:type="gramStart"/>
-            <w:r>
-              <w:t>mock up</w:t>
-            </w:r>
-            <w:proofErr w:type="gramEnd"/>
-            <w:r>
-              <w:t xml:space="preserve"> some Wireframes</w:t>
+              <w:t>Emi will mock up some Wireframes</w:t>
             </w:r>
           </w:p>
           <w:p>
@@ -1674,31 +1506,7 @@
           </w:p>
           <w:p>
             <w:r>
-              <w:t xml:space="preserve">I will also post the product </w:t>
-            </w:r>
-            <w:proofErr w:type="gramStart"/>
-            <w:r>
-              <w:t>back log</w:t>
-            </w:r>
-            <w:proofErr w:type="gramEnd"/>
-            <w:r>
-              <w:t xml:space="preserve"> and sprint backlog in the shared documents on the </w:t>
-            </w:r>
-            <w:proofErr w:type="gramStart"/>
-            <w:r>
-              <w:t>teams</w:t>
-            </w:r>
-            <w:proofErr w:type="gramEnd"/>
-            <w:r>
-              <w:t xml:space="preserve"> channel. If anyone thinks of anything we need to add or </w:t>
-            </w:r>
-            <w:proofErr w:type="gramStart"/>
-            <w:r>
-              <w:t>edit on those</w:t>
-            </w:r>
-            <w:proofErr w:type="gramEnd"/>
-            <w:r>
-              <w:t xml:space="preserve"> over the next few days before our meeting just let me know. </w:t>
+              <w:t>I will also post the product back log and sprint backlog in the shared documents on the teams channel. If anyone thinks of anything we need to add or edit on those over the next few days before our meeting just let me know. </w:t>
             </w:r>
           </w:p>
         </w:tc>
@@ -1710,7 +1518,6 @@
           </w:tcPr>
           <w:p>
             <w:r>
-              <w:lastRenderedPageBreak/>
               <w:t>Justin Smith</w:t>
             </w:r>
           </w:p>
@@ -1805,6 +1612,7 @@
                 <w:b/>
                 <w:bCs/>
               </w:rPr>
+              <w:lastRenderedPageBreak/>
               <w:t>Priority</w:t>
             </w:r>
           </w:p>
@@ -1854,60 +1662,1551 @@
         <w:tc>
           <w:tcPr>
             <w:tcW w:w="985" w:type="dxa"/>
-          </w:tcPr>
-          <w:p/>
+            <w:vAlign w:val="bottom"/>
+          </w:tcPr>
+          <w:p>
+            <w:r>
+              <w:rPr>
+                <w:rFonts w:ascii="Calibri" w:hAnsi="Calibri" w:cs="Calibri"/>
+                <w:color w:val="000000"/>
+              </w:rPr>
+              <w:t>1.1</w:t>
+            </w:r>
+          </w:p>
         </w:tc>
         <w:tc>
           <w:tcPr>
             <w:tcW w:w="6120" w:type="dxa"/>
-          </w:tcPr>
-          <w:p/>
+            <w:vAlign w:val="bottom"/>
+          </w:tcPr>
+          <w:p>
+            <w:r>
+              <w:rPr>
+                <w:rFonts w:ascii="Calibri" w:hAnsi="Calibri" w:cs="Calibri"/>
+                <w:color w:val="000000"/>
+              </w:rPr>
+              <w:t>Communication Protecol for authorization process</w:t>
+            </w:r>
+          </w:p>
         </w:tc>
         <w:tc>
           <w:tcPr>
             <w:tcW w:w="2250" w:type="dxa"/>
-          </w:tcPr>
-          <w:p/>
+            <w:vAlign w:val="bottom"/>
+          </w:tcPr>
+          <w:p>
+            <w:r>
+              <w:rPr>
+                <w:rFonts w:ascii="Calibri" w:hAnsi="Calibri" w:cs="Calibri"/>
+                <w:color w:val="000000"/>
+              </w:rPr>
+              <w:t>Team</w:t>
+            </w:r>
+          </w:p>
         </w:tc>
       </w:tr>
       <w:tr>
         <w:tc>
           <w:tcPr>
             <w:tcW w:w="985" w:type="dxa"/>
-          </w:tcPr>
-          <w:p/>
+            <w:vAlign w:val="bottom"/>
+          </w:tcPr>
+          <w:p>
+            <w:r>
+              <w:rPr>
+                <w:rFonts w:ascii="Calibri" w:hAnsi="Calibri" w:cs="Calibri"/>
+                <w:color w:val="000000"/>
+              </w:rPr>
+              <w:t>1.1</w:t>
+            </w:r>
+          </w:p>
         </w:tc>
         <w:tc>
           <w:tcPr>
             <w:tcW w:w="6120" w:type="dxa"/>
-          </w:tcPr>
-          <w:p/>
+            <w:vAlign w:val="bottom"/>
+          </w:tcPr>
+          <w:p>
+            <w:r>
+              <w:rPr>
+                <w:rFonts w:ascii="Calibri" w:hAnsi="Calibri" w:cs="Calibri"/>
+                <w:color w:val="000000"/>
+              </w:rPr>
+              <w:t>User Class structure</w:t>
+            </w:r>
+          </w:p>
         </w:tc>
         <w:tc>
           <w:tcPr>
             <w:tcW w:w="2250" w:type="dxa"/>
-          </w:tcPr>
-          <w:p/>
+            <w:vAlign w:val="bottom"/>
+          </w:tcPr>
+          <w:p>
+            <w:r>
+              <w:rPr>
+                <w:rFonts w:ascii="Calibri" w:hAnsi="Calibri" w:cs="Calibri"/>
+                <w:color w:val="000000"/>
+              </w:rPr>
+              <w:t>Team</w:t>
+            </w:r>
+          </w:p>
         </w:tc>
       </w:tr>
       <w:tr>
         <w:tc>
           <w:tcPr>
             <w:tcW w:w="985" w:type="dxa"/>
-          </w:tcPr>
-          <w:p/>
+            <w:vAlign w:val="bottom"/>
+          </w:tcPr>
+          <w:p>
+            <w:r>
+              <w:rPr>
+                <w:rFonts w:ascii="Calibri" w:hAnsi="Calibri" w:cs="Calibri"/>
+                <w:color w:val="000000"/>
+              </w:rPr>
+              <w:t>1.2</w:t>
+            </w:r>
+          </w:p>
         </w:tc>
         <w:tc>
           <w:tcPr>
             <w:tcW w:w="6120" w:type="dxa"/>
-          </w:tcPr>
-          <w:p/>
+            <w:vAlign w:val="bottom"/>
+          </w:tcPr>
+          <w:p>
+            <w:r>
+              <w:rPr>
+                <w:rFonts w:ascii="Calibri" w:hAnsi="Calibri" w:cs="Calibri"/>
+                <w:color w:val="000000"/>
+              </w:rPr>
+              <w:t>Authorization Process Client Side</w:t>
+            </w:r>
+          </w:p>
         </w:tc>
         <w:tc>
           <w:tcPr>
             <w:tcW w:w="2250" w:type="dxa"/>
-          </w:tcPr>
-          <w:p/>
+            <w:vAlign w:val="bottom"/>
+          </w:tcPr>
+          <w:p>
+            <w:r>
+              <w:rPr>
+                <w:rFonts w:ascii="Calibri" w:hAnsi="Calibri" w:cs="Calibri"/>
+                <w:color w:val="000000"/>
+              </w:rPr>
+              <w:t>Emi</w:t>
+            </w:r>
+          </w:p>
+        </w:tc>
+      </w:tr>
+      <w:tr>
+        <w:tc>
+          <w:tcPr>
+            <w:tcW w:w="985" w:type="dxa"/>
+            <w:vAlign w:val="bottom"/>
+          </w:tcPr>
+          <w:p>
+            <w:r>
+              <w:rPr>
+                <w:rFonts w:ascii="Calibri" w:hAnsi="Calibri" w:cs="Calibri"/>
+                <w:color w:val="000000"/>
+              </w:rPr>
+              <w:t>1.2</w:t>
+            </w:r>
+          </w:p>
+        </w:tc>
+        <w:tc>
+          <w:tcPr>
+            <w:tcW w:w="6120" w:type="dxa"/>
+            <w:vAlign w:val="bottom"/>
+          </w:tcPr>
+          <w:p>
+            <w:r>
+              <w:rPr>
+                <w:rFonts w:ascii="Calibri" w:hAnsi="Calibri" w:cs="Calibri"/>
+                <w:color w:val="000000"/>
+              </w:rPr>
+              <w:t>Authorization Process Server Side</w:t>
+            </w:r>
+          </w:p>
+        </w:tc>
+        <w:tc>
+          <w:tcPr>
+            <w:tcW w:w="2250" w:type="dxa"/>
+            <w:vAlign w:val="bottom"/>
+          </w:tcPr>
+          <w:p>
+            <w:r>
+              <w:rPr>
+                <w:rFonts w:ascii="Calibri" w:hAnsi="Calibri" w:cs="Calibri"/>
+                <w:color w:val="000000"/>
+              </w:rPr>
+              <w:t>Justin</w:t>
+            </w:r>
+          </w:p>
+        </w:tc>
+      </w:tr>
+      <w:tr>
+        <w:tc>
+          <w:tcPr>
+            <w:tcW w:w="985" w:type="dxa"/>
+            <w:vAlign w:val="bottom"/>
+          </w:tcPr>
+          <w:p>
+            <w:r>
+              <w:rPr>
+                <w:rFonts w:ascii="Calibri" w:hAnsi="Calibri" w:cs="Calibri"/>
+                <w:color w:val="000000"/>
+              </w:rPr>
+              <w:t>1.2</w:t>
+            </w:r>
+          </w:p>
+        </w:tc>
+        <w:tc>
+          <w:tcPr>
+            <w:tcW w:w="6120" w:type="dxa"/>
+            <w:vAlign w:val="bottom"/>
+          </w:tcPr>
+          <w:p>
+            <w:r>
+              <w:rPr>
+                <w:rFonts w:ascii="Calibri" w:hAnsi="Calibri" w:cs="Calibri"/>
+                <w:color w:val="000000"/>
+              </w:rPr>
+              <w:t>Display logged in user's info on landing page</w:t>
+            </w:r>
+          </w:p>
+        </w:tc>
+        <w:tc>
+          <w:tcPr>
+            <w:tcW w:w="2250" w:type="dxa"/>
+            <w:vAlign w:val="bottom"/>
+          </w:tcPr>
+          <w:p>
+            <w:r>
+              <w:rPr>
+                <w:rFonts w:ascii="Calibri" w:hAnsi="Calibri" w:cs="Calibri"/>
+                <w:color w:val="000000"/>
+              </w:rPr>
+              <w:t>Victor</w:t>
+            </w:r>
+          </w:p>
+        </w:tc>
+      </w:tr>
+      <w:tr>
+        <w:tc>
+          <w:tcPr>
+            <w:tcW w:w="985" w:type="dxa"/>
+            <w:vAlign w:val="bottom"/>
+          </w:tcPr>
+          <w:p>
+            <w:r>
+              <w:rPr>
+                <w:rFonts w:ascii="Calibri" w:hAnsi="Calibri" w:cs="Calibri"/>
+                <w:color w:val="000000"/>
+              </w:rPr>
+              <w:t>1.2</w:t>
+            </w:r>
+          </w:p>
+        </w:tc>
+        <w:tc>
+          <w:tcPr>
+            <w:tcW w:w="6120" w:type="dxa"/>
+            <w:vAlign w:val="bottom"/>
+          </w:tcPr>
+          <w:p>
+            <w:r>
+              <w:rPr>
+                <w:rFonts w:ascii="Calibri" w:hAnsi="Calibri" w:cs="Calibri"/>
+                <w:color w:val="000000"/>
+              </w:rPr>
+              <w:t>Login UI Page</w:t>
+            </w:r>
+          </w:p>
+        </w:tc>
+        <w:tc>
+          <w:tcPr>
+            <w:tcW w:w="2250" w:type="dxa"/>
+            <w:vAlign w:val="bottom"/>
+          </w:tcPr>
+          <w:p>
+            <w:r>
+              <w:rPr>
+                <w:rFonts w:ascii="Calibri" w:hAnsi="Calibri" w:cs="Calibri"/>
+                <w:color w:val="000000"/>
+              </w:rPr>
+              <w:t>Yeni</w:t>
+            </w:r>
+          </w:p>
+        </w:tc>
+      </w:tr>
+      <w:tr>
+        <w:tc>
+          <w:tcPr>
+            <w:tcW w:w="985" w:type="dxa"/>
+            <w:vAlign w:val="bottom"/>
+          </w:tcPr>
+          <w:p>
+            <w:r>
+              <w:rPr>
+                <w:rFonts w:ascii="Calibri" w:hAnsi="Calibri" w:cs="Calibri"/>
+                <w:color w:val="000000"/>
+              </w:rPr>
+              <w:t>1.3</w:t>
+            </w:r>
+          </w:p>
+        </w:tc>
+        <w:tc>
+          <w:tcPr>
+            <w:tcW w:w="6120" w:type="dxa"/>
+            <w:vAlign w:val="bottom"/>
+          </w:tcPr>
+          <w:p>
+            <w:r>
+              <w:rPr>
+                <w:rFonts w:ascii="Calibri" w:hAnsi="Calibri" w:cs="Calibri"/>
+                <w:color w:val="000000"/>
+              </w:rPr>
+              <w:t>Login Page Codebehind</w:t>
+            </w:r>
+          </w:p>
+        </w:tc>
+        <w:tc>
+          <w:tcPr>
+            <w:tcW w:w="2250" w:type="dxa"/>
+            <w:vAlign w:val="bottom"/>
+          </w:tcPr>
+          <w:p>
+            <w:r>
+              <w:rPr>
+                <w:rFonts w:ascii="Calibri" w:hAnsi="Calibri" w:cs="Calibri"/>
+                <w:color w:val="000000"/>
+              </w:rPr>
+              <w:t>Yeni</w:t>
+            </w:r>
+          </w:p>
+        </w:tc>
+      </w:tr>
+      <w:tr>
+        <w:tc>
+          <w:tcPr>
+            <w:tcW w:w="985" w:type="dxa"/>
+            <w:vAlign w:val="bottom"/>
+          </w:tcPr>
+          <w:p>
+            <w:r>
+              <w:rPr>
+                <w:rFonts w:ascii="Calibri" w:hAnsi="Calibri" w:cs="Calibri"/>
+                <w:color w:val="000000"/>
+              </w:rPr>
+              <w:t>2.1</w:t>
+            </w:r>
+          </w:p>
+        </w:tc>
+        <w:tc>
+          <w:tcPr>
+            <w:tcW w:w="6120" w:type="dxa"/>
+            <w:vAlign w:val="bottom"/>
+          </w:tcPr>
+          <w:p>
+            <w:r>
+              <w:rPr>
+                <w:rFonts w:ascii="Calibri" w:hAnsi="Calibri" w:cs="Calibri"/>
+                <w:color w:val="000000"/>
+              </w:rPr>
+              <w:t>Communication Protecol for Create Account</w:t>
+            </w:r>
+          </w:p>
+        </w:tc>
+        <w:tc>
+          <w:tcPr>
+            <w:tcW w:w="2250" w:type="dxa"/>
+            <w:vAlign w:val="bottom"/>
+          </w:tcPr>
+          <w:p>
+            <w:r>
+              <w:rPr>
+                <w:rFonts w:ascii="Calibri" w:hAnsi="Calibri" w:cs="Calibri"/>
+                <w:color w:val="000000"/>
+              </w:rPr>
+              <w:t>Team</w:t>
+            </w:r>
+          </w:p>
+        </w:tc>
+      </w:tr>
+      <w:tr>
+        <w:tc>
+          <w:tcPr>
+            <w:tcW w:w="985" w:type="dxa"/>
+            <w:vAlign w:val="bottom"/>
+          </w:tcPr>
+          <w:p>
+            <w:r>
+              <w:rPr>
+                <w:rFonts w:ascii="Calibri" w:hAnsi="Calibri" w:cs="Calibri"/>
+                <w:color w:val="000000"/>
+              </w:rPr>
+              <w:t>2.1</w:t>
+            </w:r>
+          </w:p>
+        </w:tc>
+        <w:tc>
+          <w:tcPr>
+            <w:tcW w:w="6120" w:type="dxa"/>
+            <w:vAlign w:val="bottom"/>
+          </w:tcPr>
+          <w:p>
+            <w:r>
+              <w:rPr>
+                <w:rFonts w:ascii="Calibri" w:hAnsi="Calibri" w:cs="Calibri"/>
+                <w:color w:val="000000"/>
+              </w:rPr>
+              <w:t>Credentials Structure</w:t>
+            </w:r>
+          </w:p>
+        </w:tc>
+        <w:tc>
+          <w:tcPr>
+            <w:tcW w:w="2250" w:type="dxa"/>
+            <w:vAlign w:val="bottom"/>
+          </w:tcPr>
+          <w:p>
+            <w:r>
+              <w:rPr>
+                <w:rFonts w:ascii="Calibri" w:hAnsi="Calibri" w:cs="Calibri"/>
+                <w:color w:val="000000"/>
+              </w:rPr>
+              <w:t>Team</w:t>
+            </w:r>
+          </w:p>
+        </w:tc>
+      </w:tr>
+      <w:tr>
+        <w:tc>
+          <w:tcPr>
+            <w:tcW w:w="985" w:type="dxa"/>
+            <w:vAlign w:val="bottom"/>
+          </w:tcPr>
+          <w:p>
+            <w:r>
+              <w:rPr>
+                <w:rFonts w:ascii="Calibri" w:hAnsi="Calibri" w:cs="Calibri"/>
+                <w:color w:val="000000"/>
+              </w:rPr>
+              <w:t>2.2</w:t>
+            </w:r>
+          </w:p>
+        </w:tc>
+        <w:tc>
+          <w:tcPr>
+            <w:tcW w:w="6120" w:type="dxa"/>
+            <w:vAlign w:val="bottom"/>
+          </w:tcPr>
+          <w:p>
+            <w:r>
+              <w:rPr>
+                <w:rFonts w:ascii="Calibri" w:hAnsi="Calibri" w:cs="Calibri"/>
+                <w:color w:val="000000"/>
+              </w:rPr>
+              <w:t>Create Account Process Client Side</w:t>
+            </w:r>
+          </w:p>
+        </w:tc>
+        <w:tc>
+          <w:tcPr>
+            <w:tcW w:w="2250" w:type="dxa"/>
+            <w:vAlign w:val="bottom"/>
+          </w:tcPr>
+          <w:p>
+            <w:r>
+              <w:rPr>
+                <w:rFonts w:ascii="Calibri" w:hAnsi="Calibri" w:cs="Calibri"/>
+                <w:color w:val="000000"/>
+              </w:rPr>
+              <w:t>Justin</w:t>
+            </w:r>
+          </w:p>
+        </w:tc>
+      </w:tr>
+      <w:tr>
+        <w:tc>
+          <w:tcPr>
+            <w:tcW w:w="985" w:type="dxa"/>
+            <w:vAlign w:val="bottom"/>
+          </w:tcPr>
+          <w:p>
+            <w:r>
+              <w:rPr>
+                <w:rFonts w:ascii="Calibri" w:hAnsi="Calibri" w:cs="Calibri"/>
+                <w:color w:val="000000"/>
+              </w:rPr>
+              <w:t>2.2</w:t>
+            </w:r>
+          </w:p>
+        </w:tc>
+        <w:tc>
+          <w:tcPr>
+            <w:tcW w:w="6120" w:type="dxa"/>
+            <w:vAlign w:val="bottom"/>
+          </w:tcPr>
+          <w:p>
+            <w:r>
+              <w:rPr>
+                <w:rFonts w:ascii="Calibri" w:hAnsi="Calibri" w:cs="Calibri"/>
+                <w:color w:val="000000"/>
+              </w:rPr>
+              <w:t>Create Account Process Server Side</w:t>
+            </w:r>
+          </w:p>
+        </w:tc>
+        <w:tc>
+          <w:tcPr>
+            <w:tcW w:w="2250" w:type="dxa"/>
+            <w:vAlign w:val="bottom"/>
+          </w:tcPr>
+          <w:p>
+            <w:r>
+              <w:rPr>
+                <w:rFonts w:ascii="Calibri" w:hAnsi="Calibri" w:cs="Calibri"/>
+                <w:color w:val="000000"/>
+              </w:rPr>
+              <w:t>Yeni</w:t>
+            </w:r>
+          </w:p>
+        </w:tc>
+      </w:tr>
+      <w:tr>
+        <w:tc>
+          <w:tcPr>
+            <w:tcW w:w="985" w:type="dxa"/>
+            <w:vAlign w:val="bottom"/>
+          </w:tcPr>
+          <w:p>
+            <w:r>
+              <w:rPr>
+                <w:rFonts w:ascii="Calibri" w:hAnsi="Calibri" w:cs="Calibri"/>
+                <w:color w:val="000000"/>
+              </w:rPr>
+              <w:t>2.2</w:t>
+            </w:r>
+          </w:p>
+        </w:tc>
+        <w:tc>
+          <w:tcPr>
+            <w:tcW w:w="6120" w:type="dxa"/>
+            <w:vAlign w:val="bottom"/>
+          </w:tcPr>
+          <w:p>
+            <w:r>
+              <w:rPr>
+                <w:rFonts w:ascii="Calibri" w:hAnsi="Calibri" w:cs="Calibri"/>
+                <w:color w:val="000000"/>
+              </w:rPr>
+              <w:t>Create Account UI Page</w:t>
+            </w:r>
+          </w:p>
+        </w:tc>
+        <w:tc>
+          <w:tcPr>
+            <w:tcW w:w="2250" w:type="dxa"/>
+            <w:vAlign w:val="bottom"/>
+          </w:tcPr>
+          <w:p>
+            <w:r>
+              <w:rPr>
+                <w:rFonts w:ascii="Calibri" w:hAnsi="Calibri" w:cs="Calibri"/>
+                <w:color w:val="000000"/>
+              </w:rPr>
+              <w:t>Emi</w:t>
+            </w:r>
+          </w:p>
+        </w:tc>
+      </w:tr>
+      <w:tr>
+        <w:tc>
+          <w:tcPr>
+            <w:tcW w:w="985" w:type="dxa"/>
+            <w:vAlign w:val="bottom"/>
+          </w:tcPr>
+          <w:p>
+            <w:r>
+              <w:rPr>
+                <w:rFonts w:ascii="Calibri" w:hAnsi="Calibri" w:cs="Calibri"/>
+                <w:color w:val="000000"/>
+              </w:rPr>
+              <w:t>2.2</w:t>
+            </w:r>
+          </w:p>
+        </w:tc>
+        <w:tc>
+          <w:tcPr>
+            <w:tcW w:w="6120" w:type="dxa"/>
+            <w:vAlign w:val="bottom"/>
+          </w:tcPr>
+          <w:p>
+            <w:r>
+              <w:rPr>
+                <w:rFonts w:ascii="Calibri" w:hAnsi="Calibri" w:cs="Calibri"/>
+                <w:color w:val="000000"/>
+              </w:rPr>
+              <w:t>Display User Info on Landing After Creation</w:t>
+            </w:r>
+          </w:p>
+        </w:tc>
+        <w:tc>
+          <w:tcPr>
+            <w:tcW w:w="2250" w:type="dxa"/>
+            <w:vAlign w:val="bottom"/>
+          </w:tcPr>
+          <w:p>
+            <w:r>
+              <w:rPr>
+                <w:rFonts w:ascii="Calibri" w:hAnsi="Calibri" w:cs="Calibri"/>
+                <w:color w:val="000000"/>
+              </w:rPr>
+              <w:t>Victor</w:t>
+            </w:r>
+          </w:p>
+        </w:tc>
+      </w:tr>
+      <w:tr>
+        <w:tc>
+          <w:tcPr>
+            <w:tcW w:w="985" w:type="dxa"/>
+            <w:vAlign w:val="bottom"/>
+          </w:tcPr>
+          <w:p>
+            <w:r>
+              <w:rPr>
+                <w:rFonts w:ascii="Calibri" w:hAnsi="Calibri" w:cs="Calibri"/>
+                <w:color w:val="000000"/>
+              </w:rPr>
+              <w:t>2.3</w:t>
+            </w:r>
+          </w:p>
+        </w:tc>
+        <w:tc>
+          <w:tcPr>
+            <w:tcW w:w="6120" w:type="dxa"/>
+            <w:vAlign w:val="bottom"/>
+          </w:tcPr>
+          <w:p>
+            <w:r>
+              <w:rPr>
+                <w:rFonts w:ascii="Calibri" w:hAnsi="Calibri" w:cs="Calibri"/>
+                <w:color w:val="000000"/>
+              </w:rPr>
+              <w:t>Create Account Page Code Behind</w:t>
+            </w:r>
+          </w:p>
+        </w:tc>
+        <w:tc>
+          <w:tcPr>
+            <w:tcW w:w="2250" w:type="dxa"/>
+            <w:vAlign w:val="bottom"/>
+          </w:tcPr>
+          <w:p>
+            <w:r>
+              <w:rPr>
+                <w:rFonts w:ascii="Calibri" w:hAnsi="Calibri" w:cs="Calibri"/>
+                <w:color w:val="000000"/>
+              </w:rPr>
+              <w:t>Emi</w:t>
+            </w:r>
+          </w:p>
+        </w:tc>
+      </w:tr>
+      <w:tr>
+        <w:tc>
+          <w:tcPr>
+            <w:tcW w:w="985" w:type="dxa"/>
+            <w:vAlign w:val="bottom"/>
+          </w:tcPr>
+          <w:p>
+            <w:r>
+              <w:rPr>
+                <w:rFonts w:ascii="Calibri" w:hAnsi="Calibri" w:cs="Calibri"/>
+                <w:color w:val="000000"/>
+              </w:rPr>
+              <w:t>3.1</w:t>
+            </w:r>
+          </w:p>
+        </w:tc>
+        <w:tc>
+          <w:tcPr>
+            <w:tcW w:w="6120" w:type="dxa"/>
+            <w:vAlign w:val="bottom"/>
+          </w:tcPr>
+          <w:p>
+            <w:r>
+              <w:rPr>
+                <w:rFonts w:ascii="Calibri" w:hAnsi="Calibri" w:cs="Calibri"/>
+                <w:color w:val="000000"/>
+              </w:rPr>
+              <w:t>Communication Protecol for Create Food</w:t>
+            </w:r>
+          </w:p>
+        </w:tc>
+        <w:tc>
+          <w:tcPr>
+            <w:tcW w:w="2250" w:type="dxa"/>
+            <w:vAlign w:val="bottom"/>
+          </w:tcPr>
+          <w:p>
+            <w:r>
+              <w:rPr>
+                <w:rFonts w:ascii="Calibri" w:hAnsi="Calibri" w:cs="Calibri"/>
+                <w:color w:val="000000"/>
+              </w:rPr>
+              <w:t>Team</w:t>
+            </w:r>
+          </w:p>
+        </w:tc>
+      </w:tr>
+      <w:tr>
+        <w:tc>
+          <w:tcPr>
+            <w:tcW w:w="985" w:type="dxa"/>
+            <w:vAlign w:val="bottom"/>
+          </w:tcPr>
+          <w:p>
+            <w:r>
+              <w:rPr>
+                <w:rFonts w:ascii="Calibri" w:hAnsi="Calibri" w:cs="Calibri"/>
+                <w:color w:val="000000"/>
+              </w:rPr>
+              <w:t>3.2</w:t>
+            </w:r>
+          </w:p>
+        </w:tc>
+        <w:tc>
+          <w:tcPr>
+            <w:tcW w:w="6120" w:type="dxa"/>
+            <w:vAlign w:val="bottom"/>
+          </w:tcPr>
+          <w:p>
+            <w:r>
+              <w:rPr>
+                <w:rFonts w:ascii="Calibri" w:hAnsi="Calibri" w:cs="Calibri"/>
+                <w:color w:val="000000"/>
+              </w:rPr>
+              <w:t>Create Food Process Client Side</w:t>
+            </w:r>
+          </w:p>
+        </w:tc>
+        <w:tc>
+          <w:tcPr>
+            <w:tcW w:w="2250" w:type="dxa"/>
+            <w:vAlign w:val="bottom"/>
+          </w:tcPr>
+          <w:p>
+            <w:r>
+              <w:rPr>
+                <w:rFonts w:ascii="Calibri" w:hAnsi="Calibri" w:cs="Calibri"/>
+                <w:color w:val="000000"/>
+              </w:rPr>
+              <w:t>Yeni</w:t>
+            </w:r>
+          </w:p>
+        </w:tc>
+      </w:tr>
+      <w:tr>
+        <w:tc>
+          <w:tcPr>
+            <w:tcW w:w="985" w:type="dxa"/>
+            <w:vAlign w:val="bottom"/>
+          </w:tcPr>
+          <w:p>
+            <w:r>
+              <w:rPr>
+                <w:rFonts w:ascii="Calibri" w:hAnsi="Calibri" w:cs="Calibri"/>
+                <w:color w:val="000000"/>
+              </w:rPr>
+              <w:t>3.2</w:t>
+            </w:r>
+          </w:p>
+        </w:tc>
+        <w:tc>
+          <w:tcPr>
+            <w:tcW w:w="6120" w:type="dxa"/>
+            <w:vAlign w:val="bottom"/>
+          </w:tcPr>
+          <w:p>
+            <w:r>
+              <w:rPr>
+                <w:rFonts w:ascii="Calibri" w:hAnsi="Calibri" w:cs="Calibri"/>
+                <w:color w:val="000000"/>
+              </w:rPr>
+              <w:t>Create Food Process Server Side</w:t>
+            </w:r>
+          </w:p>
+        </w:tc>
+        <w:tc>
+          <w:tcPr>
+            <w:tcW w:w="2250" w:type="dxa"/>
+            <w:vAlign w:val="bottom"/>
+          </w:tcPr>
+          <w:p>
+            <w:r>
+              <w:rPr>
+                <w:rFonts w:ascii="Calibri" w:hAnsi="Calibri" w:cs="Calibri"/>
+                <w:color w:val="000000"/>
+              </w:rPr>
+              <w:t>Victor</w:t>
+            </w:r>
+          </w:p>
+        </w:tc>
+      </w:tr>
+      <w:tr>
+        <w:tc>
+          <w:tcPr>
+            <w:tcW w:w="985" w:type="dxa"/>
+            <w:vAlign w:val="bottom"/>
+          </w:tcPr>
+          <w:p>
+            <w:r>
+              <w:rPr>
+                <w:rFonts w:ascii="Calibri" w:hAnsi="Calibri" w:cs="Calibri"/>
+                <w:color w:val="000000"/>
+              </w:rPr>
+              <w:t>4.1</w:t>
+            </w:r>
+          </w:p>
+        </w:tc>
+        <w:tc>
+          <w:tcPr>
+            <w:tcW w:w="6120" w:type="dxa"/>
+            <w:vAlign w:val="bottom"/>
+          </w:tcPr>
+          <w:p>
+            <w:r>
+              <w:rPr>
+                <w:rFonts w:ascii="Calibri" w:hAnsi="Calibri" w:cs="Calibri"/>
+                <w:color w:val="000000"/>
+              </w:rPr>
+              <w:t>Communication Protecol for Search</w:t>
+            </w:r>
+          </w:p>
+        </w:tc>
+        <w:tc>
+          <w:tcPr>
+            <w:tcW w:w="2250" w:type="dxa"/>
+            <w:vAlign w:val="bottom"/>
+          </w:tcPr>
+          <w:p>
+            <w:r>
+              <w:rPr>
+                <w:rFonts w:ascii="Calibri" w:hAnsi="Calibri" w:cs="Calibri"/>
+                <w:color w:val="000000"/>
+              </w:rPr>
+              <w:t>Team</w:t>
+            </w:r>
+          </w:p>
+        </w:tc>
+      </w:tr>
+      <w:tr>
+        <w:tc>
+          <w:tcPr>
+            <w:tcW w:w="985" w:type="dxa"/>
+            <w:vAlign w:val="bottom"/>
+          </w:tcPr>
+          <w:p>
+            <w:r>
+              <w:rPr>
+                <w:rFonts w:ascii="Calibri" w:hAnsi="Calibri" w:cs="Calibri"/>
+                <w:color w:val="000000"/>
+              </w:rPr>
+              <w:t>4.1</w:t>
+            </w:r>
+          </w:p>
+        </w:tc>
+        <w:tc>
+          <w:tcPr>
+            <w:tcW w:w="6120" w:type="dxa"/>
+            <w:vAlign w:val="bottom"/>
+          </w:tcPr>
+          <w:p>
+            <w:r>
+              <w:rPr>
+                <w:rFonts w:ascii="Calibri" w:hAnsi="Calibri" w:cs="Calibri"/>
+                <w:color w:val="000000"/>
+              </w:rPr>
+              <w:t>Communication Protecol for Update DayOfFood</w:t>
+            </w:r>
+          </w:p>
+        </w:tc>
+        <w:tc>
+          <w:tcPr>
+            <w:tcW w:w="2250" w:type="dxa"/>
+            <w:vAlign w:val="bottom"/>
+          </w:tcPr>
+          <w:p>
+            <w:r>
+              <w:rPr>
+                <w:rFonts w:ascii="Calibri" w:hAnsi="Calibri" w:cs="Calibri"/>
+                <w:color w:val="000000"/>
+              </w:rPr>
+              <w:t>Team</w:t>
+            </w:r>
+          </w:p>
+        </w:tc>
+      </w:tr>
+      <w:tr>
+        <w:tc>
+          <w:tcPr>
+            <w:tcW w:w="985" w:type="dxa"/>
+            <w:vAlign w:val="bottom"/>
+          </w:tcPr>
+          <w:p>
+            <w:r>
+              <w:rPr>
+                <w:rFonts w:ascii="Calibri" w:hAnsi="Calibri" w:cs="Calibri"/>
+                <w:color w:val="000000"/>
+              </w:rPr>
+              <w:t>4.1</w:t>
+            </w:r>
+          </w:p>
+        </w:tc>
+        <w:tc>
+          <w:tcPr>
+            <w:tcW w:w="6120" w:type="dxa"/>
+            <w:vAlign w:val="bottom"/>
+          </w:tcPr>
+          <w:p>
+            <w:r>
+              <w:rPr>
+                <w:rFonts w:ascii="Calibri" w:hAnsi="Calibri" w:cs="Calibri"/>
+                <w:color w:val="000000"/>
+              </w:rPr>
+              <w:t>DayOfFood Structure</w:t>
+            </w:r>
+          </w:p>
+        </w:tc>
+        <w:tc>
+          <w:tcPr>
+            <w:tcW w:w="2250" w:type="dxa"/>
+            <w:vAlign w:val="bottom"/>
+          </w:tcPr>
+          <w:p>
+            <w:r>
+              <w:rPr>
+                <w:rFonts w:ascii="Calibri" w:hAnsi="Calibri" w:cs="Calibri"/>
+                <w:color w:val="000000"/>
+              </w:rPr>
+              <w:t>Team</w:t>
+            </w:r>
+          </w:p>
+        </w:tc>
+      </w:tr>
+      <w:tr>
+        <w:tc>
+          <w:tcPr>
+            <w:tcW w:w="985" w:type="dxa"/>
+            <w:vAlign w:val="bottom"/>
+          </w:tcPr>
+          <w:p>
+            <w:r>
+              <w:rPr>
+                <w:rFonts w:ascii="Calibri" w:hAnsi="Calibri" w:cs="Calibri"/>
+                <w:color w:val="000000"/>
+              </w:rPr>
+              <w:t>4.2</w:t>
+            </w:r>
+          </w:p>
+        </w:tc>
+        <w:tc>
+          <w:tcPr>
+            <w:tcW w:w="6120" w:type="dxa"/>
+            <w:vAlign w:val="bottom"/>
+          </w:tcPr>
+          <w:p>
+            <w:r>
+              <w:rPr>
+                <w:rFonts w:ascii="Calibri" w:hAnsi="Calibri" w:cs="Calibri"/>
+                <w:color w:val="000000"/>
+              </w:rPr>
+              <w:t>Fix UI Spacing Issues</w:t>
+            </w:r>
+          </w:p>
+        </w:tc>
+        <w:tc>
+          <w:tcPr>
+            <w:tcW w:w="2250" w:type="dxa"/>
+            <w:vAlign w:val="bottom"/>
+          </w:tcPr>
+          <w:p>
+            <w:r>
+              <w:rPr>
+                <w:rFonts w:ascii="Calibri" w:hAnsi="Calibri" w:cs="Calibri"/>
+                <w:color w:val="000000"/>
+              </w:rPr>
+              <w:t>Emi</w:t>
+            </w:r>
+          </w:p>
+        </w:tc>
+      </w:tr>
+      <w:tr>
+        <w:tc>
+          <w:tcPr>
+            <w:tcW w:w="985" w:type="dxa"/>
+            <w:vAlign w:val="bottom"/>
+          </w:tcPr>
+          <w:p>
+            <w:r>
+              <w:rPr>
+                <w:rFonts w:ascii="Calibri" w:hAnsi="Calibri" w:cs="Calibri"/>
+                <w:color w:val="000000"/>
+              </w:rPr>
+              <w:t>4.2</w:t>
+            </w:r>
+          </w:p>
+        </w:tc>
+        <w:tc>
+          <w:tcPr>
+            <w:tcW w:w="6120" w:type="dxa"/>
+            <w:vAlign w:val="bottom"/>
+          </w:tcPr>
+          <w:p>
+            <w:r>
+              <w:rPr>
+                <w:rFonts w:ascii="Calibri" w:hAnsi="Calibri" w:cs="Calibri"/>
+                <w:color w:val="000000"/>
+              </w:rPr>
+              <w:t>Hookup Add Buttons to Search Page</w:t>
+            </w:r>
+          </w:p>
+        </w:tc>
+        <w:tc>
+          <w:tcPr>
+            <w:tcW w:w="2250" w:type="dxa"/>
+            <w:vAlign w:val="bottom"/>
+          </w:tcPr>
+          <w:p>
+            <w:r>
+              <w:rPr>
+                <w:rFonts w:ascii="Calibri" w:hAnsi="Calibri" w:cs="Calibri"/>
+                <w:color w:val="000000"/>
+              </w:rPr>
+              <w:t>Emi</w:t>
+            </w:r>
+          </w:p>
+        </w:tc>
+      </w:tr>
+      <w:tr>
+        <w:tc>
+          <w:tcPr>
+            <w:tcW w:w="985" w:type="dxa"/>
+            <w:vAlign w:val="bottom"/>
+          </w:tcPr>
+          <w:p>
+            <w:r>
+              <w:rPr>
+                <w:rFonts w:ascii="Calibri" w:hAnsi="Calibri" w:cs="Calibri"/>
+                <w:color w:val="000000"/>
+              </w:rPr>
+              <w:t>4.2</w:t>
+            </w:r>
+          </w:p>
+        </w:tc>
+        <w:tc>
+          <w:tcPr>
+            <w:tcW w:w="6120" w:type="dxa"/>
+            <w:vAlign w:val="bottom"/>
+          </w:tcPr>
+          <w:p>
+            <w:r>
+              <w:rPr>
+                <w:rFonts w:ascii="Calibri" w:hAnsi="Calibri" w:cs="Calibri"/>
+                <w:color w:val="000000"/>
+              </w:rPr>
+              <w:t>Hookup Remove Buttons to User</w:t>
+            </w:r>
+          </w:p>
+        </w:tc>
+        <w:tc>
+          <w:tcPr>
+            <w:tcW w:w="2250" w:type="dxa"/>
+            <w:vAlign w:val="bottom"/>
+          </w:tcPr>
+          <w:p>
+            <w:r>
+              <w:rPr>
+                <w:rFonts w:ascii="Calibri" w:hAnsi="Calibri" w:cs="Calibri"/>
+                <w:color w:val="000000"/>
+              </w:rPr>
+              <w:t>Yeni</w:t>
+            </w:r>
+          </w:p>
+        </w:tc>
+      </w:tr>
+      <w:tr>
+        <w:tc>
+          <w:tcPr>
+            <w:tcW w:w="985" w:type="dxa"/>
+            <w:vAlign w:val="bottom"/>
+          </w:tcPr>
+          <w:p>
+            <w:r>
+              <w:rPr>
+                <w:rFonts w:ascii="Calibri" w:hAnsi="Calibri" w:cs="Calibri"/>
+                <w:color w:val="000000"/>
+              </w:rPr>
+              <w:t>4.2</w:t>
+            </w:r>
+          </w:p>
+        </w:tc>
+        <w:tc>
+          <w:tcPr>
+            <w:tcW w:w="6120" w:type="dxa"/>
+            <w:vAlign w:val="bottom"/>
+          </w:tcPr>
+          <w:p>
+            <w:r>
+              <w:rPr>
+                <w:rFonts w:ascii="Calibri" w:hAnsi="Calibri" w:cs="Calibri"/>
+                <w:color w:val="000000"/>
+              </w:rPr>
+              <w:t>Search Process Client Side</w:t>
+            </w:r>
+          </w:p>
+        </w:tc>
+        <w:tc>
+          <w:tcPr>
+            <w:tcW w:w="2250" w:type="dxa"/>
+            <w:vAlign w:val="bottom"/>
+          </w:tcPr>
+          <w:p>
+            <w:r>
+              <w:rPr>
+                <w:rFonts w:ascii="Calibri" w:hAnsi="Calibri" w:cs="Calibri"/>
+                <w:color w:val="000000"/>
+              </w:rPr>
+              <w:t>Victor</w:t>
+            </w:r>
+          </w:p>
+        </w:tc>
+      </w:tr>
+      <w:tr>
+        <w:tc>
+          <w:tcPr>
+            <w:tcW w:w="985" w:type="dxa"/>
+            <w:vAlign w:val="bottom"/>
+          </w:tcPr>
+          <w:p>
+            <w:r>
+              <w:rPr>
+                <w:rFonts w:ascii="Calibri" w:hAnsi="Calibri" w:cs="Calibri"/>
+                <w:color w:val="000000"/>
+              </w:rPr>
+              <w:t>4.2</w:t>
+            </w:r>
+          </w:p>
+        </w:tc>
+        <w:tc>
+          <w:tcPr>
+            <w:tcW w:w="6120" w:type="dxa"/>
+            <w:vAlign w:val="bottom"/>
+          </w:tcPr>
+          <w:p>
+            <w:r>
+              <w:rPr>
+                <w:rFonts w:ascii="Calibri" w:hAnsi="Calibri" w:cs="Calibri"/>
+                <w:color w:val="000000"/>
+              </w:rPr>
+              <w:t>Search Process Server Side</w:t>
+            </w:r>
+          </w:p>
+        </w:tc>
+        <w:tc>
+          <w:tcPr>
+            <w:tcW w:w="2250" w:type="dxa"/>
+            <w:vAlign w:val="bottom"/>
+          </w:tcPr>
+          <w:p>
+            <w:r>
+              <w:rPr>
+                <w:rFonts w:ascii="Calibri" w:hAnsi="Calibri" w:cs="Calibri"/>
+                <w:color w:val="000000"/>
+              </w:rPr>
+              <w:t>Justin</w:t>
+            </w:r>
+          </w:p>
+        </w:tc>
+      </w:tr>
+      <w:tr>
+        <w:tc>
+          <w:tcPr>
+            <w:tcW w:w="985" w:type="dxa"/>
+            <w:vAlign w:val="bottom"/>
+          </w:tcPr>
+          <w:p>
+            <w:r>
+              <w:rPr>
+                <w:rFonts w:ascii="Calibri" w:hAnsi="Calibri" w:cs="Calibri"/>
+                <w:color w:val="000000"/>
+              </w:rPr>
+              <w:t>4.3</w:t>
+            </w:r>
+          </w:p>
+        </w:tc>
+        <w:tc>
+          <w:tcPr>
+            <w:tcW w:w="6120" w:type="dxa"/>
+            <w:vAlign w:val="bottom"/>
+          </w:tcPr>
+          <w:p>
+            <w:r>
+              <w:rPr>
+                <w:rFonts w:ascii="Calibri" w:hAnsi="Calibri" w:cs="Calibri"/>
+                <w:color w:val="000000"/>
+              </w:rPr>
+              <w:t>Update DayOfFood Process Client Side</w:t>
+            </w:r>
+          </w:p>
+        </w:tc>
+        <w:tc>
+          <w:tcPr>
+            <w:tcW w:w="2250" w:type="dxa"/>
+            <w:vAlign w:val="bottom"/>
+          </w:tcPr>
+          <w:p>
+            <w:r>
+              <w:rPr>
+                <w:rFonts w:ascii="Calibri" w:hAnsi="Calibri" w:cs="Calibri"/>
+                <w:color w:val="000000"/>
+              </w:rPr>
+              <w:t>Justin</w:t>
+            </w:r>
+          </w:p>
+        </w:tc>
+      </w:tr>
+      <w:tr>
+        <w:tc>
+          <w:tcPr>
+            <w:tcW w:w="985" w:type="dxa"/>
+            <w:vAlign w:val="bottom"/>
+          </w:tcPr>
+          <w:p>
+            <w:r>
+              <w:rPr>
+                <w:rFonts w:ascii="Calibri" w:hAnsi="Calibri" w:cs="Calibri"/>
+                <w:color w:val="000000"/>
+              </w:rPr>
+              <w:t>4.3</w:t>
+            </w:r>
+          </w:p>
+        </w:tc>
+        <w:tc>
+          <w:tcPr>
+            <w:tcW w:w="6120" w:type="dxa"/>
+            <w:vAlign w:val="bottom"/>
+          </w:tcPr>
+          <w:p>
+            <w:r>
+              <w:rPr>
+                <w:rFonts w:ascii="Calibri" w:hAnsi="Calibri" w:cs="Calibri"/>
+                <w:color w:val="000000"/>
+              </w:rPr>
+              <w:t>Update DayOfFood Process Server Side</w:t>
+            </w:r>
+          </w:p>
+        </w:tc>
+        <w:tc>
+          <w:tcPr>
+            <w:tcW w:w="2250" w:type="dxa"/>
+            <w:vAlign w:val="bottom"/>
+          </w:tcPr>
+          <w:p>
+            <w:r>
+              <w:rPr>
+                <w:rFonts w:ascii="Calibri" w:hAnsi="Calibri" w:cs="Calibri"/>
+                <w:color w:val="000000"/>
+              </w:rPr>
+              <w:t>Victor</w:t>
+            </w:r>
+          </w:p>
+        </w:tc>
+      </w:tr>
+      <w:tr>
+        <w:tc>
+          <w:tcPr>
+            <w:tcW w:w="985" w:type="dxa"/>
+            <w:vAlign w:val="bottom"/>
+          </w:tcPr>
+          <w:p>
+            <w:r>
+              <w:rPr>
+                <w:rFonts w:ascii="Calibri" w:hAnsi="Calibri" w:cs="Calibri"/>
+                <w:color w:val="000000"/>
+              </w:rPr>
+              <w:t>5.1</w:t>
+            </w:r>
+          </w:p>
+        </w:tc>
+        <w:tc>
+          <w:tcPr>
+            <w:tcW w:w="6120" w:type="dxa"/>
+            <w:vAlign w:val="bottom"/>
+          </w:tcPr>
+          <w:p>
+            <w:r>
+              <w:rPr>
+                <w:rFonts w:ascii="Calibri" w:hAnsi="Calibri" w:cs="Calibri"/>
+                <w:color w:val="000000"/>
+              </w:rPr>
+              <w:t>Communication Protecol for Update Diet</w:t>
+            </w:r>
+          </w:p>
+        </w:tc>
+        <w:tc>
+          <w:tcPr>
+            <w:tcW w:w="2250" w:type="dxa"/>
+            <w:vAlign w:val="bottom"/>
+          </w:tcPr>
+          <w:p>
+            <w:r>
+              <w:rPr>
+                <w:rFonts w:ascii="Calibri" w:hAnsi="Calibri" w:cs="Calibri"/>
+                <w:color w:val="000000"/>
+              </w:rPr>
+              <w:t>Team</w:t>
+            </w:r>
+          </w:p>
+        </w:tc>
+      </w:tr>
+      <w:tr>
+        <w:tc>
+          <w:tcPr>
+            <w:tcW w:w="985" w:type="dxa"/>
+            <w:vAlign w:val="bottom"/>
+          </w:tcPr>
+          <w:p>
+            <w:r>
+              <w:rPr>
+                <w:rFonts w:ascii="Calibri" w:hAnsi="Calibri" w:cs="Calibri"/>
+                <w:color w:val="000000"/>
+              </w:rPr>
+              <w:t>5.2</w:t>
+            </w:r>
+          </w:p>
+        </w:tc>
+        <w:tc>
+          <w:tcPr>
+            <w:tcW w:w="6120" w:type="dxa"/>
+            <w:vAlign w:val="bottom"/>
+          </w:tcPr>
+          <w:p>
+            <w:r>
+              <w:rPr>
+                <w:rFonts w:ascii="Calibri" w:hAnsi="Calibri" w:cs="Calibri"/>
+                <w:color w:val="000000"/>
+              </w:rPr>
+              <w:t>Account Menu UI</w:t>
+            </w:r>
+          </w:p>
+        </w:tc>
+        <w:tc>
+          <w:tcPr>
+            <w:tcW w:w="2250" w:type="dxa"/>
+            <w:vAlign w:val="bottom"/>
+          </w:tcPr>
+          <w:p>
+            <w:r>
+              <w:rPr>
+                <w:rFonts w:ascii="Calibri" w:hAnsi="Calibri" w:cs="Calibri"/>
+                <w:color w:val="000000"/>
+              </w:rPr>
+              <w:t>Emi</w:t>
+            </w:r>
+          </w:p>
+        </w:tc>
+      </w:tr>
+      <w:tr>
+        <w:tc>
+          <w:tcPr>
+            <w:tcW w:w="985" w:type="dxa"/>
+            <w:vAlign w:val="bottom"/>
+          </w:tcPr>
+          <w:p>
+            <w:r>
+              <w:rPr>
+                <w:rFonts w:ascii="Calibri" w:hAnsi="Calibri" w:cs="Calibri"/>
+                <w:color w:val="000000"/>
+              </w:rPr>
+              <w:t>5.2</w:t>
+            </w:r>
+          </w:p>
+        </w:tc>
+        <w:tc>
+          <w:tcPr>
+            <w:tcW w:w="6120" w:type="dxa"/>
+            <w:vAlign w:val="bottom"/>
+          </w:tcPr>
+          <w:p>
+            <w:r>
+              <w:rPr>
+                <w:rFonts w:ascii="Calibri" w:hAnsi="Calibri" w:cs="Calibri"/>
+                <w:color w:val="000000"/>
+              </w:rPr>
+              <w:t>Edit Diet Process Client Side</w:t>
+            </w:r>
+          </w:p>
+        </w:tc>
+        <w:tc>
+          <w:tcPr>
+            <w:tcW w:w="2250" w:type="dxa"/>
+            <w:vAlign w:val="bottom"/>
+          </w:tcPr>
+          <w:p>
+            <w:r>
+              <w:rPr>
+                <w:rFonts w:ascii="Calibri" w:hAnsi="Calibri" w:cs="Calibri"/>
+                <w:color w:val="000000"/>
+              </w:rPr>
+              <w:t>Victor</w:t>
+            </w:r>
+          </w:p>
+        </w:tc>
+      </w:tr>
+      <w:tr>
+        <w:tc>
+          <w:tcPr>
+            <w:tcW w:w="985" w:type="dxa"/>
+            <w:vAlign w:val="bottom"/>
+          </w:tcPr>
+          <w:p>
+            <w:r>
+              <w:rPr>
+                <w:rFonts w:ascii="Calibri" w:hAnsi="Calibri" w:cs="Calibri"/>
+                <w:color w:val="000000"/>
+              </w:rPr>
+              <w:t>5.2</w:t>
+            </w:r>
+          </w:p>
+        </w:tc>
+        <w:tc>
+          <w:tcPr>
+            <w:tcW w:w="6120" w:type="dxa"/>
+            <w:vAlign w:val="bottom"/>
+          </w:tcPr>
+          <w:p>
+            <w:r>
+              <w:rPr>
+                <w:rFonts w:ascii="Calibri" w:hAnsi="Calibri" w:cs="Calibri"/>
+                <w:color w:val="000000"/>
+              </w:rPr>
+              <w:t>Edit Diet Process Server Side</w:t>
+            </w:r>
+          </w:p>
+        </w:tc>
+        <w:tc>
+          <w:tcPr>
+            <w:tcW w:w="2250" w:type="dxa"/>
+            <w:vAlign w:val="bottom"/>
+          </w:tcPr>
+          <w:p>
+            <w:r>
+              <w:rPr>
+                <w:rFonts w:ascii="Calibri" w:hAnsi="Calibri" w:cs="Calibri"/>
+                <w:color w:val="000000"/>
+              </w:rPr>
+              <w:t>Yeni</w:t>
+            </w:r>
+          </w:p>
+        </w:tc>
+      </w:tr>
+      <w:tr>
+        <w:tc>
+          <w:tcPr>
+            <w:tcW w:w="985" w:type="dxa"/>
+            <w:vAlign w:val="bottom"/>
+          </w:tcPr>
+          <w:p>
+            <w:r>
+              <w:rPr>
+                <w:rFonts w:ascii="Calibri" w:hAnsi="Calibri" w:cs="Calibri"/>
+                <w:color w:val="000000"/>
+              </w:rPr>
+              <w:t>5.2</w:t>
+            </w:r>
+          </w:p>
+        </w:tc>
+        <w:tc>
+          <w:tcPr>
+            <w:tcW w:w="6120" w:type="dxa"/>
+            <w:vAlign w:val="bottom"/>
+          </w:tcPr>
+          <w:p>
+            <w:r>
+              <w:rPr>
+                <w:rFonts w:ascii="Calibri" w:hAnsi="Calibri" w:cs="Calibri"/>
+                <w:color w:val="000000"/>
+              </w:rPr>
+              <w:t>Edit Diet UI Page</w:t>
+            </w:r>
+          </w:p>
+        </w:tc>
+        <w:tc>
+          <w:tcPr>
+            <w:tcW w:w="2250" w:type="dxa"/>
+            <w:vAlign w:val="bottom"/>
+          </w:tcPr>
+          <w:p>
+            <w:r>
+              <w:rPr>
+                <w:rFonts w:ascii="Calibri" w:hAnsi="Calibri" w:cs="Calibri"/>
+                <w:color w:val="000000"/>
+              </w:rPr>
+              <w:t>Emi</w:t>
+            </w:r>
+          </w:p>
+        </w:tc>
+      </w:tr>
+      <w:tr>
+        <w:tc>
+          <w:tcPr>
+            <w:tcW w:w="985" w:type="dxa"/>
+            <w:vAlign w:val="bottom"/>
+          </w:tcPr>
+          <w:p>
+            <w:r>
+              <w:rPr>
+                <w:rFonts w:ascii="Calibri" w:hAnsi="Calibri" w:cs="Calibri"/>
+                <w:color w:val="000000"/>
+              </w:rPr>
+              <w:t>5.3</w:t>
+            </w:r>
+          </w:p>
+        </w:tc>
+        <w:tc>
+          <w:tcPr>
+            <w:tcW w:w="6120" w:type="dxa"/>
+            <w:vAlign w:val="bottom"/>
+          </w:tcPr>
+          <w:p>
+            <w:r>
+              <w:rPr>
+                <w:rFonts w:ascii="Calibri" w:hAnsi="Calibri" w:cs="Calibri"/>
+                <w:color w:val="000000"/>
+              </w:rPr>
+              <w:t>Edit Diet Codebehind</w:t>
+            </w:r>
+          </w:p>
+        </w:tc>
+        <w:tc>
+          <w:tcPr>
+            <w:tcW w:w="2250" w:type="dxa"/>
+            <w:vAlign w:val="bottom"/>
+          </w:tcPr>
+          <w:p>
+            <w:r>
+              <w:rPr>
+                <w:rFonts w:ascii="Calibri" w:hAnsi="Calibri" w:cs="Calibri"/>
+                <w:color w:val="000000"/>
+              </w:rPr>
+              <w:t>Justin</w:t>
+            </w:r>
+          </w:p>
         </w:tc>
       </w:tr>
     </w:tbl>
@@ -1947,23 +3246,7 @@
           <w:b/>
           <w:bCs/>
         </w:rPr>
-        <w:t xml:space="preserve"> session where you </w:t>
-      </w:r>
-      <w:proofErr w:type="gramStart"/>
-      <w:r>
-        <w:rPr>
-          <w:b/>
-          <w:bCs/>
-        </w:rPr>
-        <w:t>used</w:t>
-      </w:r>
-      <w:proofErr w:type="gramEnd"/>
-      <w:r>
-        <w:rPr>
-          <w:b/>
-          <w:bCs/>
-        </w:rPr>
-        <w:t xml:space="preserve"> generative AI, give the following:</w:t>
+        <w:t xml:space="preserve"> session where you used generative AI, give the following:</w:t>
       </w:r>
     </w:p>
     <w:p>
@@ -2187,23 +3470,7 @@
           <w:b/>
           <w:bCs/>
         </w:rPr>
-        <w:t xml:space="preserve">JS - </w:t>
-      </w:r>
-      <w:proofErr w:type="spellStart"/>
-      <w:r>
-        <w:rPr>
-          <w:b/>
-          <w:bCs/>
-        </w:rPr>
-        <w:t>IOException</w:t>
-      </w:r>
-      <w:proofErr w:type="spellEnd"/>
-      <w:r>
-        <w:rPr>
-          <w:b/>
-          <w:bCs/>
-        </w:rPr>
-        <w:t xml:space="preserve"> Testing ChatGPT Session</w:t>
+        <w:t>JS - IOException Testing ChatGPT Session</w:t>
       </w:r>
     </w:p>
     <w:p>
@@ -2223,23 +3490,7 @@
           <w:b/>
           <w:bCs/>
         </w:rPr>
-        <w:t xml:space="preserve">Help with how to setup a test case to force an </w:t>
-      </w:r>
-      <w:proofErr w:type="spellStart"/>
-      <w:r>
-        <w:rPr>
-          <w:b/>
-          <w:bCs/>
-        </w:rPr>
-        <w:t>IOExeption</w:t>
-      </w:r>
-      <w:proofErr w:type="spellEnd"/>
-      <w:r>
-        <w:rPr>
-          <w:b/>
-          <w:bCs/>
-        </w:rPr>
-        <w:t xml:space="preserve"> to be thrown to reach 100% code coverage.</w:t>
+        <w:t>Help with how to setup a test case to force an IOExeption to be thrown to reach 100% code coverage.</w:t>
       </w:r>
     </w:p>
     <w:p>
@@ -2307,23 +3558,7 @@
           <w:b/>
           <w:bCs/>
         </w:rPr>
-        <w:t xml:space="preserve">JS - </w:t>
-      </w:r>
-      <w:proofErr w:type="spellStart"/>
-      <w:r>
-        <w:rPr>
-          <w:b/>
-          <w:bCs/>
-        </w:rPr>
-        <w:t>CompositeFood</w:t>
-      </w:r>
-      <w:proofErr w:type="spellEnd"/>
-      <w:r>
-        <w:rPr>
-          <w:b/>
-          <w:bCs/>
-        </w:rPr>
-        <w:t xml:space="preserve"> Error Review ChatGPT Session</w:t>
+        <w:t>JS - CompositeFood Error Review ChatGPT Session</w:t>
       </w:r>
       <w:r>
         <w:rPr>
@@ -2337,23 +3572,7 @@
           <w:b/>
           <w:bCs/>
         </w:rPr>
-        <w:t xml:space="preserve">JS - </w:t>
-      </w:r>
-      <w:proofErr w:type="spellStart"/>
-      <w:r>
-        <w:rPr>
-          <w:b/>
-          <w:bCs/>
-        </w:rPr>
-        <w:t>CompositeFood</w:t>
-      </w:r>
-      <w:proofErr w:type="spellEnd"/>
-      <w:r>
-        <w:rPr>
-          <w:b/>
-          <w:bCs/>
-        </w:rPr>
-        <w:t xml:space="preserve"> Error Review Continued ChatGPT Session</w:t>
+        <w:t>JS - CompositeFood Error Review Continued ChatGPT Session</w:t>
       </w:r>
     </w:p>
     <w:p>
@@ -2373,65 +3592,8 @@
           <w:b/>
           <w:bCs/>
         </w:rPr>
-        <w:t xml:space="preserve">Help with figuring out how to fix errors with reading and writing to Json files using </w:t>
-      </w:r>
-      <w:proofErr w:type="spellStart"/>
-      <w:r>
-        <w:rPr>
-          <w:b/>
-          <w:bCs/>
-        </w:rPr>
-        <w:t>ObjectMapper</w:t>
-      </w:r>
-      <w:proofErr w:type="spellEnd"/>
-      <w:r>
-        <w:rPr>
-          <w:b/>
-          <w:bCs/>
-        </w:rPr>
-        <w:t xml:space="preserve">. </w:t>
-      </w:r>
-      <w:proofErr w:type="gramStart"/>
-      <w:r>
-        <w:rPr>
-          <w:b/>
-          <w:bCs/>
-        </w:rPr>
-        <w:t>Also</w:t>
-      </w:r>
-      <w:proofErr w:type="gramEnd"/>
-      <w:r>
-        <w:rPr>
-          <w:b/>
-          <w:bCs/>
-        </w:rPr>
-        <w:t xml:space="preserve"> with writing test cases for testing the </w:t>
-      </w:r>
-      <w:proofErr w:type="spellStart"/>
-      <w:r>
-        <w:rPr>
-          <w:b/>
-          <w:bCs/>
-        </w:rPr>
-        <w:t>createCompositeFood</w:t>
-      </w:r>
-      <w:proofErr w:type="spellEnd"/>
-      <w:r>
-        <w:rPr>
-          <w:b/>
-          <w:bCs/>
-        </w:rPr>
-        <w:t xml:space="preserve"> method in </w:t>
-      </w:r>
-      <w:proofErr w:type="spellStart"/>
-      <w:r>
-        <w:rPr>
-          <w:b/>
-          <w:bCs/>
-        </w:rPr>
-        <w:t>CreateCompositeFoodPageViewModel</w:t>
-      </w:r>
-      <w:proofErr w:type="spellEnd"/>
+        <w:t>Help with figuring out how to fix errors with reading and writing to Json files using ObjectMapper. Also with writing test cases for testing the createCompositeFood method in CreateCompositeFoodPageViewModel</w:t>
+      </w:r>
     </w:p>
     <w:p>
       <w:pPr>

</xml_diff>

<commit_message>
Add some retrospecrtive info
Add some of my retrospective info.
</commit_message>
<xml_diff>
--- a/sprints/sprint1/Sprint Retrospective/Sprint Retrospective Report.docx
+++ b/sprints/sprint1/Sprint Retrospective/Sprint Retrospective Report.docx
@@ -450,7 +450,14 @@
           <w:tcPr>
             <w:tcW w:w="2316" w:type="dxa"/>
           </w:tcPr>
-          <w:p/>
+          <w:p>
+            <w:r>
+              <w:t xml:space="preserve">The page was made but </w:t>
+            </w:r>
+            <w:r>
+              <w:t>really had no functionality because it needed to be connected to the Create Account page which wasn’t completed</w:t>
+            </w:r>
+          </w:p>
         </w:tc>
       </w:tr>
       <w:tr>
@@ -658,7 +665,7 @@
           </w:tcPr>
           <w:p>
             <w:r>
-              <w:t>Incomplete</w:t>
+              <w:t>Complete</w:t>
             </w:r>
           </w:p>
         </w:tc>
@@ -799,6 +806,7 @@
                 <w:rFonts w:ascii="Calibri" w:hAnsi="Calibri" w:cs="Calibri"/>
                 <w:color w:val="000000"/>
               </w:rPr>
+              <w:lastRenderedPageBreak/>
               <w:t>Edit a meal item</w:t>
             </w:r>
           </w:p>
@@ -886,7 +894,11 @@
           <w:tcPr>
             <w:tcW w:w="2316" w:type="dxa"/>
           </w:tcPr>
-          <w:p/>
+          <w:p>
+            <w:r>
+              <w:t>Couldn’t be started because there was no account page made in order to access this setting.</w:t>
+            </w:r>
+          </w:p>
         </w:tc>
       </w:tr>
       <w:tr>
@@ -1333,7 +1345,29 @@
                 <w:szCs w:val="21"/>
                 <w14:ligatures w14:val="none"/>
               </w:rPr>
-              <w:t>I've updated the product backlog, sprint backlog, and Planning meeting notes in the repo so that is all current after todays meeting.</w:t>
+              <w:t xml:space="preserve">I've updated the product backlog, sprint backlog, and Planning meeting notes in the repo so that is all current after </w:t>
+            </w:r>
+            <w:proofErr w:type="spellStart"/>
+            <w:r>
+              <w:rPr>
+                <w:rFonts w:ascii="Segoe UI" w:eastAsia="Times New Roman" w:hAnsi="Segoe UI" w:cs="Segoe UI"/>
+                <w:kern w:val="0"/>
+                <w:sz w:val="21"/>
+                <w:szCs w:val="21"/>
+                <w14:ligatures w14:val="none"/>
+              </w:rPr>
+              <w:t>todays</w:t>
+            </w:r>
+            <w:proofErr w:type="spellEnd"/>
+            <w:r>
+              <w:rPr>
+                <w:rFonts w:ascii="Segoe UI" w:eastAsia="Times New Roman" w:hAnsi="Segoe UI" w:cs="Segoe UI"/>
+                <w:kern w:val="0"/>
+                <w:sz w:val="21"/>
+                <w:szCs w:val="21"/>
+                <w14:ligatures w14:val="none"/>
+              </w:rPr>
+              <w:t xml:space="preserve"> meeting.</w:t>
             </w:r>
           </w:p>
           <w:p>
@@ -1486,6 +1520,7 @@
           </w:p>
           <w:p>
             <w:r>
+              <w:lastRenderedPageBreak/>
               <w:t>Victor Is going to do the Use Case Scenarios</w:t>
             </w:r>
           </w:p>
@@ -1518,6 +1553,7 @@
           </w:tcPr>
           <w:p>
             <w:r>
+              <w:lastRenderedPageBreak/>
               <w:t>Justin Smith</w:t>
             </w:r>
           </w:p>
@@ -1612,7 +1648,6 @@
                 <w:b/>
                 <w:bCs/>
               </w:rPr>
-              <w:lastRenderedPageBreak/>
               <w:t>Priority</w:t>
             </w:r>
           </w:p>
@@ -1685,7 +1720,23 @@
                 <w:rFonts w:ascii="Calibri" w:hAnsi="Calibri" w:cs="Calibri"/>
                 <w:color w:val="000000"/>
               </w:rPr>
-              <w:t>Communication Protecol for authorization process</w:t>
+              <w:t xml:space="preserve">Communication </w:t>
+            </w:r>
+            <w:proofErr w:type="spellStart"/>
+            <w:r>
+              <w:rPr>
+                <w:rFonts w:ascii="Calibri" w:hAnsi="Calibri" w:cs="Calibri"/>
+                <w:color w:val="000000"/>
+              </w:rPr>
+              <w:t>Protecol</w:t>
+            </w:r>
+            <w:proofErr w:type="spellEnd"/>
+            <w:r>
+              <w:rPr>
+                <w:rFonts w:ascii="Calibri" w:hAnsi="Calibri" w:cs="Calibri"/>
+                <w:color w:val="000000"/>
+              </w:rPr>
+              <w:t xml:space="preserve"> for authorization process</w:t>
             </w:r>
           </w:p>
         </w:tc>
@@ -1967,8 +2018,17 @@
                 <w:rFonts w:ascii="Calibri" w:hAnsi="Calibri" w:cs="Calibri"/>
                 <w:color w:val="000000"/>
               </w:rPr>
-              <w:t>Login Page Codebehind</w:t>
-            </w:r>
+              <w:t xml:space="preserve">Login Page </w:t>
+            </w:r>
+            <w:proofErr w:type="spellStart"/>
+            <w:r>
+              <w:rPr>
+                <w:rFonts w:ascii="Calibri" w:hAnsi="Calibri" w:cs="Calibri"/>
+                <w:color w:val="000000"/>
+              </w:rPr>
+              <w:t>Codebehind</w:t>
+            </w:r>
+            <w:proofErr w:type="spellEnd"/>
           </w:p>
         </w:tc>
         <w:tc>
@@ -2014,7 +2074,23 @@
                 <w:rFonts w:ascii="Calibri" w:hAnsi="Calibri" w:cs="Calibri"/>
                 <w:color w:val="000000"/>
               </w:rPr>
-              <w:t>Communication Protecol for Create Account</w:t>
+              <w:t xml:space="preserve">Communication </w:t>
+            </w:r>
+            <w:proofErr w:type="spellStart"/>
+            <w:r>
+              <w:rPr>
+                <w:rFonts w:ascii="Calibri" w:hAnsi="Calibri" w:cs="Calibri"/>
+                <w:color w:val="000000"/>
+              </w:rPr>
+              <w:t>Protecol</w:t>
+            </w:r>
+            <w:proofErr w:type="spellEnd"/>
+            <w:r>
+              <w:rPr>
+                <w:rFonts w:ascii="Calibri" w:hAnsi="Calibri" w:cs="Calibri"/>
+                <w:color w:val="000000"/>
+              </w:rPr>
+              <w:t xml:space="preserve"> for Create Account</w:t>
             </w:r>
           </w:p>
         </w:tc>
@@ -2343,7 +2419,23 @@
                 <w:rFonts w:ascii="Calibri" w:hAnsi="Calibri" w:cs="Calibri"/>
                 <w:color w:val="000000"/>
               </w:rPr>
-              <w:t>Communication Protecol for Create Food</w:t>
+              <w:t xml:space="preserve">Communication </w:t>
+            </w:r>
+            <w:proofErr w:type="spellStart"/>
+            <w:r>
+              <w:rPr>
+                <w:rFonts w:ascii="Calibri" w:hAnsi="Calibri" w:cs="Calibri"/>
+                <w:color w:val="000000"/>
+              </w:rPr>
+              <w:t>Protecol</w:t>
+            </w:r>
+            <w:proofErr w:type="spellEnd"/>
+            <w:r>
+              <w:rPr>
+                <w:rFonts w:ascii="Calibri" w:hAnsi="Calibri" w:cs="Calibri"/>
+                <w:color w:val="000000"/>
+              </w:rPr>
+              <w:t xml:space="preserve"> for Create Food</w:t>
             </w:r>
           </w:p>
         </w:tc>
@@ -2484,7 +2576,23 @@
                 <w:rFonts w:ascii="Calibri" w:hAnsi="Calibri" w:cs="Calibri"/>
                 <w:color w:val="000000"/>
               </w:rPr>
-              <w:t>Communication Protecol for Search</w:t>
+              <w:t xml:space="preserve">Communication </w:t>
+            </w:r>
+            <w:proofErr w:type="spellStart"/>
+            <w:r>
+              <w:rPr>
+                <w:rFonts w:ascii="Calibri" w:hAnsi="Calibri" w:cs="Calibri"/>
+                <w:color w:val="000000"/>
+              </w:rPr>
+              <w:t>Protecol</w:t>
+            </w:r>
+            <w:proofErr w:type="spellEnd"/>
+            <w:r>
+              <w:rPr>
+                <w:rFonts w:ascii="Calibri" w:hAnsi="Calibri" w:cs="Calibri"/>
+                <w:color w:val="000000"/>
+              </w:rPr>
+              <w:t xml:space="preserve"> for Search</w:t>
             </w:r>
           </w:p>
         </w:tc>
@@ -2531,8 +2639,33 @@
                 <w:rFonts w:ascii="Calibri" w:hAnsi="Calibri" w:cs="Calibri"/>
                 <w:color w:val="000000"/>
               </w:rPr>
-              <w:t>Communication Protecol for Update DayOfFood</w:t>
-            </w:r>
+              <w:t xml:space="preserve">Communication </w:t>
+            </w:r>
+            <w:proofErr w:type="spellStart"/>
+            <w:r>
+              <w:rPr>
+                <w:rFonts w:ascii="Calibri" w:hAnsi="Calibri" w:cs="Calibri"/>
+                <w:color w:val="000000"/>
+              </w:rPr>
+              <w:t>Protecol</w:t>
+            </w:r>
+            <w:proofErr w:type="spellEnd"/>
+            <w:r>
+              <w:rPr>
+                <w:rFonts w:ascii="Calibri" w:hAnsi="Calibri" w:cs="Calibri"/>
+                <w:color w:val="000000"/>
+              </w:rPr>
+              <w:t xml:space="preserve"> for Update </w:t>
+            </w:r>
+            <w:proofErr w:type="spellStart"/>
+            <w:r>
+              <w:rPr>
+                <w:rFonts w:ascii="Calibri" w:hAnsi="Calibri" w:cs="Calibri"/>
+                <w:color w:val="000000"/>
+              </w:rPr>
+              <w:t>DayOfFood</w:t>
+            </w:r>
+            <w:proofErr w:type="spellEnd"/>
           </w:p>
         </w:tc>
         <w:tc>
@@ -2573,12 +2706,21 @@
             <w:vAlign w:val="bottom"/>
           </w:tcPr>
           <w:p>
-            <w:r>
-              <w:rPr>
-                <w:rFonts w:ascii="Calibri" w:hAnsi="Calibri" w:cs="Calibri"/>
-                <w:color w:val="000000"/>
-              </w:rPr>
-              <w:t>DayOfFood Structure</w:t>
+            <w:proofErr w:type="spellStart"/>
+            <w:r>
+              <w:rPr>
+                <w:rFonts w:ascii="Calibri" w:hAnsi="Calibri" w:cs="Calibri"/>
+                <w:color w:val="000000"/>
+              </w:rPr>
+              <w:t>DayOfFood</w:t>
+            </w:r>
+            <w:proofErr w:type="spellEnd"/>
+            <w:r>
+              <w:rPr>
+                <w:rFonts w:ascii="Calibri" w:hAnsi="Calibri" w:cs="Calibri"/>
+                <w:color w:val="000000"/>
+              </w:rPr>
+              <w:t xml:space="preserve"> Structure</w:t>
             </w:r>
           </w:p>
         </w:tc>
@@ -2860,7 +3002,23 @@
                 <w:rFonts w:ascii="Calibri" w:hAnsi="Calibri" w:cs="Calibri"/>
                 <w:color w:val="000000"/>
               </w:rPr>
-              <w:t>Update DayOfFood Process Client Side</w:t>
+              <w:t xml:space="preserve">Update </w:t>
+            </w:r>
+            <w:proofErr w:type="spellStart"/>
+            <w:r>
+              <w:rPr>
+                <w:rFonts w:ascii="Calibri" w:hAnsi="Calibri" w:cs="Calibri"/>
+                <w:color w:val="000000"/>
+              </w:rPr>
+              <w:t>DayOfFood</w:t>
+            </w:r>
+            <w:proofErr w:type="spellEnd"/>
+            <w:r>
+              <w:rPr>
+                <w:rFonts w:ascii="Calibri" w:hAnsi="Calibri" w:cs="Calibri"/>
+                <w:color w:val="000000"/>
+              </w:rPr>
+              <w:t xml:space="preserve"> Process Client Side</w:t>
             </w:r>
           </w:p>
         </w:tc>
@@ -2907,7 +3065,23 @@
                 <w:rFonts w:ascii="Calibri" w:hAnsi="Calibri" w:cs="Calibri"/>
                 <w:color w:val="000000"/>
               </w:rPr>
-              <w:t>Update DayOfFood Process Server Side</w:t>
+              <w:t xml:space="preserve">Update </w:t>
+            </w:r>
+            <w:proofErr w:type="spellStart"/>
+            <w:r>
+              <w:rPr>
+                <w:rFonts w:ascii="Calibri" w:hAnsi="Calibri" w:cs="Calibri"/>
+                <w:color w:val="000000"/>
+              </w:rPr>
+              <w:t>DayOfFood</w:t>
+            </w:r>
+            <w:proofErr w:type="spellEnd"/>
+            <w:r>
+              <w:rPr>
+                <w:rFonts w:ascii="Calibri" w:hAnsi="Calibri" w:cs="Calibri"/>
+                <w:color w:val="000000"/>
+              </w:rPr>
+              <w:t xml:space="preserve"> Process Server Side</w:t>
             </w:r>
           </w:p>
         </w:tc>
@@ -2954,7 +3128,23 @@
                 <w:rFonts w:ascii="Calibri" w:hAnsi="Calibri" w:cs="Calibri"/>
                 <w:color w:val="000000"/>
               </w:rPr>
-              <w:t>Communication Protecol for Update Diet</w:t>
+              <w:t xml:space="preserve">Communication </w:t>
+            </w:r>
+            <w:proofErr w:type="spellStart"/>
+            <w:r>
+              <w:rPr>
+                <w:rFonts w:ascii="Calibri" w:hAnsi="Calibri" w:cs="Calibri"/>
+                <w:color w:val="000000"/>
+              </w:rPr>
+              <w:t>Protecol</w:t>
+            </w:r>
+            <w:proofErr w:type="spellEnd"/>
+            <w:r>
+              <w:rPr>
+                <w:rFonts w:ascii="Calibri" w:hAnsi="Calibri" w:cs="Calibri"/>
+                <w:color w:val="000000"/>
+              </w:rPr>
+              <w:t xml:space="preserve"> for Update Diet</w:t>
             </w:r>
           </w:p>
         </w:tc>
@@ -3189,8 +3379,17 @@
                 <w:rFonts w:ascii="Calibri" w:hAnsi="Calibri" w:cs="Calibri"/>
                 <w:color w:val="000000"/>
               </w:rPr>
-              <w:t>Edit Diet Codebehind</w:t>
-            </w:r>
+              <w:t xml:space="preserve">Edit Diet </w:t>
+            </w:r>
+            <w:proofErr w:type="spellStart"/>
+            <w:r>
+              <w:rPr>
+                <w:rFonts w:ascii="Calibri" w:hAnsi="Calibri" w:cs="Calibri"/>
+                <w:color w:val="000000"/>
+              </w:rPr>
+              <w:t>Codebehind</w:t>
+            </w:r>
+            <w:proofErr w:type="spellEnd"/>
           </w:p>
         </w:tc>
         <w:tc>
@@ -3470,7 +3669,23 @@
           <w:b/>
           <w:bCs/>
         </w:rPr>
-        <w:t>JS - IOException Testing ChatGPT Session</w:t>
+        <w:t xml:space="preserve">JS - </w:t>
+      </w:r>
+      <w:proofErr w:type="spellStart"/>
+      <w:r>
+        <w:rPr>
+          <w:b/>
+          <w:bCs/>
+        </w:rPr>
+        <w:t>IOException</w:t>
+      </w:r>
+      <w:proofErr w:type="spellEnd"/>
+      <w:r>
+        <w:rPr>
+          <w:b/>
+          <w:bCs/>
+        </w:rPr>
+        <w:t xml:space="preserve"> Testing ChatGPT Session</w:t>
       </w:r>
     </w:p>
     <w:p>
@@ -3490,7 +3705,23 @@
           <w:b/>
           <w:bCs/>
         </w:rPr>
-        <w:t>Help with how to setup a test case to force an IOExeption to be thrown to reach 100% code coverage.</w:t>
+        <w:t xml:space="preserve">Help with how to setup a test case to force an </w:t>
+      </w:r>
+      <w:proofErr w:type="spellStart"/>
+      <w:r>
+        <w:rPr>
+          <w:b/>
+          <w:bCs/>
+        </w:rPr>
+        <w:t>IOExeption</w:t>
+      </w:r>
+      <w:proofErr w:type="spellEnd"/>
+      <w:r>
+        <w:rPr>
+          <w:b/>
+          <w:bCs/>
+        </w:rPr>
+        <w:t xml:space="preserve"> to be thrown to reach 100% code coverage.</w:t>
       </w:r>
     </w:p>
     <w:p>
@@ -3558,7 +3789,23 @@
           <w:b/>
           <w:bCs/>
         </w:rPr>
-        <w:t>JS - CompositeFood Error Review ChatGPT Session</w:t>
+        <w:t xml:space="preserve">JS - </w:t>
+      </w:r>
+      <w:proofErr w:type="spellStart"/>
+      <w:r>
+        <w:rPr>
+          <w:b/>
+          <w:bCs/>
+        </w:rPr>
+        <w:t>CompositeFood</w:t>
+      </w:r>
+      <w:proofErr w:type="spellEnd"/>
+      <w:r>
+        <w:rPr>
+          <w:b/>
+          <w:bCs/>
+        </w:rPr>
+        <w:t xml:space="preserve"> Error Review ChatGPT Session</w:t>
       </w:r>
       <w:r>
         <w:rPr>
@@ -3572,7 +3819,23 @@
           <w:b/>
           <w:bCs/>
         </w:rPr>
-        <w:t>JS - CompositeFood Error Review Continued ChatGPT Session</w:t>
+        <w:t xml:space="preserve">JS - </w:t>
+      </w:r>
+      <w:proofErr w:type="spellStart"/>
+      <w:r>
+        <w:rPr>
+          <w:b/>
+          <w:bCs/>
+        </w:rPr>
+        <w:t>CompositeFood</w:t>
+      </w:r>
+      <w:proofErr w:type="spellEnd"/>
+      <w:r>
+        <w:rPr>
+          <w:b/>
+          <w:bCs/>
+        </w:rPr>
+        <w:t xml:space="preserve"> Error Review Continued ChatGPT Session</w:t>
       </w:r>
     </w:p>
     <w:p>
@@ -3592,8 +3855,49 @@
           <w:b/>
           <w:bCs/>
         </w:rPr>
-        <w:t>Help with figuring out how to fix errors with reading and writing to Json files using ObjectMapper. Also with writing test cases for testing the createCompositeFood method in CreateCompositeFoodPageViewModel</w:t>
-      </w:r>
+        <w:t xml:space="preserve">Help with figuring out how to fix errors with reading and writing to Json files using </w:t>
+      </w:r>
+      <w:proofErr w:type="spellStart"/>
+      <w:r>
+        <w:rPr>
+          <w:b/>
+          <w:bCs/>
+        </w:rPr>
+        <w:t>ObjectMapper</w:t>
+      </w:r>
+      <w:proofErr w:type="spellEnd"/>
+      <w:r>
+        <w:rPr>
+          <w:b/>
+          <w:bCs/>
+        </w:rPr>
+        <w:t xml:space="preserve">. Also with writing test cases for testing the </w:t>
+      </w:r>
+      <w:proofErr w:type="spellStart"/>
+      <w:r>
+        <w:rPr>
+          <w:b/>
+          <w:bCs/>
+        </w:rPr>
+        <w:t>createCompositeFood</w:t>
+      </w:r>
+      <w:proofErr w:type="spellEnd"/>
+      <w:r>
+        <w:rPr>
+          <w:b/>
+          <w:bCs/>
+        </w:rPr>
+        <w:t xml:space="preserve"> method in </w:t>
+      </w:r>
+      <w:proofErr w:type="spellStart"/>
+      <w:r>
+        <w:rPr>
+          <w:b/>
+          <w:bCs/>
+        </w:rPr>
+        <w:t>CreateCompositeFoodPageViewModel</w:t>
+      </w:r>
+      <w:proofErr w:type="spellEnd"/>
     </w:p>
     <w:p>
       <w:pPr>
@@ -3702,6 +4006,48 @@
         </w:rPr>
         <w:t>commit abc930ed6c0fa57a85397286c06141e3cfcff750</w:t>
       </w:r>
+    </w:p>
+    <w:p>
+      <w:pPr>
+        <w:rPr>
+          <w:b/>
+          <w:bCs/>
+        </w:rPr>
+      </w:pPr>
+    </w:p>
+    <w:p>
+      <w:pPr>
+        <w:pStyle w:val="ListParagraph"/>
+        <w:numPr>
+          <w:ilvl w:val="0"/>
+          <w:numId w:val="9"/>
+        </w:numPr>
+        <w:rPr>
+          <w:b/>
+          <w:bCs/>
+        </w:rPr>
+      </w:pPr>
+      <w:r>
+        <w:rPr>
+          <w:b/>
+          <w:bCs/>
+        </w:rPr>
+        <w:lastRenderedPageBreak/>
+        <w:t>Yeni Almanza</w:t>
+      </w:r>
+    </w:p>
+    <w:p>
+      <w:pPr>
+        <w:pStyle w:val="ListParagraph"/>
+        <w:numPr>
+          <w:ilvl w:val="0"/>
+          <w:numId w:val="9"/>
+        </w:numPr>
+        <w:rPr>
+          <w:b/>
+          <w:bCs/>
+        </w:rPr>
+      </w:pPr>
     </w:p>
     <w:p/>
     <w:sectPr>
@@ -4299,6 +4645,95 @@
     </w:lvl>
   </w:abstractNum>
   <w:abstractNum w:abstractNumId="6" w15:restartNumberingAfterBreak="0">
+    <w:nsid w:val="610829CD"/>
+    <w:multiLevelType w:val="hybridMultilevel"/>
+    <w:tmpl w:val="BC4A165C"/>
+    <w:lvl w:ilvl="0" w:tplc="0409000F">
+      <w:start w:val="1"/>
+      <w:numFmt w:val="decimal"/>
+      <w:lvlText w:val="%1."/>
+      <w:lvlJc w:val="left"/>
+      <w:pPr>
+        <w:ind w:left="720" w:hanging="360"/>
+      </w:pPr>
+      <w:rPr>
+        <w:rFonts w:hint="default"/>
+      </w:rPr>
+    </w:lvl>
+    <w:lvl w:ilvl="1" w:tplc="04090019" w:tentative="1">
+      <w:start w:val="1"/>
+      <w:numFmt w:val="lowerLetter"/>
+      <w:lvlText w:val="%2."/>
+      <w:lvlJc w:val="left"/>
+      <w:pPr>
+        <w:ind w:left="1440" w:hanging="360"/>
+      </w:pPr>
+    </w:lvl>
+    <w:lvl w:ilvl="2" w:tplc="0409001B" w:tentative="1">
+      <w:start w:val="1"/>
+      <w:numFmt w:val="lowerRoman"/>
+      <w:lvlText w:val="%3."/>
+      <w:lvlJc w:val="right"/>
+      <w:pPr>
+        <w:ind w:left="2160" w:hanging="180"/>
+      </w:pPr>
+    </w:lvl>
+    <w:lvl w:ilvl="3" w:tplc="0409000F" w:tentative="1">
+      <w:start w:val="1"/>
+      <w:numFmt w:val="decimal"/>
+      <w:lvlText w:val="%4."/>
+      <w:lvlJc w:val="left"/>
+      <w:pPr>
+        <w:ind w:left="2880" w:hanging="360"/>
+      </w:pPr>
+    </w:lvl>
+    <w:lvl w:ilvl="4" w:tplc="04090019" w:tentative="1">
+      <w:start w:val="1"/>
+      <w:numFmt w:val="lowerLetter"/>
+      <w:lvlText w:val="%5."/>
+      <w:lvlJc w:val="left"/>
+      <w:pPr>
+        <w:ind w:left="3600" w:hanging="360"/>
+      </w:pPr>
+    </w:lvl>
+    <w:lvl w:ilvl="5" w:tplc="0409001B" w:tentative="1">
+      <w:start w:val="1"/>
+      <w:numFmt w:val="lowerRoman"/>
+      <w:lvlText w:val="%6."/>
+      <w:lvlJc w:val="right"/>
+      <w:pPr>
+        <w:ind w:left="4320" w:hanging="180"/>
+      </w:pPr>
+    </w:lvl>
+    <w:lvl w:ilvl="6" w:tplc="0409000F" w:tentative="1">
+      <w:start w:val="1"/>
+      <w:numFmt w:val="decimal"/>
+      <w:lvlText w:val="%7."/>
+      <w:lvlJc w:val="left"/>
+      <w:pPr>
+        <w:ind w:left="5040" w:hanging="360"/>
+      </w:pPr>
+    </w:lvl>
+    <w:lvl w:ilvl="7" w:tplc="04090019" w:tentative="1">
+      <w:start w:val="1"/>
+      <w:numFmt w:val="lowerLetter"/>
+      <w:lvlText w:val="%8."/>
+      <w:lvlJc w:val="left"/>
+      <w:pPr>
+        <w:ind w:left="5760" w:hanging="360"/>
+      </w:pPr>
+    </w:lvl>
+    <w:lvl w:ilvl="8" w:tplc="0409001B" w:tentative="1">
+      <w:start w:val="1"/>
+      <w:numFmt w:val="lowerRoman"/>
+      <w:lvlText w:val="%9."/>
+      <w:lvlJc w:val="right"/>
+      <w:pPr>
+        <w:ind w:left="6480" w:hanging="180"/>
+      </w:pPr>
+    </w:lvl>
+  </w:abstractNum>
+  <w:abstractNum w:abstractNumId="7" w15:restartNumberingAfterBreak="0">
     <w:nsid w:val="73490412"/>
     <w:multiLevelType w:val="hybridMultilevel"/>
     <w:tmpl w:val="C13246B0"/>
@@ -4384,7 +4819,7 @@
       </w:pPr>
     </w:lvl>
   </w:abstractNum>
-  <w:abstractNum w:abstractNumId="7" w15:restartNumberingAfterBreak="0">
+  <w:abstractNum w:abstractNumId="8" w15:restartNumberingAfterBreak="0">
     <w:nsid w:val="7BE017E7"/>
     <w:multiLevelType w:val="multilevel"/>
     <w:tmpl w:val="4754D4CA"/>
@@ -4540,7 +4975,7 @@
     <w:abstractNumId w:val="4"/>
   </w:num>
   <w:num w:numId="3" w16cid:durableId="513963672">
-    <w:abstractNumId w:val="6"/>
+    <w:abstractNumId w:val="7"/>
   </w:num>
   <w:num w:numId="4" w16cid:durableId="766660796">
     <w:abstractNumId w:val="3"/>
@@ -4555,7 +4990,10 @@
     <w:abstractNumId w:val="1"/>
   </w:num>
   <w:num w:numId="8" w16cid:durableId="1994483951">
-    <w:abstractNumId w:val="7"/>
+    <w:abstractNumId w:val="8"/>
+  </w:num>
+  <w:num w:numId="9" w16cid:durableId="1247111804">
+    <w:abstractNumId w:val="6"/>
   </w:num>
 </w:numbering>
 </file>

</xml_diff>

<commit_message>
Update sprint retro for Victor, add genAI files
</commit_message>
<xml_diff>
--- a/sprints/sprint1/Sprint Retrospective/Sprint Retrospective Report.docx
+++ b/sprints/sprint1/Sprint Retrospective/Sprint Retrospective Report.docx
@@ -193,7 +193,23 @@
                 <w:b/>
                 <w:bCs/>
               </w:rPr>
-              <w:t>Comments (e.g., reasons why feature is incomplete)</w:t>
+              <w:t xml:space="preserve">Comments (e.g., reasons why </w:t>
+            </w:r>
+            <w:proofErr w:type="gramStart"/>
+            <w:r>
+              <w:rPr>
+                <w:b/>
+                <w:bCs/>
+              </w:rPr>
+              <w:t>feature is</w:t>
+            </w:r>
+            <w:proofErr w:type="gramEnd"/>
+            <w:r>
+              <w:rPr>
+                <w:b/>
+                <w:bCs/>
+              </w:rPr>
+              <w:t xml:space="preserve"> incomplete)</w:t>
             </w:r>
           </w:p>
         </w:tc>
@@ -511,6 +527,180 @@
           <w:tcPr>
             <w:tcW w:w="2316" w:type="dxa"/>
           </w:tcPr>
+          <w:p>
+            <w:r>
+              <w:t>Does not update UI properly</w:t>
+            </w:r>
+          </w:p>
+        </w:tc>
+      </w:tr>
+      <w:tr>
+        <w:tc>
+          <w:tcPr>
+            <w:tcW w:w="3865" w:type="dxa"/>
+            <w:vAlign w:val="bottom"/>
+          </w:tcPr>
+          <w:p>
+            <w:pPr>
+              <w:rPr>
+                <w:rFonts w:ascii="Calibri" w:hAnsi="Calibri" w:cs="Calibri"/>
+                <w:color w:val="000000"/>
+              </w:rPr>
+            </w:pPr>
+            <w:r>
+              <w:rPr>
+                <w:rFonts w:ascii="Calibri" w:hAnsi="Calibri" w:cs="Calibri"/>
+                <w:color w:val="000000"/>
+              </w:rPr>
+              <w:t>Select a meal item that I've eaten by day</w:t>
+            </w:r>
+          </w:p>
+        </w:tc>
+        <w:tc>
+          <w:tcPr>
+            <w:tcW w:w="1530" w:type="dxa"/>
+            <w:vAlign w:val="bottom"/>
+          </w:tcPr>
+          <w:p>
+            <w:r>
+              <w:rPr>
+                <w:rFonts w:ascii="Calibri" w:hAnsi="Calibri" w:cs="Calibri"/>
+                <w:color w:val="000000"/>
+              </w:rPr>
+              <w:t>Victor</w:t>
+            </w:r>
+          </w:p>
+        </w:tc>
+        <w:tc>
+          <w:tcPr>
+            <w:tcW w:w="1639" w:type="dxa"/>
+          </w:tcPr>
+          <w:p>
+            <w:r>
+              <w:t>Incomplete</w:t>
+            </w:r>
+          </w:p>
+        </w:tc>
+        <w:tc>
+          <w:tcPr>
+            <w:tcW w:w="2316" w:type="dxa"/>
+          </w:tcPr>
+          <w:p>
+            <w:r>
+              <w:t>Meal implementation pushed back</w:t>
+            </w:r>
+          </w:p>
+        </w:tc>
+      </w:tr>
+      <w:tr>
+        <w:tc>
+          <w:tcPr>
+            <w:tcW w:w="3865" w:type="dxa"/>
+            <w:vAlign w:val="bottom"/>
+          </w:tcPr>
+          <w:p>
+            <w:pPr>
+              <w:rPr>
+                <w:rFonts w:ascii="Calibri" w:hAnsi="Calibri" w:cs="Calibri"/>
+                <w:color w:val="000000"/>
+              </w:rPr>
+            </w:pPr>
+            <w:r>
+              <w:rPr>
+                <w:rFonts w:ascii="Calibri" w:hAnsi="Calibri" w:cs="Calibri"/>
+                <w:color w:val="000000"/>
+              </w:rPr>
+              <w:t>See how many Calories/Nutrition values I have left based on my diet.</w:t>
+            </w:r>
+          </w:p>
+        </w:tc>
+        <w:tc>
+          <w:tcPr>
+            <w:tcW w:w="1530" w:type="dxa"/>
+            <w:vAlign w:val="bottom"/>
+          </w:tcPr>
+          <w:p>
+            <w:r>
+              <w:rPr>
+                <w:rFonts w:ascii="Calibri" w:hAnsi="Calibri" w:cs="Calibri"/>
+                <w:color w:val="000000"/>
+              </w:rPr>
+              <w:t>Victor</w:t>
+            </w:r>
+          </w:p>
+        </w:tc>
+        <w:tc>
+          <w:tcPr>
+            <w:tcW w:w="1639" w:type="dxa"/>
+          </w:tcPr>
+          <w:p>
+            <w:r>
+              <w:t>Not Started</w:t>
+            </w:r>
+          </w:p>
+        </w:tc>
+        <w:tc>
+          <w:tcPr>
+            <w:tcW w:w="2316" w:type="dxa"/>
+          </w:tcPr>
+          <w:p>
+            <w:r>
+              <w:t>Dashboard being worked on</w:t>
+            </w:r>
+          </w:p>
+        </w:tc>
+      </w:tr>
+      <w:tr>
+        <w:tc>
+          <w:tcPr>
+            <w:tcW w:w="3865" w:type="dxa"/>
+            <w:vAlign w:val="bottom"/>
+          </w:tcPr>
+          <w:p>
+            <w:pPr>
+              <w:rPr>
+                <w:rFonts w:ascii="Calibri" w:hAnsi="Calibri" w:cs="Calibri"/>
+                <w:color w:val="000000"/>
+              </w:rPr>
+            </w:pPr>
+            <w:r>
+              <w:rPr>
+                <w:rFonts w:ascii="Calibri" w:hAnsi="Calibri" w:cs="Calibri"/>
+                <w:color w:val="000000"/>
+              </w:rPr>
+              <w:t>Search for a specific food item</w:t>
+            </w:r>
+          </w:p>
+        </w:tc>
+        <w:tc>
+          <w:tcPr>
+            <w:tcW w:w="1530" w:type="dxa"/>
+            <w:vAlign w:val="bottom"/>
+          </w:tcPr>
+          <w:p>
+            <w:r>
+              <w:rPr>
+                <w:rFonts w:ascii="Calibri" w:hAnsi="Calibri" w:cs="Calibri"/>
+                <w:color w:val="000000"/>
+              </w:rPr>
+              <w:t>Yeni</w:t>
+            </w:r>
+          </w:p>
+        </w:tc>
+        <w:tc>
+          <w:tcPr>
+            <w:tcW w:w="1639" w:type="dxa"/>
+          </w:tcPr>
+          <w:p>
+            <w:r>
+              <w:t>Complete</w:t>
+            </w:r>
+          </w:p>
+        </w:tc>
+        <w:tc>
+          <w:tcPr>
+            <w:tcW w:w="2316" w:type="dxa"/>
+          </w:tcPr>
           <w:p/>
         </w:tc>
       </w:tr>
@@ -532,7 +722,7 @@
                 <w:rFonts w:ascii="Calibri" w:hAnsi="Calibri" w:cs="Calibri"/>
                 <w:color w:val="000000"/>
               </w:rPr>
-              <w:t>Select a meal item that I've eaten by day</w:t>
+              <w:t>Search for a specific meal item</w:t>
             </w:r>
           </w:p>
         </w:tc>
@@ -547,7 +737,7 @@
                 <w:rFonts w:ascii="Calibri" w:hAnsi="Calibri" w:cs="Calibri"/>
                 <w:color w:val="000000"/>
               </w:rPr>
-              <w:t>Victor</w:t>
+              <w:t>Yeni</w:t>
             </w:r>
           </w:p>
         </w:tc>
@@ -586,7 +776,7 @@
                 <w:rFonts w:ascii="Calibri" w:hAnsi="Calibri" w:cs="Calibri"/>
                 <w:color w:val="000000"/>
               </w:rPr>
-              <w:t>See how many Calories/Nutrition values I have left based on my diet.</w:t>
+              <w:t>Edit a food item</w:t>
             </w:r>
           </w:p>
         </w:tc>
@@ -601,7 +791,7 @@
                 <w:rFonts w:ascii="Calibri" w:hAnsi="Calibri" w:cs="Calibri"/>
                 <w:color w:val="000000"/>
               </w:rPr>
-              <w:t>Victor</w:t>
+              <w:t>Justin</w:t>
             </w:r>
           </w:p>
         </w:tc>
@@ -611,7 +801,7 @@
           </w:tcPr>
           <w:p>
             <w:r>
-              <w:t>Not Started</w:t>
+              <w:t>Incomplete</w:t>
             </w:r>
           </w:p>
         </w:tc>
@@ -619,171 +809,13 @@
           <w:tcPr>
             <w:tcW w:w="2316" w:type="dxa"/>
           </w:tcPr>
-          <w:p/>
-        </w:tc>
-      </w:tr>
-      <w:tr>
-        <w:tc>
-          <w:tcPr>
-            <w:tcW w:w="3865" w:type="dxa"/>
-            <w:vAlign w:val="bottom"/>
-          </w:tcPr>
-          <w:p>
-            <w:pPr>
-              <w:rPr>
-                <w:rFonts w:ascii="Calibri" w:hAnsi="Calibri" w:cs="Calibri"/>
-                <w:color w:val="000000"/>
-              </w:rPr>
-            </w:pPr>
-            <w:r>
-              <w:rPr>
-                <w:rFonts w:ascii="Calibri" w:hAnsi="Calibri" w:cs="Calibri"/>
-                <w:color w:val="000000"/>
-              </w:rPr>
-              <w:t>Search for a specific food item</w:t>
-            </w:r>
-          </w:p>
-        </w:tc>
-        <w:tc>
-          <w:tcPr>
-            <w:tcW w:w="1530" w:type="dxa"/>
-            <w:vAlign w:val="bottom"/>
-          </w:tcPr>
-          <w:p>
-            <w:r>
-              <w:rPr>
-                <w:rFonts w:ascii="Calibri" w:hAnsi="Calibri" w:cs="Calibri"/>
-                <w:color w:val="000000"/>
-              </w:rPr>
-              <w:t>Yeni</w:t>
-            </w:r>
-          </w:p>
-        </w:tc>
-        <w:tc>
-          <w:tcPr>
-            <w:tcW w:w="1639" w:type="dxa"/>
-          </w:tcPr>
-          <w:p>
-            <w:r>
-              <w:t>Complete</w:t>
-            </w:r>
-          </w:p>
-        </w:tc>
-        <w:tc>
-          <w:tcPr>
-            <w:tcW w:w="2316" w:type="dxa"/>
-          </w:tcPr>
-          <w:p/>
-        </w:tc>
-      </w:tr>
-      <w:tr>
-        <w:tc>
-          <w:tcPr>
-            <w:tcW w:w="3865" w:type="dxa"/>
-            <w:vAlign w:val="bottom"/>
-          </w:tcPr>
-          <w:p>
-            <w:pPr>
-              <w:rPr>
-                <w:rFonts w:ascii="Calibri" w:hAnsi="Calibri" w:cs="Calibri"/>
-                <w:color w:val="000000"/>
-              </w:rPr>
-            </w:pPr>
-            <w:r>
-              <w:rPr>
-                <w:rFonts w:ascii="Calibri" w:hAnsi="Calibri" w:cs="Calibri"/>
-                <w:color w:val="000000"/>
-              </w:rPr>
-              <w:t>Search for a specific meal item</w:t>
-            </w:r>
-          </w:p>
-        </w:tc>
-        <w:tc>
-          <w:tcPr>
-            <w:tcW w:w="1530" w:type="dxa"/>
-            <w:vAlign w:val="bottom"/>
-          </w:tcPr>
-          <w:p>
-            <w:r>
-              <w:rPr>
-                <w:rFonts w:ascii="Calibri" w:hAnsi="Calibri" w:cs="Calibri"/>
-                <w:color w:val="000000"/>
-              </w:rPr>
-              <w:t>Yeni</w:t>
-            </w:r>
-          </w:p>
-        </w:tc>
-        <w:tc>
-          <w:tcPr>
-            <w:tcW w:w="1639" w:type="dxa"/>
-          </w:tcPr>
-          <w:p>
-            <w:r>
-              <w:t>Incomplete</w:t>
-            </w:r>
-          </w:p>
-        </w:tc>
-        <w:tc>
-          <w:tcPr>
-            <w:tcW w:w="2316" w:type="dxa"/>
-          </w:tcPr>
-          <w:p/>
-        </w:tc>
-      </w:tr>
-      <w:tr>
-        <w:tc>
-          <w:tcPr>
-            <w:tcW w:w="3865" w:type="dxa"/>
-            <w:vAlign w:val="bottom"/>
-          </w:tcPr>
-          <w:p>
-            <w:pPr>
-              <w:rPr>
-                <w:rFonts w:ascii="Calibri" w:hAnsi="Calibri" w:cs="Calibri"/>
-                <w:color w:val="000000"/>
-              </w:rPr>
-            </w:pPr>
-            <w:r>
-              <w:rPr>
-                <w:rFonts w:ascii="Calibri" w:hAnsi="Calibri" w:cs="Calibri"/>
-                <w:color w:val="000000"/>
-              </w:rPr>
-              <w:t>Edit a food item</w:t>
-            </w:r>
-          </w:p>
-        </w:tc>
-        <w:tc>
-          <w:tcPr>
-            <w:tcW w:w="1530" w:type="dxa"/>
-            <w:vAlign w:val="bottom"/>
-          </w:tcPr>
-          <w:p>
-            <w:r>
-              <w:rPr>
-                <w:rFonts w:ascii="Calibri" w:hAnsi="Calibri" w:cs="Calibri"/>
-                <w:color w:val="000000"/>
-              </w:rPr>
-              <w:t>Justin</w:t>
-            </w:r>
-          </w:p>
-        </w:tc>
-        <w:tc>
-          <w:tcPr>
-            <w:tcW w:w="1639" w:type="dxa"/>
-          </w:tcPr>
-          <w:p>
-            <w:r>
-              <w:t>Incomplete</w:t>
-            </w:r>
-          </w:p>
-        </w:tc>
-        <w:tc>
-          <w:tcPr>
-            <w:tcW w:w="2316" w:type="dxa"/>
-          </w:tcPr>
-          <w:p>
-            <w:r>
-              <w:t>There are some back-end methods that can be used to implement this but there is no UI page to do the changes.</w:t>
+          <w:p>
+            <w:r>
+              <w:t xml:space="preserve">There are some back-end methods that can be used to implement this but there is no UI </w:t>
+            </w:r>
+            <w:r>
+              <w:lastRenderedPageBreak/>
+              <w:t>page to do the changes.</w:t>
             </w:r>
           </w:p>
         </w:tc>
@@ -896,7 +928,15 @@
           </w:tcPr>
           <w:p>
             <w:r>
-              <w:t>Couldn’t be started because there was no account page made in order to access this setting.</w:t>
+              <w:t xml:space="preserve">Couldn’t be started because there was no account page made </w:t>
+            </w:r>
+            <w:proofErr w:type="gramStart"/>
+            <w:r>
+              <w:t>in order to</w:t>
+            </w:r>
+            <w:proofErr w:type="gramEnd"/>
+            <w:r>
+              <w:t xml:space="preserve"> access this setting.</w:t>
             </w:r>
           </w:p>
         </w:tc>
@@ -952,7 +992,11 @@
           <w:tcPr>
             <w:tcW w:w="2316" w:type="dxa"/>
           </w:tcPr>
-          <w:p/>
+          <w:p>
+            <w:r>
+              <w:t>Diet plan not fully set up</w:t>
+            </w:r>
+          </w:p>
         </w:tc>
       </w:tr>
       <w:tr>
@@ -1153,8 +1197,21 @@
           <w:numId w:val="1"/>
         </w:numPr>
       </w:pPr>
-      <w:r>
-        <w:t>A git commit message (please include the commit ID and date/time)</w:t>
+      <w:proofErr w:type="gramStart"/>
+      <w:r>
+        <w:t>A git</w:t>
+      </w:r>
+      <w:proofErr w:type="gramEnd"/>
+      <w:r>
+        <w:t xml:space="preserve"> </w:t>
+      </w:r>
+      <w:proofErr w:type="gramStart"/>
+      <w:r>
+        <w:t>commit</w:t>
+      </w:r>
+      <w:proofErr w:type="gramEnd"/>
+      <w:r>
+        <w:t xml:space="preserve"> message (please include the commit ID and date/time)</w:t>
       </w:r>
     </w:p>
     <w:p>
@@ -1219,7 +1276,15 @@
         </w:numPr>
       </w:pPr>
       <w:r>
-        <w:t>providing detail as to how to reproduce a bug</w:t>
+        <w:t xml:space="preserve">providing </w:t>
+      </w:r>
+      <w:proofErr w:type="gramStart"/>
+      <w:r>
+        <w:t>detail</w:t>
+      </w:r>
+      <w:proofErr w:type="gramEnd"/>
+      <w:r>
+        <w:t xml:space="preserve"> as to how to reproduce a bug</w:t>
       </w:r>
     </w:p>
     <w:p>
@@ -1347,7 +1412,7 @@
               </w:rPr>
               <w:t xml:space="preserve">I've updated the product backlog, sprint backlog, and Planning meeting notes in the repo so that is all current after </w:t>
             </w:r>
-            <w:proofErr w:type="spellStart"/>
+            <w:proofErr w:type="gramStart"/>
             <w:r>
               <w:rPr>
                 <w:rFonts w:ascii="Segoe UI" w:eastAsia="Times New Roman" w:hAnsi="Segoe UI" w:cs="Segoe UI"/>
@@ -1358,7 +1423,7 @@
               </w:rPr>
               <w:t>todays</w:t>
             </w:r>
-            <w:proofErr w:type="spellEnd"/>
+            <w:proofErr w:type="gramEnd"/>
             <w:r>
               <w:rPr>
                 <w:rFonts w:ascii="Segoe UI" w:eastAsia="Times New Roman" w:hAnsi="Segoe UI" w:cs="Segoe UI"/>
@@ -1393,7 +1458,29 @@
                 <w:szCs w:val="21"/>
                 <w14:ligatures w14:val="none"/>
               </w:rPr>
-              <w:t>Everyone needs to do the task descriptions of their assigned stuff in the sprint backlog and estimate their hours. If anyone decides that they have too much or not enough to reach roughly 25 hours for the sprint please reach out so we can discuss reallocating stuff. </w:t>
+              <w:t xml:space="preserve">Everyone needs to do the task descriptions of their assigned stuff in the sprint backlog and estimate their hours. If anyone decides that they have too much or not enough to reach roughly 25 hours for the </w:t>
+            </w:r>
+            <w:proofErr w:type="gramStart"/>
+            <w:r>
+              <w:rPr>
+                <w:rFonts w:ascii="Segoe UI" w:eastAsia="Times New Roman" w:hAnsi="Segoe UI" w:cs="Segoe UI"/>
+                <w:kern w:val="0"/>
+                <w:sz w:val="21"/>
+                <w:szCs w:val="21"/>
+                <w14:ligatures w14:val="none"/>
+              </w:rPr>
+              <w:t>sprint</w:t>
+            </w:r>
+            <w:proofErr w:type="gramEnd"/>
+            <w:r>
+              <w:rPr>
+                <w:rFonts w:ascii="Segoe UI" w:eastAsia="Times New Roman" w:hAnsi="Segoe UI" w:cs="Segoe UI"/>
+                <w:kern w:val="0"/>
+                <w:sz w:val="21"/>
+                <w:szCs w:val="21"/>
+                <w14:ligatures w14:val="none"/>
+              </w:rPr>
+              <w:t xml:space="preserve"> please reach out so we can discuss reallocating stuff. </w:t>
             </w:r>
           </w:p>
           <w:p>
@@ -1463,6 +1550,7 @@
                 <w14:ligatures w14:val="none"/>
               </w:rPr>
             </w:pPr>
+            <w:proofErr w:type="gramStart"/>
             <w:r>
               <w:rPr>
                 <w:rFonts w:ascii="Segoe UI" w:eastAsia="Times New Roman" w:hAnsi="Segoe UI" w:cs="Segoe UI"/>
@@ -1471,12 +1559,10 @@
                 <w:szCs w:val="21"/>
                 <w14:ligatures w14:val="none"/>
               </w:rPr>
-              <w:t>Everyone when you add new classes and things to the code make sure you add them to the class diagram and that they are fully tested.</w:t>
-            </w:r>
-          </w:p>
-          <w:p>
-            <w:pPr>
-              <w:spacing w:before="100" w:beforeAutospacing="1" w:after="100" w:afterAutospacing="1"/>
+              <w:t>Everyone</w:t>
+            </w:r>
+            <w:proofErr w:type="gramEnd"/>
+            <w:r>
               <w:rPr>
                 <w:rFonts w:ascii="Segoe UI" w:eastAsia="Times New Roman" w:hAnsi="Segoe UI" w:cs="Segoe UI"/>
                 <w:kern w:val="0"/>
@@ -1484,7 +1570,9 @@
                 <w:szCs w:val="21"/>
                 <w14:ligatures w14:val="none"/>
               </w:rPr>
-            </w:pPr>
+              <w:t xml:space="preserve"> when you add new classes and things to the </w:t>
+            </w:r>
+            <w:proofErr w:type="gramStart"/>
             <w:r>
               <w:rPr>
                 <w:rFonts w:ascii="Segoe UI" w:eastAsia="Times New Roman" w:hAnsi="Segoe UI" w:cs="Segoe UI"/>
@@ -1493,55 +1581,63 @@
                 <w:szCs w:val="21"/>
                 <w14:ligatures w14:val="none"/>
               </w:rPr>
-              <w:t>Everyone have a good weekend! </w:t>
-            </w:r>
-          </w:p>
-        </w:tc>
-      </w:tr>
-      <w:tr>
-        <w:tc>
-          <w:tcPr>
-            <w:tcW w:w="1615" w:type="dxa"/>
-          </w:tcPr>
-          <w:p>
-            <w:r>
-              <w:t>Justin Smith</w:t>
-            </w:r>
-          </w:p>
-        </w:tc>
-        <w:tc>
-          <w:tcPr>
-            <w:tcW w:w="7735" w:type="dxa"/>
-          </w:tcPr>
-          <w:p>
-            <w:r>
-              <w:t>Just to list off our follow up tasks from the meeting.</w:t>
-            </w:r>
-          </w:p>
-          <w:p>
-            <w:r>
+              <w:t>code</w:t>
+            </w:r>
+            <w:proofErr w:type="gramEnd"/>
+            <w:r>
+              <w:rPr>
+                <w:rFonts w:ascii="Segoe UI" w:eastAsia="Times New Roman" w:hAnsi="Segoe UI" w:cs="Segoe UI"/>
+                <w:kern w:val="0"/>
+                <w:sz w:val="21"/>
+                <w:szCs w:val="21"/>
+                <w14:ligatures w14:val="none"/>
+              </w:rPr>
+              <w:t xml:space="preserve"> make sure you add them to the class diagram and that they are fully tested.</w:t>
+            </w:r>
+          </w:p>
+          <w:p>
+            <w:pPr>
+              <w:spacing w:before="100" w:beforeAutospacing="1" w:after="100" w:afterAutospacing="1"/>
+              <w:rPr>
+                <w:rFonts w:ascii="Segoe UI" w:eastAsia="Times New Roman" w:hAnsi="Segoe UI" w:cs="Segoe UI"/>
+                <w:kern w:val="0"/>
+                <w:sz w:val="21"/>
+                <w:szCs w:val="21"/>
+                <w14:ligatures w14:val="none"/>
+              </w:rPr>
+            </w:pPr>
+            <w:r>
+              <w:rPr>
+                <w:rFonts w:ascii="Segoe UI" w:eastAsia="Times New Roman" w:hAnsi="Segoe UI" w:cs="Segoe UI"/>
+                <w:kern w:val="0"/>
+                <w:sz w:val="21"/>
+                <w:szCs w:val="21"/>
+                <w14:ligatures w14:val="none"/>
+              </w:rPr>
               <w:lastRenderedPageBreak/>
-              <w:t>Victor Is going to do the Use Case Scenarios</w:t>
-            </w:r>
-          </w:p>
-          <w:p>
-            <w:r>
-              <w:t>Yeni is going to do the Use Case Diagram</w:t>
-            </w:r>
-          </w:p>
-          <w:p>
-            <w:r>
-              <w:t>Emi will mock up some Wireframes</w:t>
-            </w:r>
-          </w:p>
-          <w:p>
-            <w:r>
-              <w:t> </w:t>
-            </w:r>
-          </w:p>
-          <w:p>
-            <w:r>
-              <w:t>I will also post the product back log and sprint backlog in the shared documents on the teams channel. If anyone thinks of anything we need to add or edit on those over the next few days before our meeting just let me know. </w:t>
+              <w:t xml:space="preserve">Everyone </w:t>
+            </w:r>
+            <w:proofErr w:type="gramStart"/>
+            <w:r>
+              <w:rPr>
+                <w:rFonts w:ascii="Segoe UI" w:eastAsia="Times New Roman" w:hAnsi="Segoe UI" w:cs="Segoe UI"/>
+                <w:kern w:val="0"/>
+                <w:sz w:val="21"/>
+                <w:szCs w:val="21"/>
+                <w14:ligatures w14:val="none"/>
+              </w:rPr>
+              <w:t>have</w:t>
+            </w:r>
+            <w:proofErr w:type="gramEnd"/>
+            <w:r>
+              <w:rPr>
+                <w:rFonts w:ascii="Segoe UI" w:eastAsia="Times New Roman" w:hAnsi="Segoe UI" w:cs="Segoe UI"/>
+                <w:kern w:val="0"/>
+                <w:sz w:val="21"/>
+                <w:szCs w:val="21"/>
+                <w14:ligatures w14:val="none"/>
+              </w:rPr>
+              <w:t xml:space="preserve"> a good weekend! </w:t>
             </w:r>
           </w:p>
         </w:tc>
@@ -1557,6 +1653,209 @@
               <w:t>Justin Smith</w:t>
             </w:r>
           </w:p>
+        </w:tc>
+        <w:tc>
+          <w:tcPr>
+            <w:tcW w:w="7735" w:type="dxa"/>
+          </w:tcPr>
+          <w:p>
+            <w:r>
+              <w:t xml:space="preserve">Just to </w:t>
+            </w:r>
+            <w:proofErr w:type="gramStart"/>
+            <w:r>
+              <w:t>list off</w:t>
+            </w:r>
+            <w:proofErr w:type="gramEnd"/>
+            <w:r>
+              <w:t xml:space="preserve"> our </w:t>
+            </w:r>
+            <w:proofErr w:type="gramStart"/>
+            <w:r>
+              <w:t>follow up</w:t>
+            </w:r>
+            <w:proofErr w:type="gramEnd"/>
+            <w:r>
+              <w:t xml:space="preserve"> tasks from the meeting.</w:t>
+            </w:r>
+          </w:p>
+          <w:p>
+            <w:r>
+              <w:t>Victor Is going to do the Use Case Scenarios</w:t>
+            </w:r>
+          </w:p>
+          <w:p>
+            <w:r>
+              <w:t>Yeni is going to do the Use Case Diagram</w:t>
+            </w:r>
+          </w:p>
+          <w:p>
+            <w:r>
+              <w:t xml:space="preserve">Emi will </w:t>
+            </w:r>
+            <w:proofErr w:type="gramStart"/>
+            <w:r>
+              <w:t>mock up</w:t>
+            </w:r>
+            <w:proofErr w:type="gramEnd"/>
+            <w:r>
+              <w:t xml:space="preserve"> some Wireframes</w:t>
+            </w:r>
+          </w:p>
+          <w:p>
+            <w:r>
+              <w:t> </w:t>
+            </w:r>
+          </w:p>
+          <w:p>
+            <w:r>
+              <w:t xml:space="preserve">I will also post the product </w:t>
+            </w:r>
+            <w:proofErr w:type="gramStart"/>
+            <w:r>
+              <w:t>back log</w:t>
+            </w:r>
+            <w:proofErr w:type="gramEnd"/>
+            <w:r>
+              <w:t xml:space="preserve"> and sprint backlog in the shared documents on the </w:t>
+            </w:r>
+            <w:proofErr w:type="gramStart"/>
+            <w:r>
+              <w:t>teams</w:t>
+            </w:r>
+            <w:proofErr w:type="gramEnd"/>
+            <w:r>
+              <w:t xml:space="preserve"> channel. If anyone thinks of anything we need to add or </w:t>
+            </w:r>
+            <w:proofErr w:type="gramStart"/>
+            <w:r>
+              <w:t>edit on those</w:t>
+            </w:r>
+            <w:proofErr w:type="gramEnd"/>
+            <w:r>
+              <w:t xml:space="preserve"> over the next few days before our meeting just let me know. </w:t>
+            </w:r>
+          </w:p>
+        </w:tc>
+      </w:tr>
+      <w:tr>
+        <w:tc>
+          <w:tcPr>
+            <w:tcW w:w="1615" w:type="dxa"/>
+          </w:tcPr>
+          <w:p>
+            <w:r>
+              <w:t>Justin Smith</w:t>
+            </w:r>
+          </w:p>
+        </w:tc>
+        <w:tc>
+          <w:tcPr>
+            <w:tcW w:w="7735" w:type="dxa"/>
+          </w:tcPr>
+          <w:p/>
+        </w:tc>
+      </w:tr>
+      <w:tr>
+        <w:tc>
+          <w:tcPr>
+            <w:tcW w:w="1615" w:type="dxa"/>
+          </w:tcPr>
+          <w:p>
+            <w:r>
+              <w:t>Victor Filpo</w:t>
+            </w:r>
+          </w:p>
+        </w:tc>
+        <w:tc>
+          <w:tcPr>
+            <w:tcW w:w="7735" w:type="dxa"/>
+          </w:tcPr>
+          <w:p>
+            <w:r>
+              <w:t xml:space="preserve">Commit 79de575, 3/6 @9:00 PM: </w:t>
+            </w:r>
+            <w:r>
+              <w:t>Add Dashboard tests, delete sample data, applied checkstyle to Dashboard</w:t>
+            </w:r>
+          </w:p>
+          <w:p>
+            <w:r>
+              <w:t>- GenAI: helped plan test cases I missed</w:t>
+            </w:r>
+          </w:p>
+        </w:tc>
+      </w:tr>
+      <w:tr>
+        <w:tc>
+          <w:tcPr>
+            <w:tcW w:w="1615" w:type="dxa"/>
+          </w:tcPr>
+          <w:p>
+            <w:r>
+              <w:t>Victor Filpo</w:t>
+            </w:r>
+          </w:p>
+        </w:tc>
+        <w:tc>
+          <w:tcPr>
+            <w:tcW w:w="7735" w:type="dxa"/>
+          </w:tcPr>
+          <w:p>
+            <w:r>
+              <w:t xml:space="preserve">Pull Requests </w:t>
+            </w:r>
+            <w:r>
+              <w:t xml:space="preserve">Review and </w:t>
+            </w:r>
+            <w:r>
+              <w:t xml:space="preserve">Merges #18 and #19, c3fcd69 and </w:t>
+            </w:r>
+            <w:proofErr w:type="gramStart"/>
+            <w:r>
+              <w:t>de8a126 @</w:t>
+            </w:r>
+            <w:proofErr w:type="gramEnd"/>
+            <w:r>
+              <w:t xml:space="preserve"> 6:00 PM</w:t>
+            </w:r>
+          </w:p>
+        </w:tc>
+      </w:tr>
+      <w:tr>
+        <w:tc>
+          <w:tcPr>
+            <w:tcW w:w="1615" w:type="dxa"/>
+          </w:tcPr>
+          <w:p/>
+        </w:tc>
+        <w:tc>
+          <w:tcPr>
+            <w:tcW w:w="7735" w:type="dxa"/>
+          </w:tcPr>
+          <w:p/>
+        </w:tc>
+      </w:tr>
+      <w:tr>
+        <w:tc>
+          <w:tcPr>
+            <w:tcW w:w="1615" w:type="dxa"/>
+          </w:tcPr>
+          <w:p/>
+        </w:tc>
+        <w:tc>
+          <w:tcPr>
+            <w:tcW w:w="7735" w:type="dxa"/>
+          </w:tcPr>
+          <w:p/>
+        </w:tc>
+      </w:tr>
+      <w:tr>
+        <w:tc>
+          <w:tcPr>
+            <w:tcW w:w="1615" w:type="dxa"/>
+          </w:tcPr>
+          <w:p/>
         </w:tc>
         <w:tc>
           <w:tcPr>
@@ -1720,23 +2019,7 @@
                 <w:rFonts w:ascii="Calibri" w:hAnsi="Calibri" w:cs="Calibri"/>
                 <w:color w:val="000000"/>
               </w:rPr>
-              <w:t xml:space="preserve">Communication </w:t>
-            </w:r>
-            <w:proofErr w:type="spellStart"/>
-            <w:r>
-              <w:rPr>
-                <w:rFonts w:ascii="Calibri" w:hAnsi="Calibri" w:cs="Calibri"/>
-                <w:color w:val="000000"/>
-              </w:rPr>
-              <w:t>Protecol</w:t>
-            </w:r>
-            <w:proofErr w:type="spellEnd"/>
-            <w:r>
-              <w:rPr>
-                <w:rFonts w:ascii="Calibri" w:hAnsi="Calibri" w:cs="Calibri"/>
-                <w:color w:val="000000"/>
-              </w:rPr>
-              <w:t xml:space="preserve"> for authorization process</w:t>
+              <w:t>Communication Protecol for authorization process</w:t>
             </w:r>
           </w:p>
         </w:tc>
@@ -2018,17 +2301,8 @@
                 <w:rFonts w:ascii="Calibri" w:hAnsi="Calibri" w:cs="Calibri"/>
                 <w:color w:val="000000"/>
               </w:rPr>
-              <w:t xml:space="preserve">Login Page </w:t>
-            </w:r>
-            <w:proofErr w:type="spellStart"/>
-            <w:r>
-              <w:rPr>
-                <w:rFonts w:ascii="Calibri" w:hAnsi="Calibri" w:cs="Calibri"/>
-                <w:color w:val="000000"/>
-              </w:rPr>
-              <w:t>Codebehind</w:t>
-            </w:r>
-            <w:proofErr w:type="spellEnd"/>
+              <w:t>Login Page Codebehind</w:t>
+            </w:r>
           </w:p>
         </w:tc>
         <w:tc>
@@ -2074,23 +2348,7 @@
                 <w:rFonts w:ascii="Calibri" w:hAnsi="Calibri" w:cs="Calibri"/>
                 <w:color w:val="000000"/>
               </w:rPr>
-              <w:t xml:space="preserve">Communication </w:t>
-            </w:r>
-            <w:proofErr w:type="spellStart"/>
-            <w:r>
-              <w:rPr>
-                <w:rFonts w:ascii="Calibri" w:hAnsi="Calibri" w:cs="Calibri"/>
-                <w:color w:val="000000"/>
-              </w:rPr>
-              <w:t>Protecol</w:t>
-            </w:r>
-            <w:proofErr w:type="spellEnd"/>
-            <w:r>
-              <w:rPr>
-                <w:rFonts w:ascii="Calibri" w:hAnsi="Calibri" w:cs="Calibri"/>
-                <w:color w:val="000000"/>
-              </w:rPr>
-              <w:t xml:space="preserve"> for Create Account</w:t>
+              <w:t>Communication Protecol for Create Account</w:t>
             </w:r>
           </w:p>
         </w:tc>
@@ -2419,23 +2677,7 @@
                 <w:rFonts w:ascii="Calibri" w:hAnsi="Calibri" w:cs="Calibri"/>
                 <w:color w:val="000000"/>
               </w:rPr>
-              <w:t xml:space="preserve">Communication </w:t>
-            </w:r>
-            <w:proofErr w:type="spellStart"/>
-            <w:r>
-              <w:rPr>
-                <w:rFonts w:ascii="Calibri" w:hAnsi="Calibri" w:cs="Calibri"/>
-                <w:color w:val="000000"/>
-              </w:rPr>
-              <w:t>Protecol</w:t>
-            </w:r>
-            <w:proofErr w:type="spellEnd"/>
-            <w:r>
-              <w:rPr>
-                <w:rFonts w:ascii="Calibri" w:hAnsi="Calibri" w:cs="Calibri"/>
-                <w:color w:val="000000"/>
-              </w:rPr>
-              <w:t xml:space="preserve"> for Create Food</w:t>
+              <w:t>Communication Protecol for Create Food</w:t>
             </w:r>
           </w:p>
         </w:tc>
@@ -2576,23 +2818,7 @@
                 <w:rFonts w:ascii="Calibri" w:hAnsi="Calibri" w:cs="Calibri"/>
                 <w:color w:val="000000"/>
               </w:rPr>
-              <w:t xml:space="preserve">Communication </w:t>
-            </w:r>
-            <w:proofErr w:type="spellStart"/>
-            <w:r>
-              <w:rPr>
-                <w:rFonts w:ascii="Calibri" w:hAnsi="Calibri" w:cs="Calibri"/>
-                <w:color w:val="000000"/>
-              </w:rPr>
-              <w:t>Protecol</w:t>
-            </w:r>
-            <w:proofErr w:type="spellEnd"/>
-            <w:r>
-              <w:rPr>
-                <w:rFonts w:ascii="Calibri" w:hAnsi="Calibri" w:cs="Calibri"/>
-                <w:color w:val="000000"/>
-              </w:rPr>
-              <w:t xml:space="preserve"> for Search</w:t>
+              <w:t>Communication Protecol for Search</w:t>
             </w:r>
           </w:p>
         </w:tc>
@@ -2639,33 +2865,8 @@
                 <w:rFonts w:ascii="Calibri" w:hAnsi="Calibri" w:cs="Calibri"/>
                 <w:color w:val="000000"/>
               </w:rPr>
-              <w:t xml:space="preserve">Communication </w:t>
-            </w:r>
-            <w:proofErr w:type="spellStart"/>
-            <w:r>
-              <w:rPr>
-                <w:rFonts w:ascii="Calibri" w:hAnsi="Calibri" w:cs="Calibri"/>
-                <w:color w:val="000000"/>
-              </w:rPr>
-              <w:t>Protecol</w:t>
-            </w:r>
-            <w:proofErr w:type="spellEnd"/>
-            <w:r>
-              <w:rPr>
-                <w:rFonts w:ascii="Calibri" w:hAnsi="Calibri" w:cs="Calibri"/>
-                <w:color w:val="000000"/>
-              </w:rPr>
-              <w:t xml:space="preserve"> for Update </w:t>
-            </w:r>
-            <w:proofErr w:type="spellStart"/>
-            <w:r>
-              <w:rPr>
-                <w:rFonts w:ascii="Calibri" w:hAnsi="Calibri" w:cs="Calibri"/>
-                <w:color w:val="000000"/>
-              </w:rPr>
-              <w:t>DayOfFood</w:t>
-            </w:r>
-            <w:proofErr w:type="spellEnd"/>
+              <w:t>Communication Protecol for Update DayOfFood</w:t>
+            </w:r>
           </w:p>
         </w:tc>
         <w:tc>
@@ -2706,21 +2907,12 @@
             <w:vAlign w:val="bottom"/>
           </w:tcPr>
           <w:p>
-            <w:proofErr w:type="spellStart"/>
-            <w:r>
-              <w:rPr>
-                <w:rFonts w:ascii="Calibri" w:hAnsi="Calibri" w:cs="Calibri"/>
-                <w:color w:val="000000"/>
-              </w:rPr>
-              <w:t>DayOfFood</w:t>
-            </w:r>
-            <w:proofErr w:type="spellEnd"/>
-            <w:r>
-              <w:rPr>
-                <w:rFonts w:ascii="Calibri" w:hAnsi="Calibri" w:cs="Calibri"/>
-                <w:color w:val="000000"/>
-              </w:rPr>
-              <w:t xml:space="preserve"> Structure</w:t>
+            <w:r>
+              <w:rPr>
+                <w:rFonts w:ascii="Calibri" w:hAnsi="Calibri" w:cs="Calibri"/>
+                <w:color w:val="000000"/>
+              </w:rPr>
+              <w:t>DayOfFood Structure</w:t>
             </w:r>
           </w:p>
         </w:tc>
@@ -2940,6 +3132,7 @@
                 <w:rFonts w:ascii="Calibri" w:hAnsi="Calibri" w:cs="Calibri"/>
                 <w:color w:val="000000"/>
               </w:rPr>
+              <w:lastRenderedPageBreak/>
               <w:t>4.2</w:t>
             </w:r>
           </w:p>
@@ -3002,23 +3195,7 @@
                 <w:rFonts w:ascii="Calibri" w:hAnsi="Calibri" w:cs="Calibri"/>
                 <w:color w:val="000000"/>
               </w:rPr>
-              <w:t xml:space="preserve">Update </w:t>
-            </w:r>
-            <w:proofErr w:type="spellStart"/>
-            <w:r>
-              <w:rPr>
-                <w:rFonts w:ascii="Calibri" w:hAnsi="Calibri" w:cs="Calibri"/>
-                <w:color w:val="000000"/>
-              </w:rPr>
-              <w:t>DayOfFood</w:t>
-            </w:r>
-            <w:proofErr w:type="spellEnd"/>
-            <w:r>
-              <w:rPr>
-                <w:rFonts w:ascii="Calibri" w:hAnsi="Calibri" w:cs="Calibri"/>
-                <w:color w:val="000000"/>
-              </w:rPr>
-              <w:t xml:space="preserve"> Process Client Side</w:t>
+              <w:t>Update DayOfFood Process Client Side</w:t>
             </w:r>
           </w:p>
         </w:tc>
@@ -3065,23 +3242,7 @@
                 <w:rFonts w:ascii="Calibri" w:hAnsi="Calibri" w:cs="Calibri"/>
                 <w:color w:val="000000"/>
               </w:rPr>
-              <w:t xml:space="preserve">Update </w:t>
-            </w:r>
-            <w:proofErr w:type="spellStart"/>
-            <w:r>
-              <w:rPr>
-                <w:rFonts w:ascii="Calibri" w:hAnsi="Calibri" w:cs="Calibri"/>
-                <w:color w:val="000000"/>
-              </w:rPr>
-              <w:t>DayOfFood</w:t>
-            </w:r>
-            <w:proofErr w:type="spellEnd"/>
-            <w:r>
-              <w:rPr>
-                <w:rFonts w:ascii="Calibri" w:hAnsi="Calibri" w:cs="Calibri"/>
-                <w:color w:val="000000"/>
-              </w:rPr>
-              <w:t xml:space="preserve"> Process Server Side</w:t>
+              <w:t>Update DayOfFood Process Server Side</w:t>
             </w:r>
           </w:p>
         </w:tc>
@@ -3128,23 +3289,7 @@
                 <w:rFonts w:ascii="Calibri" w:hAnsi="Calibri" w:cs="Calibri"/>
                 <w:color w:val="000000"/>
               </w:rPr>
-              <w:t xml:space="preserve">Communication </w:t>
-            </w:r>
-            <w:proofErr w:type="spellStart"/>
-            <w:r>
-              <w:rPr>
-                <w:rFonts w:ascii="Calibri" w:hAnsi="Calibri" w:cs="Calibri"/>
-                <w:color w:val="000000"/>
-              </w:rPr>
-              <w:t>Protecol</w:t>
-            </w:r>
-            <w:proofErr w:type="spellEnd"/>
-            <w:r>
-              <w:rPr>
-                <w:rFonts w:ascii="Calibri" w:hAnsi="Calibri" w:cs="Calibri"/>
-                <w:color w:val="000000"/>
-              </w:rPr>
-              <w:t xml:space="preserve"> for Update Diet</w:t>
+              <w:t>Communication Protecol for Update Diet</w:t>
             </w:r>
           </w:p>
         </w:tc>
@@ -3379,17 +3524,8 @@
                 <w:rFonts w:ascii="Calibri" w:hAnsi="Calibri" w:cs="Calibri"/>
                 <w:color w:val="000000"/>
               </w:rPr>
-              <w:t xml:space="preserve">Edit Diet </w:t>
-            </w:r>
-            <w:proofErr w:type="spellStart"/>
-            <w:r>
-              <w:rPr>
-                <w:rFonts w:ascii="Calibri" w:hAnsi="Calibri" w:cs="Calibri"/>
-                <w:color w:val="000000"/>
-              </w:rPr>
-              <w:t>Codebehind</w:t>
-            </w:r>
-            <w:proofErr w:type="spellEnd"/>
+              <w:t>Edit Diet Codebehind</w:t>
+            </w:r>
           </w:p>
         </w:tc>
         <w:tc>
@@ -3445,7 +3581,23 @@
           <w:b/>
           <w:bCs/>
         </w:rPr>
-        <w:t xml:space="preserve"> session where you used generative AI, give the following:</w:t>
+        <w:t xml:space="preserve"> session where you </w:t>
+      </w:r>
+      <w:proofErr w:type="gramStart"/>
+      <w:r>
+        <w:rPr>
+          <w:b/>
+          <w:bCs/>
+        </w:rPr>
+        <w:t>used</w:t>
+      </w:r>
+      <w:proofErr w:type="gramEnd"/>
+      <w:r>
+        <w:rPr>
+          <w:b/>
+          <w:bCs/>
+        </w:rPr>
+        <w:t xml:space="preserve"> generative AI, give the following:</w:t>
       </w:r>
     </w:p>
     <w:p>
@@ -3669,23 +3821,7 @@
           <w:b/>
           <w:bCs/>
         </w:rPr>
-        <w:t xml:space="preserve">JS - </w:t>
-      </w:r>
-      <w:proofErr w:type="spellStart"/>
-      <w:r>
-        <w:rPr>
-          <w:b/>
-          <w:bCs/>
-        </w:rPr>
-        <w:t>IOException</w:t>
-      </w:r>
-      <w:proofErr w:type="spellEnd"/>
-      <w:r>
-        <w:rPr>
-          <w:b/>
-          <w:bCs/>
-        </w:rPr>
-        <w:t xml:space="preserve"> Testing ChatGPT Session</w:t>
+        <w:t>JS - IOException Testing ChatGPT Session</w:t>
       </w:r>
     </w:p>
     <w:p>
@@ -3705,23 +3841,7 @@
           <w:b/>
           <w:bCs/>
         </w:rPr>
-        <w:t xml:space="preserve">Help with how to setup a test case to force an </w:t>
-      </w:r>
-      <w:proofErr w:type="spellStart"/>
-      <w:r>
-        <w:rPr>
-          <w:b/>
-          <w:bCs/>
-        </w:rPr>
-        <w:t>IOExeption</w:t>
-      </w:r>
-      <w:proofErr w:type="spellEnd"/>
-      <w:r>
-        <w:rPr>
-          <w:b/>
-          <w:bCs/>
-        </w:rPr>
-        <w:t xml:space="preserve"> to be thrown to reach 100% code coverage.</w:t>
+        <w:t>Help with how to setup a test case to force an IOExeption to be thrown to reach 100% code coverage.</w:t>
       </w:r>
     </w:p>
     <w:p>
@@ -3789,23 +3909,7 @@
           <w:b/>
           <w:bCs/>
         </w:rPr>
-        <w:t xml:space="preserve">JS - </w:t>
-      </w:r>
-      <w:proofErr w:type="spellStart"/>
-      <w:r>
-        <w:rPr>
-          <w:b/>
-          <w:bCs/>
-        </w:rPr>
-        <w:t>CompositeFood</w:t>
-      </w:r>
-      <w:proofErr w:type="spellEnd"/>
-      <w:r>
-        <w:rPr>
-          <w:b/>
-          <w:bCs/>
-        </w:rPr>
-        <w:t xml:space="preserve"> Error Review ChatGPT Session</w:t>
+        <w:t>JS - CompositeFood Error Review ChatGPT Session</w:t>
       </w:r>
       <w:r>
         <w:rPr>
@@ -3819,23 +3923,7 @@
           <w:b/>
           <w:bCs/>
         </w:rPr>
-        <w:t xml:space="preserve">JS - </w:t>
-      </w:r>
-      <w:proofErr w:type="spellStart"/>
-      <w:r>
-        <w:rPr>
-          <w:b/>
-          <w:bCs/>
-        </w:rPr>
-        <w:t>CompositeFood</w:t>
-      </w:r>
-      <w:proofErr w:type="spellEnd"/>
-      <w:r>
-        <w:rPr>
-          <w:b/>
-          <w:bCs/>
-        </w:rPr>
-        <w:t xml:space="preserve"> Error Review Continued ChatGPT Session</w:t>
+        <w:t>JS - CompositeFood Error Review Continued ChatGPT Session</w:t>
       </w:r>
     </w:p>
     <w:p>
@@ -3855,49 +3943,24 @@
           <w:b/>
           <w:bCs/>
         </w:rPr>
-        <w:t xml:space="preserve">Help with figuring out how to fix errors with reading and writing to Json files using </w:t>
-      </w:r>
-      <w:proofErr w:type="spellStart"/>
-      <w:r>
-        <w:rPr>
-          <w:b/>
-          <w:bCs/>
-        </w:rPr>
-        <w:t>ObjectMapper</w:t>
-      </w:r>
-      <w:proofErr w:type="spellEnd"/>
-      <w:r>
-        <w:rPr>
-          <w:b/>
-          <w:bCs/>
-        </w:rPr>
-        <w:t xml:space="preserve">. Also with writing test cases for testing the </w:t>
-      </w:r>
-      <w:proofErr w:type="spellStart"/>
-      <w:r>
-        <w:rPr>
-          <w:b/>
-          <w:bCs/>
-        </w:rPr>
-        <w:t>createCompositeFood</w:t>
-      </w:r>
-      <w:proofErr w:type="spellEnd"/>
-      <w:r>
-        <w:rPr>
-          <w:b/>
-          <w:bCs/>
-        </w:rPr>
-        <w:t xml:space="preserve"> method in </w:t>
-      </w:r>
-      <w:proofErr w:type="spellStart"/>
-      <w:r>
-        <w:rPr>
-          <w:b/>
-          <w:bCs/>
-        </w:rPr>
-        <w:t>CreateCompositeFoodPageViewModel</w:t>
-      </w:r>
-      <w:proofErr w:type="spellEnd"/>
+        <w:t xml:space="preserve">Help with figuring out how to fix errors with reading and writing to Json files using ObjectMapper. </w:t>
+      </w:r>
+      <w:proofErr w:type="gramStart"/>
+      <w:r>
+        <w:rPr>
+          <w:b/>
+          <w:bCs/>
+        </w:rPr>
+        <w:t>Also</w:t>
+      </w:r>
+      <w:proofErr w:type="gramEnd"/>
+      <w:r>
+        <w:rPr>
+          <w:b/>
+          <w:bCs/>
+        </w:rPr>
+        <w:t xml:space="preserve"> with writing test cases for testing the createCompositeFood method in CreateCompositeFoodPageViewModel</w:t>
+      </w:r>
     </w:p>
     <w:p>
       <w:pPr>
@@ -3921,14 +3984,6 @@
     </w:p>
     <w:p>
       <w:pPr>
-        <w:rPr>
-          <w:b/>
-          <w:bCs/>
-        </w:rPr>
-      </w:pPr>
-    </w:p>
-    <w:p>
-      <w:pPr>
         <w:pStyle w:val="ListParagraph"/>
         <w:numPr>
           <w:ilvl w:val="0"/>
@@ -3944,7 +3999,8 @@
           <w:b/>
           <w:bCs/>
         </w:rPr>
-        <w:t>Justin Smith</w:t>
+        <w:lastRenderedPageBreak/>
+        <w:t>Victor Filpo</w:t>
       </w:r>
     </w:p>
     <w:p>
@@ -3964,7 +4020,7 @@
           <w:b/>
           <w:bCs/>
         </w:rPr>
-        <w:t>JS - Json Testing Error Fix ChatGPT Session</w:t>
+        <w:t>VF - Test_Guidance_ChatGPT</w:t>
       </w:r>
     </w:p>
     <w:p>
@@ -3984,7 +4040,14 @@
           <w:b/>
           <w:bCs/>
         </w:rPr>
-        <w:t>Got help with how to fix issues with how Json exceptions can be thrown to be handled higher up.</w:t>
+        <w:t>Guidance on best practice for organizing test cases when writing tests</w:t>
+      </w:r>
+      <w:r>
+        <w:rPr>
+          <w:b/>
+          <w:bCs/>
+        </w:rPr>
+        <w:t>. Explanation on a code snippet from a team member.</w:t>
       </w:r>
     </w:p>
     <w:p>
@@ -4000,6 +4063,93 @@
         </w:rPr>
       </w:pPr>
       <w:r>
+        <w:t xml:space="preserve">Commit </w:t>
+      </w:r>
+      <w:r>
+        <w:t>79de575cfcaf0163c7682478f3a12942dc10482e</w:t>
+      </w:r>
+    </w:p>
+    <w:p>
+      <w:pPr>
+        <w:rPr>
+          <w:b/>
+          <w:bCs/>
+        </w:rPr>
+      </w:pPr>
+    </w:p>
+    <w:p>
+      <w:pPr>
+        <w:pStyle w:val="ListParagraph"/>
+        <w:numPr>
+          <w:ilvl w:val="0"/>
+          <w:numId w:val="7"/>
+        </w:numPr>
+        <w:rPr>
+          <w:b/>
+          <w:bCs/>
+        </w:rPr>
+      </w:pPr>
+      <w:r>
+        <w:rPr>
+          <w:b/>
+          <w:bCs/>
+        </w:rPr>
+        <w:t>Justin Smith</w:t>
+      </w:r>
+    </w:p>
+    <w:p>
+      <w:pPr>
+        <w:pStyle w:val="ListParagraph"/>
+        <w:numPr>
+          <w:ilvl w:val="0"/>
+          <w:numId w:val="7"/>
+        </w:numPr>
+        <w:rPr>
+          <w:b/>
+          <w:bCs/>
+        </w:rPr>
+      </w:pPr>
+      <w:r>
+        <w:rPr>
+          <w:b/>
+          <w:bCs/>
+        </w:rPr>
+        <w:t>JS - Json Testing Error Fix ChatGPT Session</w:t>
+      </w:r>
+    </w:p>
+    <w:p>
+      <w:pPr>
+        <w:pStyle w:val="ListParagraph"/>
+        <w:numPr>
+          <w:ilvl w:val="0"/>
+          <w:numId w:val="7"/>
+        </w:numPr>
+        <w:rPr>
+          <w:b/>
+          <w:bCs/>
+        </w:rPr>
+      </w:pPr>
+      <w:r>
+        <w:rPr>
+          <w:b/>
+          <w:bCs/>
+        </w:rPr>
+        <w:t>Got help with how to fix issues with how Json exceptions can be thrown to be handled higher up.</w:t>
+      </w:r>
+    </w:p>
+    <w:p>
+      <w:pPr>
+        <w:pStyle w:val="ListParagraph"/>
+        <w:numPr>
+          <w:ilvl w:val="0"/>
+          <w:numId w:val="7"/>
+        </w:numPr>
+        <w:rPr>
+          <w:b/>
+          <w:bCs/>
+        </w:rPr>
+      </w:pPr>
+      <w:r>
         <w:rPr>
           <w:b/>
           <w:bCs/>
@@ -4032,7 +4182,6 @@
           <w:b/>
           <w:bCs/>
         </w:rPr>
-        <w:lastRenderedPageBreak/>
         <w:t>Yeni Almanza</w:t>
       </w:r>
     </w:p>
@@ -5420,10 +5569,32 @@
       <w:szCs w:val="32"/>
     </w:rPr>
   </w:style>
+  <w:style w:type="paragraph" w:styleId="Heading4">
+    <w:name w:val="heading 4"/>
+    <w:basedOn w:val="Normal"/>
+    <w:next w:val="Normal"/>
+    <w:link w:val="Heading4Char"/>
+    <w:uiPriority w:val="9"/>
+    <w:semiHidden/>
+    <w:unhideWhenUsed/>
+    <w:qFormat/>
+    <w:rsid w:val="00C52E5C"/>
+    <w:pPr>
+      <w:keepNext/>
+      <w:keepLines/>
+      <w:spacing w:before="40" w:after="0"/>
+      <w:outlineLvl w:val="3"/>
+    </w:pPr>
+    <w:rPr>
+      <w:rFonts w:asciiTheme="majorHAnsi" w:eastAsiaTheme="majorEastAsia" w:hAnsiTheme="majorHAnsi" w:cstheme="majorBidi"/>
+      <w:i/>
+      <w:iCs/>
+      <w:color w:val="2F5496" w:themeColor="accent1" w:themeShade="BF"/>
+    </w:rPr>
+  </w:style>
   <w:style w:type="character" w:default="1" w:styleId="DefaultParagraphFont">
     <w:name w:val="Default Paragraph Font"/>
     <w:uiPriority w:val="1"/>
-    <w:semiHidden/>
     <w:unhideWhenUsed/>
   </w:style>
   <w:style w:type="table" w:default="1" w:styleId="TableNormal">
@@ -5553,6 +5724,43 @@
       <w:color w:val="2F5496" w:themeColor="accent1" w:themeShade="BF"/>
       <w:sz w:val="32"/>
       <w:szCs w:val="32"/>
+    </w:rPr>
+  </w:style>
+  <w:style w:type="character" w:customStyle="1" w:styleId="Heading4Char">
+    <w:name w:val="Heading 4 Char"/>
+    <w:basedOn w:val="DefaultParagraphFont"/>
+    <w:link w:val="Heading4"/>
+    <w:uiPriority w:val="9"/>
+    <w:semiHidden/>
+    <w:rsid w:val="00C52E5C"/>
+    <w:rPr>
+      <w:rFonts w:asciiTheme="majorHAnsi" w:eastAsiaTheme="majorEastAsia" w:hAnsiTheme="majorHAnsi" w:cstheme="majorBidi"/>
+      <w:i/>
+      <w:iCs/>
+      <w:color w:val="2F5496" w:themeColor="accent1" w:themeShade="BF"/>
+    </w:rPr>
+  </w:style>
+  <w:style w:type="character" w:styleId="Hyperlink">
+    <w:name w:val="Hyperlink"/>
+    <w:basedOn w:val="DefaultParagraphFont"/>
+    <w:uiPriority w:val="99"/>
+    <w:unhideWhenUsed/>
+    <w:rsid w:val="00C52E5C"/>
+    <w:rPr>
+      <w:color w:val="0563C1" w:themeColor="hyperlink"/>
+      <w:u w:val="single"/>
+    </w:rPr>
+  </w:style>
+  <w:style w:type="character" w:styleId="UnresolvedMention">
+    <w:name w:val="Unresolved Mention"/>
+    <w:basedOn w:val="DefaultParagraphFont"/>
+    <w:uiPriority w:val="99"/>
+    <w:semiHidden/>
+    <w:unhideWhenUsed/>
+    <w:rsid w:val="00C52E5C"/>
+    <w:rPr>
+      <w:color w:val="605E5C"/>
+      <w:shd w:val="clear" w:color="auto" w:fill="E1DFDD"/>
     </w:rPr>
   </w:style>
 </w:styles>

</xml_diff>

<commit_message>
Update sprint retrospective file
Added my information onto the sprint retrospective file.
Also, added ai convos.
</commit_message>
<xml_diff>
--- a/sprints/sprint1/Sprint Retrospective/Sprint Retrospective Report.docx
+++ b/sprints/sprint1/Sprint Retrospective/Sprint Retrospective Report.docx
@@ -755,7 +755,11 @@
           <w:tcPr>
             <w:tcW w:w="2316" w:type="dxa"/>
           </w:tcPr>
-          <w:p/>
+          <w:p>
+            <w:r>
+              <w:t>Didn’t get into creating meal items.</w:t>
+            </w:r>
+          </w:p>
         </w:tc>
       </w:tr>
       <w:tr>
@@ -811,11 +815,11 @@
           </w:tcPr>
           <w:p>
             <w:r>
-              <w:t xml:space="preserve">There are some back-end methods that can be used to implement this but there is no UI </w:t>
+              <w:t xml:space="preserve">There are some back-end methods that can be used to implement </w:t>
             </w:r>
             <w:r>
               <w:lastRenderedPageBreak/>
-              <w:t>page to do the changes.</w:t>
+              <w:t>this but there is no UI page to do the changes.</w:t>
             </w:r>
           </w:p>
         </w:tc>
@@ -1412,6 +1416,7 @@
               </w:rPr>
               <w:t xml:space="preserve">I've updated the product backlog, sprint backlog, and Planning meeting notes in the repo so that is all current after </w:t>
             </w:r>
+            <w:proofErr w:type="spellStart"/>
             <w:proofErr w:type="gramStart"/>
             <w:r>
               <w:rPr>
@@ -1423,6 +1428,7 @@
               </w:rPr>
               <w:t>todays</w:t>
             </w:r>
+            <w:proofErr w:type="spellEnd"/>
             <w:proofErr w:type="gramEnd"/>
             <w:r>
               <w:rPr>
@@ -1773,10 +1779,15 @@
           </w:tcPr>
           <w:p>
             <w:r>
-              <w:t xml:space="preserve">Commit 79de575, 3/6 @9:00 PM: </w:t>
-            </w:r>
-            <w:r>
-              <w:t>Add Dashboard tests, delete sample data, applied checkstyle to Dashboard</w:t>
+              <w:t xml:space="preserve">Commit 79de575, 3/6 @9:00 PM: Add Dashboard tests, delete sample data, applied </w:t>
+            </w:r>
+            <w:proofErr w:type="spellStart"/>
+            <w:r>
+              <w:t>checkstyle</w:t>
+            </w:r>
+            <w:proofErr w:type="spellEnd"/>
+            <w:r>
+              <w:t xml:space="preserve"> to Dashboard</w:t>
             </w:r>
           </w:p>
           <w:p>
@@ -1827,13 +1838,36 @@
           <w:tcPr>
             <w:tcW w:w="1615" w:type="dxa"/>
           </w:tcPr>
-          <w:p/>
+          <w:p>
+            <w:r>
+              <w:t>Yeni Almanza</w:t>
+            </w:r>
+          </w:p>
         </w:tc>
         <w:tc>
           <w:tcPr>
             <w:tcW w:w="7735" w:type="dxa"/>
           </w:tcPr>
-          <w:p/>
+          <w:p>
+            <w:r>
+              <w:t>commit 793693ed70665b0b283ae0c9703e0fcbdbf5671c</w:t>
+            </w:r>
+          </w:p>
+          <w:p>
+            <w:r>
+              <w:t>Date:   Wed Feb 25 16:30:57 2026 -0500</w:t>
+            </w:r>
+          </w:p>
+          <w:p>
+            <w:r>
+              <w:t xml:space="preserve">    Create search page and add ingredients</w:t>
+            </w:r>
+          </w:p>
+          <w:p>
+            <w:r>
+              <w:t xml:space="preserve">    Add search page so ingredients/foods can be added to a list</w:t>
+            </w:r>
+          </w:p>
         </w:tc>
       </w:tr>
       <w:tr>
@@ -1841,13 +1875,54 @@
           <w:tcPr>
             <w:tcW w:w="1615" w:type="dxa"/>
           </w:tcPr>
-          <w:p/>
+          <w:p>
+            <w:r>
+              <w:t>Yeni Almanza</w:t>
+            </w:r>
+          </w:p>
         </w:tc>
         <w:tc>
           <w:tcPr>
             <w:tcW w:w="7735" w:type="dxa"/>
           </w:tcPr>
-          <w:p/>
+          <w:p>
+            <w:r>
+              <w:t>commit ff2cb3819a722ddbd818b63887541fa5845290d7</w:t>
+            </w:r>
+          </w:p>
+          <w:p>
+            <w:r>
+              <w:t>Merge: 5b4f1f4 959a4b0</w:t>
+            </w:r>
+          </w:p>
+          <w:p>
+            <w:r>
+              <w:t>Date:   Wed Mar 4 15:46:05 2026 -0500</w:t>
+            </w:r>
+          </w:p>
+          <w:p>
+            <w:r>
+              <w:t xml:space="preserve">    Merge pull request #13 from </w:t>
+            </w:r>
+            <w:proofErr w:type="spellStart"/>
+            <w:r>
+              <w:t>almanzayeni</w:t>
+            </w:r>
+            <w:proofErr w:type="spellEnd"/>
+            <w:r>
+              <w:t>/</w:t>
+            </w:r>
+            <w:proofErr w:type="spellStart"/>
+            <w:r>
+              <w:t>featureCreateFoodItem</w:t>
+            </w:r>
+            <w:proofErr w:type="spellEnd"/>
+          </w:p>
+          <w:p>
+            <w:r>
+              <w:t xml:space="preserve">    Updated Documentation and Naming</w:t>
+            </w:r>
+          </w:p>
         </w:tc>
       </w:tr>
       <w:tr>
@@ -2019,7 +2094,23 @@
                 <w:rFonts w:ascii="Calibri" w:hAnsi="Calibri" w:cs="Calibri"/>
                 <w:color w:val="000000"/>
               </w:rPr>
-              <w:t>Communication Protecol for authorization process</w:t>
+              <w:t xml:space="preserve">Communication </w:t>
+            </w:r>
+            <w:proofErr w:type="spellStart"/>
+            <w:r>
+              <w:rPr>
+                <w:rFonts w:ascii="Calibri" w:hAnsi="Calibri" w:cs="Calibri"/>
+                <w:color w:val="000000"/>
+              </w:rPr>
+              <w:t>Protecol</w:t>
+            </w:r>
+            <w:proofErr w:type="spellEnd"/>
+            <w:r>
+              <w:rPr>
+                <w:rFonts w:ascii="Calibri" w:hAnsi="Calibri" w:cs="Calibri"/>
+                <w:color w:val="000000"/>
+              </w:rPr>
+              <w:t xml:space="preserve"> for authorization process</w:t>
             </w:r>
           </w:p>
         </w:tc>
@@ -2301,8 +2392,17 @@
                 <w:rFonts w:ascii="Calibri" w:hAnsi="Calibri" w:cs="Calibri"/>
                 <w:color w:val="000000"/>
               </w:rPr>
-              <w:t>Login Page Codebehind</w:t>
-            </w:r>
+              <w:t xml:space="preserve">Login Page </w:t>
+            </w:r>
+            <w:proofErr w:type="spellStart"/>
+            <w:r>
+              <w:rPr>
+                <w:rFonts w:ascii="Calibri" w:hAnsi="Calibri" w:cs="Calibri"/>
+                <w:color w:val="000000"/>
+              </w:rPr>
+              <w:t>Codebehind</w:t>
+            </w:r>
+            <w:proofErr w:type="spellEnd"/>
           </w:p>
         </w:tc>
         <w:tc>
@@ -2348,7 +2448,23 @@
                 <w:rFonts w:ascii="Calibri" w:hAnsi="Calibri" w:cs="Calibri"/>
                 <w:color w:val="000000"/>
               </w:rPr>
-              <w:t>Communication Protecol for Create Account</w:t>
+              <w:t xml:space="preserve">Communication </w:t>
+            </w:r>
+            <w:proofErr w:type="spellStart"/>
+            <w:r>
+              <w:rPr>
+                <w:rFonts w:ascii="Calibri" w:hAnsi="Calibri" w:cs="Calibri"/>
+                <w:color w:val="000000"/>
+              </w:rPr>
+              <w:t>Protecol</w:t>
+            </w:r>
+            <w:proofErr w:type="spellEnd"/>
+            <w:r>
+              <w:rPr>
+                <w:rFonts w:ascii="Calibri" w:hAnsi="Calibri" w:cs="Calibri"/>
+                <w:color w:val="000000"/>
+              </w:rPr>
+              <w:t xml:space="preserve"> for Create Account</w:t>
             </w:r>
           </w:p>
         </w:tc>
@@ -2677,7 +2793,23 @@
                 <w:rFonts w:ascii="Calibri" w:hAnsi="Calibri" w:cs="Calibri"/>
                 <w:color w:val="000000"/>
               </w:rPr>
-              <w:t>Communication Protecol for Create Food</w:t>
+              <w:t xml:space="preserve">Communication </w:t>
+            </w:r>
+            <w:proofErr w:type="spellStart"/>
+            <w:r>
+              <w:rPr>
+                <w:rFonts w:ascii="Calibri" w:hAnsi="Calibri" w:cs="Calibri"/>
+                <w:color w:val="000000"/>
+              </w:rPr>
+              <w:t>Protecol</w:t>
+            </w:r>
+            <w:proofErr w:type="spellEnd"/>
+            <w:r>
+              <w:rPr>
+                <w:rFonts w:ascii="Calibri" w:hAnsi="Calibri" w:cs="Calibri"/>
+                <w:color w:val="000000"/>
+              </w:rPr>
+              <w:t xml:space="preserve"> for Create Food</w:t>
             </w:r>
           </w:p>
         </w:tc>
@@ -2803,6 +2935,7 @@
                 <w:rFonts w:ascii="Calibri" w:hAnsi="Calibri" w:cs="Calibri"/>
                 <w:color w:val="000000"/>
               </w:rPr>
+              <w:lastRenderedPageBreak/>
               <w:t>4.1</w:t>
             </w:r>
           </w:p>
@@ -2818,7 +2951,23 @@
                 <w:rFonts w:ascii="Calibri" w:hAnsi="Calibri" w:cs="Calibri"/>
                 <w:color w:val="000000"/>
               </w:rPr>
-              <w:t>Communication Protecol for Search</w:t>
+              <w:t xml:space="preserve">Communication </w:t>
+            </w:r>
+            <w:proofErr w:type="spellStart"/>
+            <w:r>
+              <w:rPr>
+                <w:rFonts w:ascii="Calibri" w:hAnsi="Calibri" w:cs="Calibri"/>
+                <w:color w:val="000000"/>
+              </w:rPr>
+              <w:t>Protecol</w:t>
+            </w:r>
+            <w:proofErr w:type="spellEnd"/>
+            <w:r>
+              <w:rPr>
+                <w:rFonts w:ascii="Calibri" w:hAnsi="Calibri" w:cs="Calibri"/>
+                <w:color w:val="000000"/>
+              </w:rPr>
+              <w:t xml:space="preserve"> for Search</w:t>
             </w:r>
           </w:p>
         </w:tc>
@@ -2865,8 +3014,33 @@
                 <w:rFonts w:ascii="Calibri" w:hAnsi="Calibri" w:cs="Calibri"/>
                 <w:color w:val="000000"/>
               </w:rPr>
-              <w:t>Communication Protecol for Update DayOfFood</w:t>
-            </w:r>
+              <w:t xml:space="preserve">Communication </w:t>
+            </w:r>
+            <w:proofErr w:type="spellStart"/>
+            <w:r>
+              <w:rPr>
+                <w:rFonts w:ascii="Calibri" w:hAnsi="Calibri" w:cs="Calibri"/>
+                <w:color w:val="000000"/>
+              </w:rPr>
+              <w:t>Protecol</w:t>
+            </w:r>
+            <w:proofErr w:type="spellEnd"/>
+            <w:r>
+              <w:rPr>
+                <w:rFonts w:ascii="Calibri" w:hAnsi="Calibri" w:cs="Calibri"/>
+                <w:color w:val="000000"/>
+              </w:rPr>
+              <w:t xml:space="preserve"> for Update </w:t>
+            </w:r>
+            <w:proofErr w:type="spellStart"/>
+            <w:r>
+              <w:rPr>
+                <w:rFonts w:ascii="Calibri" w:hAnsi="Calibri" w:cs="Calibri"/>
+                <w:color w:val="000000"/>
+              </w:rPr>
+              <w:t>DayOfFood</w:t>
+            </w:r>
+            <w:proofErr w:type="spellEnd"/>
           </w:p>
         </w:tc>
         <w:tc>
@@ -2907,12 +3081,21 @@
             <w:vAlign w:val="bottom"/>
           </w:tcPr>
           <w:p>
-            <w:r>
-              <w:rPr>
-                <w:rFonts w:ascii="Calibri" w:hAnsi="Calibri" w:cs="Calibri"/>
-                <w:color w:val="000000"/>
-              </w:rPr>
-              <w:t>DayOfFood Structure</w:t>
+            <w:proofErr w:type="spellStart"/>
+            <w:r>
+              <w:rPr>
+                <w:rFonts w:ascii="Calibri" w:hAnsi="Calibri" w:cs="Calibri"/>
+                <w:color w:val="000000"/>
+              </w:rPr>
+              <w:t>DayOfFood</w:t>
+            </w:r>
+            <w:proofErr w:type="spellEnd"/>
+            <w:r>
+              <w:rPr>
+                <w:rFonts w:ascii="Calibri" w:hAnsi="Calibri" w:cs="Calibri"/>
+                <w:color w:val="000000"/>
+              </w:rPr>
+              <w:t xml:space="preserve"> Structure</w:t>
             </w:r>
           </w:p>
         </w:tc>
@@ -3132,7 +3315,6 @@
                 <w:rFonts w:ascii="Calibri" w:hAnsi="Calibri" w:cs="Calibri"/>
                 <w:color w:val="000000"/>
               </w:rPr>
-              <w:lastRenderedPageBreak/>
               <w:t>4.2</w:t>
             </w:r>
           </w:p>
@@ -3195,7 +3377,23 @@
                 <w:rFonts w:ascii="Calibri" w:hAnsi="Calibri" w:cs="Calibri"/>
                 <w:color w:val="000000"/>
               </w:rPr>
-              <w:t>Update DayOfFood Process Client Side</w:t>
+              <w:t xml:space="preserve">Update </w:t>
+            </w:r>
+            <w:proofErr w:type="spellStart"/>
+            <w:r>
+              <w:rPr>
+                <w:rFonts w:ascii="Calibri" w:hAnsi="Calibri" w:cs="Calibri"/>
+                <w:color w:val="000000"/>
+              </w:rPr>
+              <w:t>DayOfFood</w:t>
+            </w:r>
+            <w:proofErr w:type="spellEnd"/>
+            <w:r>
+              <w:rPr>
+                <w:rFonts w:ascii="Calibri" w:hAnsi="Calibri" w:cs="Calibri"/>
+                <w:color w:val="000000"/>
+              </w:rPr>
+              <w:t xml:space="preserve"> Process Client Side</w:t>
             </w:r>
           </w:p>
         </w:tc>
@@ -3242,7 +3440,23 @@
                 <w:rFonts w:ascii="Calibri" w:hAnsi="Calibri" w:cs="Calibri"/>
                 <w:color w:val="000000"/>
               </w:rPr>
-              <w:t>Update DayOfFood Process Server Side</w:t>
+              <w:t xml:space="preserve">Update </w:t>
+            </w:r>
+            <w:proofErr w:type="spellStart"/>
+            <w:r>
+              <w:rPr>
+                <w:rFonts w:ascii="Calibri" w:hAnsi="Calibri" w:cs="Calibri"/>
+                <w:color w:val="000000"/>
+              </w:rPr>
+              <w:t>DayOfFood</w:t>
+            </w:r>
+            <w:proofErr w:type="spellEnd"/>
+            <w:r>
+              <w:rPr>
+                <w:rFonts w:ascii="Calibri" w:hAnsi="Calibri" w:cs="Calibri"/>
+                <w:color w:val="000000"/>
+              </w:rPr>
+              <w:t xml:space="preserve"> Process Server Side</w:t>
             </w:r>
           </w:p>
         </w:tc>
@@ -3289,7 +3503,23 @@
                 <w:rFonts w:ascii="Calibri" w:hAnsi="Calibri" w:cs="Calibri"/>
                 <w:color w:val="000000"/>
               </w:rPr>
-              <w:t>Communication Protecol for Update Diet</w:t>
+              <w:t xml:space="preserve">Communication </w:t>
+            </w:r>
+            <w:proofErr w:type="spellStart"/>
+            <w:r>
+              <w:rPr>
+                <w:rFonts w:ascii="Calibri" w:hAnsi="Calibri" w:cs="Calibri"/>
+                <w:color w:val="000000"/>
+              </w:rPr>
+              <w:t>Protecol</w:t>
+            </w:r>
+            <w:proofErr w:type="spellEnd"/>
+            <w:r>
+              <w:rPr>
+                <w:rFonts w:ascii="Calibri" w:hAnsi="Calibri" w:cs="Calibri"/>
+                <w:color w:val="000000"/>
+              </w:rPr>
+              <w:t xml:space="preserve"> for Update Diet</w:t>
             </w:r>
           </w:p>
         </w:tc>
@@ -3524,8 +3754,17 @@
                 <w:rFonts w:ascii="Calibri" w:hAnsi="Calibri" w:cs="Calibri"/>
                 <w:color w:val="000000"/>
               </w:rPr>
-              <w:t>Edit Diet Codebehind</w:t>
-            </w:r>
+              <w:t xml:space="preserve">Edit Diet </w:t>
+            </w:r>
+            <w:proofErr w:type="spellStart"/>
+            <w:r>
+              <w:rPr>
+                <w:rFonts w:ascii="Calibri" w:hAnsi="Calibri" w:cs="Calibri"/>
+                <w:color w:val="000000"/>
+              </w:rPr>
+              <w:t>Codebehind</w:t>
+            </w:r>
+            <w:proofErr w:type="spellEnd"/>
           </w:p>
         </w:tc>
         <w:tc>
@@ -3821,7 +4060,23 @@
           <w:b/>
           <w:bCs/>
         </w:rPr>
-        <w:t>JS - IOException Testing ChatGPT Session</w:t>
+        <w:t xml:space="preserve">JS - </w:t>
+      </w:r>
+      <w:proofErr w:type="spellStart"/>
+      <w:r>
+        <w:rPr>
+          <w:b/>
+          <w:bCs/>
+        </w:rPr>
+        <w:t>IOException</w:t>
+      </w:r>
+      <w:proofErr w:type="spellEnd"/>
+      <w:r>
+        <w:rPr>
+          <w:b/>
+          <w:bCs/>
+        </w:rPr>
+        <w:t xml:space="preserve"> Testing ChatGPT Session</w:t>
       </w:r>
     </w:p>
     <w:p>
@@ -3841,7 +4096,23 @@
           <w:b/>
           <w:bCs/>
         </w:rPr>
-        <w:t>Help with how to setup a test case to force an IOExeption to be thrown to reach 100% code coverage.</w:t>
+        <w:t xml:space="preserve">Help with how to setup a test case to force an </w:t>
+      </w:r>
+      <w:proofErr w:type="spellStart"/>
+      <w:r>
+        <w:rPr>
+          <w:b/>
+          <w:bCs/>
+        </w:rPr>
+        <w:t>IOExeption</w:t>
+      </w:r>
+      <w:proofErr w:type="spellEnd"/>
+      <w:r>
+        <w:rPr>
+          <w:b/>
+          <w:bCs/>
+        </w:rPr>
+        <w:t xml:space="preserve"> to be thrown to reach 100% code coverage.</w:t>
       </w:r>
     </w:p>
     <w:p>
@@ -3889,6 +4160,7 @@
           <w:b/>
           <w:bCs/>
         </w:rPr>
+        <w:lastRenderedPageBreak/>
         <w:t>Justin Smith</w:t>
       </w:r>
     </w:p>
@@ -3909,7 +4181,23 @@
           <w:b/>
           <w:bCs/>
         </w:rPr>
-        <w:t>JS - CompositeFood Error Review ChatGPT Session</w:t>
+        <w:t xml:space="preserve">JS - </w:t>
+      </w:r>
+      <w:proofErr w:type="spellStart"/>
+      <w:r>
+        <w:rPr>
+          <w:b/>
+          <w:bCs/>
+        </w:rPr>
+        <w:t>CompositeFood</w:t>
+      </w:r>
+      <w:proofErr w:type="spellEnd"/>
+      <w:r>
+        <w:rPr>
+          <w:b/>
+          <w:bCs/>
+        </w:rPr>
+        <w:t xml:space="preserve"> Error Review ChatGPT Session</w:t>
       </w:r>
       <w:r>
         <w:rPr>
@@ -3923,7 +4211,23 @@
           <w:b/>
           <w:bCs/>
         </w:rPr>
-        <w:t>JS - CompositeFood Error Review Continued ChatGPT Session</w:t>
+        <w:t xml:space="preserve">JS - </w:t>
+      </w:r>
+      <w:proofErr w:type="spellStart"/>
+      <w:r>
+        <w:rPr>
+          <w:b/>
+          <w:bCs/>
+        </w:rPr>
+        <w:t>CompositeFood</w:t>
+      </w:r>
+      <w:proofErr w:type="spellEnd"/>
+      <w:r>
+        <w:rPr>
+          <w:b/>
+          <w:bCs/>
+        </w:rPr>
+        <w:t xml:space="preserve"> Error Review Continued ChatGPT Session</w:t>
       </w:r>
     </w:p>
     <w:p>
@@ -3943,7 +4247,23 @@
           <w:b/>
           <w:bCs/>
         </w:rPr>
-        <w:t xml:space="preserve">Help with figuring out how to fix errors with reading and writing to Json files using ObjectMapper. </w:t>
+        <w:t xml:space="preserve">Help with figuring out how to fix errors with reading and writing to Json files using </w:t>
+      </w:r>
+      <w:proofErr w:type="spellStart"/>
+      <w:r>
+        <w:rPr>
+          <w:b/>
+          <w:bCs/>
+        </w:rPr>
+        <w:t>ObjectMapper</w:t>
+      </w:r>
+      <w:proofErr w:type="spellEnd"/>
+      <w:r>
+        <w:rPr>
+          <w:b/>
+          <w:bCs/>
+        </w:rPr>
+        <w:t xml:space="preserve">. </w:t>
       </w:r>
       <w:proofErr w:type="gramStart"/>
       <w:r>
@@ -3959,8 +4279,33 @@
           <w:b/>
           <w:bCs/>
         </w:rPr>
-        <w:t xml:space="preserve"> with writing test cases for testing the createCompositeFood method in CreateCompositeFoodPageViewModel</w:t>
-      </w:r>
+        <w:t xml:space="preserve"> with writing test cases for testing the </w:t>
+      </w:r>
+      <w:proofErr w:type="spellStart"/>
+      <w:r>
+        <w:rPr>
+          <w:b/>
+          <w:bCs/>
+        </w:rPr>
+        <w:t>createCompositeFood</w:t>
+      </w:r>
+      <w:proofErr w:type="spellEnd"/>
+      <w:r>
+        <w:rPr>
+          <w:b/>
+          <w:bCs/>
+        </w:rPr>
+        <w:t xml:space="preserve"> method in </w:t>
+      </w:r>
+      <w:proofErr w:type="spellStart"/>
+      <w:r>
+        <w:rPr>
+          <w:b/>
+          <w:bCs/>
+        </w:rPr>
+        <w:t>CreateCompositeFoodPageViewModel</w:t>
+      </w:r>
+      <w:proofErr w:type="spellEnd"/>
     </w:p>
     <w:p>
       <w:pPr>
@@ -3984,6 +4329,14 @@
     </w:p>
     <w:p>
       <w:pPr>
+        <w:rPr>
+          <w:b/>
+          <w:bCs/>
+        </w:rPr>
+      </w:pPr>
+    </w:p>
+    <w:p>
+      <w:pPr>
         <w:pStyle w:val="ListParagraph"/>
         <w:numPr>
           <w:ilvl w:val="0"/>
@@ -3999,8 +4352,7 @@
           <w:b/>
           <w:bCs/>
         </w:rPr>
-        <w:lastRenderedPageBreak/>
-        <w:t>Victor Filpo</w:t>
+        <w:t>Justin Smith</w:t>
       </w:r>
     </w:p>
     <w:p>
@@ -4020,7 +4372,7 @@
           <w:b/>
           <w:bCs/>
         </w:rPr>
-        <w:t>VF - Test_Guidance_ChatGPT</w:t>
+        <w:t>JS - Json Testing Error Fix ChatGPT Session</w:t>
       </w:r>
     </w:p>
     <w:p>
@@ -4040,14 +4392,7 @@
           <w:b/>
           <w:bCs/>
         </w:rPr>
-        <w:t>Guidance on best practice for organizing test cases when writing tests</w:t>
-      </w:r>
-      <w:r>
-        <w:rPr>
-          <w:b/>
-          <w:bCs/>
-        </w:rPr>
-        <w:t>. Explanation on a code snippet from a team member.</w:t>
+        <w:t>Got help with how to fix issues with how Json exceptions can be thrown to be handled higher up.</w:t>
       </w:r>
     </w:p>
     <w:p>
@@ -4063,10 +4408,11 @@
         </w:rPr>
       </w:pPr>
       <w:r>
-        <w:t xml:space="preserve">Commit </w:t>
-      </w:r>
-      <w:r>
-        <w:t>79de575cfcaf0163c7682478f3a12942dc10482e</w:t>
+        <w:rPr>
+          <w:b/>
+          <w:bCs/>
+        </w:rPr>
+        <w:t>commit abc930ed6c0fa57a85397286c06141e3cfcff750</w:t>
       </w:r>
     </w:p>
     <w:p>
@@ -4082,7 +4428,7 @@
         <w:pStyle w:val="ListParagraph"/>
         <w:numPr>
           <w:ilvl w:val="0"/>
-          <w:numId w:val="7"/>
+          <w:numId w:val="11"/>
         </w:numPr>
         <w:rPr>
           <w:b/>
@@ -4094,7 +4440,7 @@
           <w:b/>
           <w:bCs/>
         </w:rPr>
-        <w:t>Justin Smith</w:t>
+        <w:t>Victor Filpo</w:t>
       </w:r>
     </w:p>
     <w:p>
@@ -4102,7 +4448,7 @@
         <w:pStyle w:val="ListParagraph"/>
         <w:numPr>
           <w:ilvl w:val="0"/>
-          <w:numId w:val="7"/>
+          <w:numId w:val="11"/>
         </w:numPr>
         <w:rPr>
           <w:b/>
@@ -4114,15 +4460,24 @@
           <w:b/>
           <w:bCs/>
         </w:rPr>
-        <w:t>JS - Json Testing Error Fix ChatGPT Session</w:t>
-      </w:r>
+        <w:t xml:space="preserve">VF - </w:t>
+      </w:r>
+      <w:proofErr w:type="spellStart"/>
+      <w:r>
+        <w:rPr>
+          <w:b/>
+          <w:bCs/>
+        </w:rPr>
+        <w:t>Test_Guidance_ChatGPT</w:t>
+      </w:r>
+      <w:proofErr w:type="spellEnd"/>
     </w:p>
     <w:p>
       <w:pPr>
         <w:pStyle w:val="ListParagraph"/>
         <w:numPr>
           <w:ilvl w:val="0"/>
-          <w:numId w:val="7"/>
+          <w:numId w:val="11"/>
         </w:numPr>
         <w:rPr>
           <w:b/>
@@ -4134,7 +4489,7 @@
           <w:b/>
           <w:bCs/>
         </w:rPr>
-        <w:t>Got help with how to fix issues with how Json exceptions can be thrown to be handled higher up.</w:t>
+        <w:t>Guidance on best practice for organizing test cases when writing tests. Explanation on a code snippet from a team member.</w:t>
       </w:r>
     </w:p>
     <w:p>
@@ -4142,7 +4497,7 @@
         <w:pStyle w:val="ListParagraph"/>
         <w:numPr>
           <w:ilvl w:val="0"/>
-          <w:numId w:val="7"/>
+          <w:numId w:val="11"/>
         </w:numPr>
         <w:rPr>
           <w:b/>
@@ -4150,11 +4505,10 @@
         </w:rPr>
       </w:pPr>
       <w:r>
-        <w:rPr>
-          <w:b/>
-          <w:bCs/>
-        </w:rPr>
-        <w:t>commit abc930ed6c0fa57a85397286c06141e3cfcff750</w:t>
+        <w:t xml:space="preserve">Commit </w:t>
+      </w:r>
+      <w:r>
+        <w:t>79de575cfcaf0163c7682478f3a12942dc10482e</w:t>
       </w:r>
     </w:p>
     <w:p>
@@ -4197,8 +4551,292 @@
           <w:bCs/>
         </w:rPr>
       </w:pPr>
+      <w:r>
+        <w:rPr>
+          <w:b/>
+          <w:bCs/>
+        </w:rPr>
+        <w:t>YA</w:t>
+      </w:r>
+      <w:r>
+        <w:rPr>
+          <w:b/>
+          <w:bCs/>
+        </w:rPr>
+        <w:t>-FXML file issues</w:t>
+      </w:r>
     </w:p>
-    <w:p/>
+    <w:p>
+      <w:pPr>
+        <w:pStyle w:val="ListParagraph"/>
+        <w:numPr>
+          <w:ilvl w:val="0"/>
+          <w:numId w:val="9"/>
+        </w:numPr>
+        <w:rPr>
+          <w:b/>
+          <w:bCs/>
+        </w:rPr>
+      </w:pPr>
+      <w:r>
+        <w:rPr>
+          <w:b/>
+          <w:bCs/>
+        </w:rPr>
+        <w:t>Had and error but got help fixing the duplicated files</w:t>
+      </w:r>
+    </w:p>
+    <w:p>
+      <w:pPr>
+        <w:pStyle w:val="ListParagraph"/>
+        <w:numPr>
+          <w:ilvl w:val="0"/>
+          <w:numId w:val="9"/>
+        </w:numPr>
+        <w:rPr>
+          <w:b/>
+          <w:bCs/>
+        </w:rPr>
+      </w:pPr>
+      <w:r>
+        <w:rPr>
+          <w:b/>
+          <w:bCs/>
+        </w:rPr>
+        <w:t>commit 5c490b0c7334bb21cf5e782e3ebbfb793d17aa98</w:t>
+      </w:r>
+    </w:p>
+    <w:p>
+      <w:pPr>
+        <w:rPr>
+          <w:b/>
+          <w:bCs/>
+        </w:rPr>
+      </w:pPr>
+    </w:p>
+    <w:p>
+      <w:pPr>
+        <w:pStyle w:val="ListParagraph"/>
+        <w:numPr>
+          <w:ilvl w:val="0"/>
+          <w:numId w:val="10"/>
+        </w:numPr>
+        <w:rPr>
+          <w:b/>
+          <w:bCs/>
+        </w:rPr>
+      </w:pPr>
+      <w:r>
+        <w:rPr>
+          <w:b/>
+          <w:bCs/>
+        </w:rPr>
+        <w:t>Yeni Almanza</w:t>
+      </w:r>
+    </w:p>
+    <w:p>
+      <w:pPr>
+        <w:pStyle w:val="ListParagraph"/>
+        <w:numPr>
+          <w:ilvl w:val="0"/>
+          <w:numId w:val="10"/>
+        </w:numPr>
+        <w:rPr>
+          <w:b/>
+          <w:bCs/>
+        </w:rPr>
+      </w:pPr>
+      <w:r>
+        <w:rPr>
+          <w:b/>
+          <w:bCs/>
+        </w:rPr>
+        <w:t>YA- Javadoc documentation</w:t>
+      </w:r>
+    </w:p>
+    <w:p>
+      <w:pPr>
+        <w:pStyle w:val="ListParagraph"/>
+        <w:numPr>
+          <w:ilvl w:val="0"/>
+          <w:numId w:val="10"/>
+        </w:numPr>
+        <w:rPr>
+          <w:b/>
+          <w:bCs/>
+        </w:rPr>
+      </w:pPr>
+      <w:r>
+        <w:rPr>
+          <w:b/>
+          <w:bCs/>
+        </w:rPr>
+        <w:t>Helped me add documentation to class files</w:t>
+      </w:r>
+    </w:p>
+    <w:p>
+      <w:pPr>
+        <w:pStyle w:val="ListParagraph"/>
+        <w:numPr>
+          <w:ilvl w:val="0"/>
+          <w:numId w:val="10"/>
+        </w:numPr>
+        <w:rPr>
+          <w:b/>
+          <w:bCs/>
+        </w:rPr>
+      </w:pPr>
+      <w:r>
+        <w:rPr>
+          <w:b/>
+          <w:bCs/>
+        </w:rPr>
+        <w:t>commit 997f9e71972ea83fde847e59c5b4cc0d8b9c9220</w:t>
+      </w:r>
+    </w:p>
+    <w:p>
+      <w:pPr>
+        <w:rPr>
+          <w:b/>
+          <w:bCs/>
+        </w:rPr>
+      </w:pPr>
+    </w:p>
+    <w:p>
+      <w:pPr>
+        <w:pStyle w:val="ListParagraph"/>
+        <w:numPr>
+          <w:ilvl w:val="0"/>
+          <w:numId w:val="13"/>
+        </w:numPr>
+        <w:rPr>
+          <w:b/>
+          <w:bCs/>
+        </w:rPr>
+      </w:pPr>
+      <w:r>
+        <w:rPr>
+          <w:b/>
+          <w:bCs/>
+        </w:rPr>
+        <w:t>Yeni Almanza</w:t>
+      </w:r>
+    </w:p>
+    <w:p>
+      <w:pPr>
+        <w:pStyle w:val="ListParagraph"/>
+        <w:numPr>
+          <w:ilvl w:val="0"/>
+          <w:numId w:val="13"/>
+        </w:numPr>
+        <w:rPr>
+          <w:b/>
+          <w:bCs/>
+        </w:rPr>
+      </w:pPr>
+      <w:r>
+        <w:rPr>
+          <w:b/>
+          <w:bCs/>
+        </w:rPr>
+        <w:t xml:space="preserve">YA – </w:t>
+      </w:r>
+      <w:proofErr w:type="spellStart"/>
+      <w:r>
+        <w:rPr>
+          <w:b/>
+          <w:bCs/>
+        </w:rPr>
+        <w:t>CompositeFoodPage</w:t>
+      </w:r>
+      <w:proofErr w:type="spellEnd"/>
+      <w:r>
+        <w:rPr>
+          <w:b/>
+          <w:bCs/>
+        </w:rPr>
+        <w:t xml:space="preserve"> </w:t>
+      </w:r>
+      <w:proofErr w:type="spellStart"/>
+      <w:r>
+        <w:rPr>
+          <w:b/>
+          <w:bCs/>
+        </w:rPr>
+        <w:t>merhe</w:t>
+      </w:r>
+      <w:proofErr w:type="spellEnd"/>
+      <w:r>
+        <w:rPr>
+          <w:b/>
+          <w:bCs/>
+        </w:rPr>
+        <w:t xml:space="preserve"> error</w:t>
+      </w:r>
+    </w:p>
+    <w:p>
+      <w:pPr>
+        <w:pStyle w:val="ListParagraph"/>
+        <w:numPr>
+          <w:ilvl w:val="0"/>
+          <w:numId w:val="13"/>
+        </w:numPr>
+        <w:rPr>
+          <w:b/>
+          <w:bCs/>
+        </w:rPr>
+      </w:pPr>
+      <w:r>
+        <w:rPr>
+          <w:b/>
+          <w:bCs/>
+        </w:rPr>
+        <w:t>Helped me fix errors that occurred in</w:t>
+      </w:r>
+      <w:r>
+        <w:rPr>
+          <w:b/>
+          <w:bCs/>
+        </w:rPr>
+        <w:t xml:space="preserve"> the </w:t>
+      </w:r>
+      <w:proofErr w:type="spellStart"/>
+      <w:r>
+        <w:rPr>
+          <w:b/>
+          <w:bCs/>
+        </w:rPr>
+        <w:t>compositefoodpage</w:t>
+      </w:r>
+      <w:proofErr w:type="spellEnd"/>
+      <w:r>
+        <w:rPr>
+          <w:b/>
+          <w:bCs/>
+        </w:rPr>
+        <w:t xml:space="preserve"> class using teammates suggestions.</w:t>
+      </w:r>
+    </w:p>
+    <w:p>
+      <w:pPr>
+        <w:pStyle w:val="ListParagraph"/>
+        <w:numPr>
+          <w:ilvl w:val="0"/>
+          <w:numId w:val="13"/>
+        </w:numPr>
+        <w:rPr>
+          <w:b/>
+          <w:bCs/>
+        </w:rPr>
+      </w:pPr>
+      <w:r>
+        <w:rPr>
+          <w:b/>
+          <w:bCs/>
+        </w:rPr>
+        <w:t>commit 2c0eef5a61786ccd13bcead4755f50b16aea83b2</w:t>
+      </w:r>
+    </w:p>
     <w:sectPr>
       <w:pgSz w:w="12240" w:h="15840"/>
       <w:pgMar w:top="1440" w:right="1440" w:bottom="1440" w:left="1440" w:header="720" w:footer="720" w:gutter="0"/>
@@ -4212,6 +4850,95 @@
 <file path=word/numbering.xml><?xml version="1.0" encoding="utf-8"?>
 <w:numbering xmlns:wpc="http://schemas.microsoft.com/office/word/2010/wordprocessingCanvas" xmlns:cx="http://schemas.microsoft.com/office/drawing/2014/chartex" xmlns:cx1="http://schemas.microsoft.com/office/drawing/2015/9/8/chartex" xmlns:cx2="http://schemas.microsoft.com/office/drawing/2015/10/21/chartex" xmlns:cx3="http://schemas.microsoft.com/office/drawing/2016/5/9/chartex" xmlns:cx4="http://schemas.microsoft.com/office/drawing/2016/5/10/chartex" xmlns:cx5="http://schemas.microsoft.com/office/drawing/2016/5/11/chartex" xmlns:cx6="http://schemas.microsoft.com/office/drawing/2016/5/12/chartex" xmlns:cx7="http://schemas.microsoft.com/office/drawing/2016/5/13/chartex" xmlns:cx8="http://schemas.microsoft.com/office/drawing/2016/5/14/chartex" xmlns:mc="http://schemas.openxmlformats.org/markup-compatibility/2006" xmlns:aink="http://schemas.microsoft.com/office/drawing/2016/ink" xmlns:am3d="http://schemas.microsoft.com/office/drawing/2017/model3d" xmlns:o="urn:schemas-microsoft-com:office:office" xmlns:oel="http://schemas.microsoft.com/office/2019/extlst" xmlns:r="http://schemas.openxmlformats.org/officeDocument/2006/relationships" xmlns:m="http://schemas.openxmlformats.org/officeDocument/2006/math" xmlns:v="urn:schemas-microsoft-com:vml" xmlns:wp14="http://schemas.microsoft.com/office/word/2010/wordprocessingDrawing" xmlns:wp="http://schemas.openxmlformats.org/drawingml/2006/wordprocessingDrawing" xmlns:w10="urn:schemas-microsoft-com:office:word" xmlns:w="http://schemas.openxmlformats.org/wordprocessingml/2006/main" xmlns:w14="http://schemas.microsoft.com/office/word/2010/wordml" xmlns:w15="http://schemas.microsoft.com/office/word/2012/wordml" xmlns:w16cex="http://schemas.microsoft.com/office/word/2018/wordml/cex" xmlns:w16cid="http://schemas.microsoft.com/office/word/2016/wordml/cid" xmlns:w16="http://schemas.microsoft.com/office/word/2018/wordml" xmlns:w16du="http://schemas.microsoft.com/office/word/2023/wordml/word16du" xmlns:w16sdtdh="http://schemas.microsoft.com/office/word/2020/wordml/sdtdatahash" xmlns:w16sdtfl="http://schemas.microsoft.com/office/word/2024/wordml/sdtformatlock" xmlns:w16se="http://schemas.microsoft.com/office/word/2015/wordml/symex" xmlns:wpg="http://schemas.microsoft.com/office/word/2010/wordprocessingGroup" xmlns:wpi="http://schemas.microsoft.com/office/word/2010/wordprocessingInk" xmlns:wne="http://schemas.microsoft.com/office/word/2006/wordml" xmlns:wps="http://schemas.microsoft.com/office/word/2010/wordprocessingShape" mc:Ignorable="w14 w15 w16se w16cid w16 w16cex w16sdtdh w16sdtfl w16du wp14">
   <w:abstractNum w:abstractNumId="0" w15:restartNumberingAfterBreak="0">
+    <w:nsid w:val="0B3C2168"/>
+    <w:multiLevelType w:val="hybridMultilevel"/>
+    <w:tmpl w:val="638C8150"/>
+    <w:lvl w:ilvl="0" w:tplc="0409000F">
+      <w:start w:val="1"/>
+      <w:numFmt w:val="decimal"/>
+      <w:lvlText w:val="%1."/>
+      <w:lvlJc w:val="left"/>
+      <w:pPr>
+        <w:ind w:left="720" w:hanging="360"/>
+      </w:pPr>
+      <w:rPr>
+        <w:rFonts w:hint="default"/>
+      </w:rPr>
+    </w:lvl>
+    <w:lvl w:ilvl="1" w:tplc="04090019" w:tentative="1">
+      <w:start w:val="1"/>
+      <w:numFmt w:val="lowerLetter"/>
+      <w:lvlText w:val="%2."/>
+      <w:lvlJc w:val="left"/>
+      <w:pPr>
+        <w:ind w:left="1440" w:hanging="360"/>
+      </w:pPr>
+    </w:lvl>
+    <w:lvl w:ilvl="2" w:tplc="0409001B" w:tentative="1">
+      <w:start w:val="1"/>
+      <w:numFmt w:val="lowerRoman"/>
+      <w:lvlText w:val="%3."/>
+      <w:lvlJc w:val="right"/>
+      <w:pPr>
+        <w:ind w:left="2160" w:hanging="180"/>
+      </w:pPr>
+    </w:lvl>
+    <w:lvl w:ilvl="3" w:tplc="0409000F" w:tentative="1">
+      <w:start w:val="1"/>
+      <w:numFmt w:val="decimal"/>
+      <w:lvlText w:val="%4."/>
+      <w:lvlJc w:val="left"/>
+      <w:pPr>
+        <w:ind w:left="2880" w:hanging="360"/>
+      </w:pPr>
+    </w:lvl>
+    <w:lvl w:ilvl="4" w:tplc="04090019" w:tentative="1">
+      <w:start w:val="1"/>
+      <w:numFmt w:val="lowerLetter"/>
+      <w:lvlText w:val="%5."/>
+      <w:lvlJc w:val="left"/>
+      <w:pPr>
+        <w:ind w:left="3600" w:hanging="360"/>
+      </w:pPr>
+    </w:lvl>
+    <w:lvl w:ilvl="5" w:tplc="0409001B" w:tentative="1">
+      <w:start w:val="1"/>
+      <w:numFmt w:val="lowerRoman"/>
+      <w:lvlText w:val="%6."/>
+      <w:lvlJc w:val="right"/>
+      <w:pPr>
+        <w:ind w:left="4320" w:hanging="180"/>
+      </w:pPr>
+    </w:lvl>
+    <w:lvl w:ilvl="6" w:tplc="0409000F" w:tentative="1">
+      <w:start w:val="1"/>
+      <w:numFmt w:val="decimal"/>
+      <w:lvlText w:val="%7."/>
+      <w:lvlJc w:val="left"/>
+      <w:pPr>
+        <w:ind w:left="5040" w:hanging="360"/>
+      </w:pPr>
+    </w:lvl>
+    <w:lvl w:ilvl="7" w:tplc="04090019" w:tentative="1">
+      <w:start w:val="1"/>
+      <w:numFmt w:val="lowerLetter"/>
+      <w:lvlText w:val="%8."/>
+      <w:lvlJc w:val="left"/>
+      <w:pPr>
+        <w:ind w:left="5760" w:hanging="360"/>
+      </w:pPr>
+    </w:lvl>
+    <w:lvl w:ilvl="8" w:tplc="0409001B" w:tentative="1">
+      <w:start w:val="1"/>
+      <w:numFmt w:val="lowerRoman"/>
+      <w:lvlText w:val="%9."/>
+      <w:lvlJc w:val="right"/>
+      <w:pPr>
+        <w:ind w:left="6480" w:hanging="180"/>
+      </w:pPr>
+    </w:lvl>
+  </w:abstractNum>
+  <w:abstractNum w:abstractNumId="1" w15:restartNumberingAfterBreak="0">
     <w:nsid w:val="0BA7450D"/>
     <w:multiLevelType w:val="hybridMultilevel"/>
     <w:tmpl w:val="42345116"/>
@@ -4300,10 +5027,10 @@
       </w:pPr>
     </w:lvl>
   </w:abstractNum>
-  <w:abstractNum w:abstractNumId="1" w15:restartNumberingAfterBreak="0">
+  <w:abstractNum w:abstractNumId="2" w15:restartNumberingAfterBreak="0">
     <w:nsid w:val="110408B3"/>
     <w:multiLevelType w:val="hybridMultilevel"/>
-    <w:tmpl w:val="DD0EE0A2"/>
+    <w:tmpl w:val="6F5EFAB4"/>
     <w:lvl w:ilvl="0" w:tplc="0409000F">
       <w:start w:val="1"/>
       <w:numFmt w:val="decimal"/>
@@ -4389,7 +5116,96 @@
       </w:pPr>
     </w:lvl>
   </w:abstractNum>
-  <w:abstractNum w:abstractNumId="2" w15:restartNumberingAfterBreak="0">
+  <w:abstractNum w:abstractNumId="3" w15:restartNumberingAfterBreak="0">
+    <w:nsid w:val="15104A33"/>
+    <w:multiLevelType w:val="hybridMultilevel"/>
+    <w:tmpl w:val="EA0ECCAC"/>
+    <w:lvl w:ilvl="0" w:tplc="0409000F">
+      <w:start w:val="1"/>
+      <w:numFmt w:val="decimal"/>
+      <w:lvlText w:val="%1."/>
+      <w:lvlJc w:val="left"/>
+      <w:pPr>
+        <w:ind w:left="720" w:hanging="360"/>
+      </w:pPr>
+      <w:rPr>
+        <w:rFonts w:hint="default"/>
+      </w:rPr>
+    </w:lvl>
+    <w:lvl w:ilvl="1" w:tplc="04090019" w:tentative="1">
+      <w:start w:val="1"/>
+      <w:numFmt w:val="lowerLetter"/>
+      <w:lvlText w:val="%2."/>
+      <w:lvlJc w:val="left"/>
+      <w:pPr>
+        <w:ind w:left="1440" w:hanging="360"/>
+      </w:pPr>
+    </w:lvl>
+    <w:lvl w:ilvl="2" w:tplc="0409001B" w:tentative="1">
+      <w:start w:val="1"/>
+      <w:numFmt w:val="lowerRoman"/>
+      <w:lvlText w:val="%3."/>
+      <w:lvlJc w:val="right"/>
+      <w:pPr>
+        <w:ind w:left="2160" w:hanging="180"/>
+      </w:pPr>
+    </w:lvl>
+    <w:lvl w:ilvl="3" w:tplc="0409000F" w:tentative="1">
+      <w:start w:val="1"/>
+      <w:numFmt w:val="decimal"/>
+      <w:lvlText w:val="%4."/>
+      <w:lvlJc w:val="left"/>
+      <w:pPr>
+        <w:ind w:left="2880" w:hanging="360"/>
+      </w:pPr>
+    </w:lvl>
+    <w:lvl w:ilvl="4" w:tplc="04090019" w:tentative="1">
+      <w:start w:val="1"/>
+      <w:numFmt w:val="lowerLetter"/>
+      <w:lvlText w:val="%5."/>
+      <w:lvlJc w:val="left"/>
+      <w:pPr>
+        <w:ind w:left="3600" w:hanging="360"/>
+      </w:pPr>
+    </w:lvl>
+    <w:lvl w:ilvl="5" w:tplc="0409001B" w:tentative="1">
+      <w:start w:val="1"/>
+      <w:numFmt w:val="lowerRoman"/>
+      <w:lvlText w:val="%6."/>
+      <w:lvlJc w:val="right"/>
+      <w:pPr>
+        <w:ind w:left="4320" w:hanging="180"/>
+      </w:pPr>
+    </w:lvl>
+    <w:lvl w:ilvl="6" w:tplc="0409000F" w:tentative="1">
+      <w:start w:val="1"/>
+      <w:numFmt w:val="decimal"/>
+      <w:lvlText w:val="%7."/>
+      <w:lvlJc w:val="left"/>
+      <w:pPr>
+        <w:ind w:left="5040" w:hanging="360"/>
+      </w:pPr>
+    </w:lvl>
+    <w:lvl w:ilvl="7" w:tplc="04090019" w:tentative="1">
+      <w:start w:val="1"/>
+      <w:numFmt w:val="lowerLetter"/>
+      <w:lvlText w:val="%8."/>
+      <w:lvlJc w:val="left"/>
+      <w:pPr>
+        <w:ind w:left="5760" w:hanging="360"/>
+      </w:pPr>
+    </w:lvl>
+    <w:lvl w:ilvl="8" w:tplc="0409001B" w:tentative="1">
+      <w:start w:val="1"/>
+      <w:numFmt w:val="lowerRoman"/>
+      <w:lvlText w:val="%9."/>
+      <w:lvlJc w:val="right"/>
+      <w:pPr>
+        <w:ind w:left="6480" w:hanging="180"/>
+      </w:pPr>
+    </w:lvl>
+  </w:abstractNum>
+  <w:abstractNum w:abstractNumId="4" w15:restartNumberingAfterBreak="0">
     <w:nsid w:val="1AB00021"/>
     <w:multiLevelType w:val="hybridMultilevel"/>
     <w:tmpl w:val="C122E63A"/>
@@ -4478,7 +5294,7 @@
       </w:pPr>
     </w:lvl>
   </w:abstractNum>
-  <w:abstractNum w:abstractNumId="3" w15:restartNumberingAfterBreak="0">
+  <w:abstractNum w:abstractNumId="5" w15:restartNumberingAfterBreak="0">
     <w:nsid w:val="31275712"/>
     <w:multiLevelType w:val="hybridMultilevel"/>
     <w:tmpl w:val="10B44C06"/>
@@ -4567,7 +5383,96 @@
       </w:pPr>
     </w:lvl>
   </w:abstractNum>
-  <w:abstractNum w:abstractNumId="4" w15:restartNumberingAfterBreak="0">
+  <w:abstractNum w:abstractNumId="6" w15:restartNumberingAfterBreak="0">
+    <w:nsid w:val="31387211"/>
+    <w:multiLevelType w:val="hybridMultilevel"/>
+    <w:tmpl w:val="6F5EFAB4"/>
+    <w:lvl w:ilvl="0" w:tplc="FFFFFFFF">
+      <w:start w:val="1"/>
+      <w:numFmt w:val="decimal"/>
+      <w:lvlText w:val="%1."/>
+      <w:lvlJc w:val="left"/>
+      <w:pPr>
+        <w:ind w:left="720" w:hanging="360"/>
+      </w:pPr>
+      <w:rPr>
+        <w:rFonts w:hint="default"/>
+      </w:rPr>
+    </w:lvl>
+    <w:lvl w:ilvl="1" w:tplc="FFFFFFFF" w:tentative="1">
+      <w:start w:val="1"/>
+      <w:numFmt w:val="lowerLetter"/>
+      <w:lvlText w:val="%2."/>
+      <w:lvlJc w:val="left"/>
+      <w:pPr>
+        <w:ind w:left="1440" w:hanging="360"/>
+      </w:pPr>
+    </w:lvl>
+    <w:lvl w:ilvl="2" w:tplc="FFFFFFFF" w:tentative="1">
+      <w:start w:val="1"/>
+      <w:numFmt w:val="lowerRoman"/>
+      <w:lvlText w:val="%3."/>
+      <w:lvlJc w:val="right"/>
+      <w:pPr>
+        <w:ind w:left="2160" w:hanging="180"/>
+      </w:pPr>
+    </w:lvl>
+    <w:lvl w:ilvl="3" w:tplc="FFFFFFFF" w:tentative="1">
+      <w:start w:val="1"/>
+      <w:numFmt w:val="decimal"/>
+      <w:lvlText w:val="%4."/>
+      <w:lvlJc w:val="left"/>
+      <w:pPr>
+        <w:ind w:left="2880" w:hanging="360"/>
+      </w:pPr>
+    </w:lvl>
+    <w:lvl w:ilvl="4" w:tplc="FFFFFFFF" w:tentative="1">
+      <w:start w:val="1"/>
+      <w:numFmt w:val="lowerLetter"/>
+      <w:lvlText w:val="%5."/>
+      <w:lvlJc w:val="left"/>
+      <w:pPr>
+        <w:ind w:left="3600" w:hanging="360"/>
+      </w:pPr>
+    </w:lvl>
+    <w:lvl w:ilvl="5" w:tplc="FFFFFFFF" w:tentative="1">
+      <w:start w:val="1"/>
+      <w:numFmt w:val="lowerRoman"/>
+      <w:lvlText w:val="%6."/>
+      <w:lvlJc w:val="right"/>
+      <w:pPr>
+        <w:ind w:left="4320" w:hanging="180"/>
+      </w:pPr>
+    </w:lvl>
+    <w:lvl w:ilvl="6" w:tplc="FFFFFFFF" w:tentative="1">
+      <w:start w:val="1"/>
+      <w:numFmt w:val="decimal"/>
+      <w:lvlText w:val="%7."/>
+      <w:lvlJc w:val="left"/>
+      <w:pPr>
+        <w:ind w:left="5040" w:hanging="360"/>
+      </w:pPr>
+    </w:lvl>
+    <w:lvl w:ilvl="7" w:tplc="FFFFFFFF" w:tentative="1">
+      <w:start w:val="1"/>
+      <w:numFmt w:val="lowerLetter"/>
+      <w:lvlText w:val="%8."/>
+      <w:lvlJc w:val="left"/>
+      <w:pPr>
+        <w:ind w:left="5760" w:hanging="360"/>
+      </w:pPr>
+    </w:lvl>
+    <w:lvl w:ilvl="8" w:tplc="FFFFFFFF" w:tentative="1">
+      <w:start w:val="1"/>
+      <w:numFmt w:val="lowerRoman"/>
+      <w:lvlText w:val="%9."/>
+      <w:lvlJc w:val="right"/>
+      <w:pPr>
+        <w:ind w:left="6480" w:hanging="180"/>
+      </w:pPr>
+    </w:lvl>
+  </w:abstractNum>
+  <w:abstractNum w:abstractNumId="7" w15:restartNumberingAfterBreak="0">
     <w:nsid w:val="40F1172E"/>
     <w:multiLevelType w:val="hybridMultilevel"/>
     <w:tmpl w:val="ED30E1E8"/>
@@ -4680,7 +5585,96 @@
       </w:rPr>
     </w:lvl>
   </w:abstractNum>
-  <w:abstractNum w:abstractNumId="5" w15:restartNumberingAfterBreak="0">
+  <w:abstractNum w:abstractNumId="8" w15:restartNumberingAfterBreak="0">
+    <w:nsid w:val="569A1773"/>
+    <w:multiLevelType w:val="hybridMultilevel"/>
+    <w:tmpl w:val="8900659E"/>
+    <w:lvl w:ilvl="0" w:tplc="0409000F">
+      <w:start w:val="1"/>
+      <w:numFmt w:val="decimal"/>
+      <w:lvlText w:val="%1."/>
+      <w:lvlJc w:val="left"/>
+      <w:pPr>
+        <w:ind w:left="720" w:hanging="360"/>
+      </w:pPr>
+      <w:rPr>
+        <w:rFonts w:hint="default"/>
+      </w:rPr>
+    </w:lvl>
+    <w:lvl w:ilvl="1" w:tplc="04090019" w:tentative="1">
+      <w:start w:val="1"/>
+      <w:numFmt w:val="lowerLetter"/>
+      <w:lvlText w:val="%2."/>
+      <w:lvlJc w:val="left"/>
+      <w:pPr>
+        <w:ind w:left="1440" w:hanging="360"/>
+      </w:pPr>
+    </w:lvl>
+    <w:lvl w:ilvl="2" w:tplc="0409001B" w:tentative="1">
+      <w:start w:val="1"/>
+      <w:numFmt w:val="lowerRoman"/>
+      <w:lvlText w:val="%3."/>
+      <w:lvlJc w:val="right"/>
+      <w:pPr>
+        <w:ind w:left="2160" w:hanging="180"/>
+      </w:pPr>
+    </w:lvl>
+    <w:lvl w:ilvl="3" w:tplc="0409000F" w:tentative="1">
+      <w:start w:val="1"/>
+      <w:numFmt w:val="decimal"/>
+      <w:lvlText w:val="%4."/>
+      <w:lvlJc w:val="left"/>
+      <w:pPr>
+        <w:ind w:left="2880" w:hanging="360"/>
+      </w:pPr>
+    </w:lvl>
+    <w:lvl w:ilvl="4" w:tplc="04090019" w:tentative="1">
+      <w:start w:val="1"/>
+      <w:numFmt w:val="lowerLetter"/>
+      <w:lvlText w:val="%5."/>
+      <w:lvlJc w:val="left"/>
+      <w:pPr>
+        <w:ind w:left="3600" w:hanging="360"/>
+      </w:pPr>
+    </w:lvl>
+    <w:lvl w:ilvl="5" w:tplc="0409001B" w:tentative="1">
+      <w:start w:val="1"/>
+      <w:numFmt w:val="lowerRoman"/>
+      <w:lvlText w:val="%6."/>
+      <w:lvlJc w:val="right"/>
+      <w:pPr>
+        <w:ind w:left="4320" w:hanging="180"/>
+      </w:pPr>
+    </w:lvl>
+    <w:lvl w:ilvl="6" w:tplc="0409000F" w:tentative="1">
+      <w:start w:val="1"/>
+      <w:numFmt w:val="decimal"/>
+      <w:lvlText w:val="%7."/>
+      <w:lvlJc w:val="left"/>
+      <w:pPr>
+        <w:ind w:left="5040" w:hanging="360"/>
+      </w:pPr>
+    </w:lvl>
+    <w:lvl w:ilvl="7" w:tplc="04090019" w:tentative="1">
+      <w:start w:val="1"/>
+      <w:numFmt w:val="lowerLetter"/>
+      <w:lvlText w:val="%8."/>
+      <w:lvlJc w:val="left"/>
+      <w:pPr>
+        <w:ind w:left="5760" w:hanging="360"/>
+      </w:pPr>
+    </w:lvl>
+    <w:lvl w:ilvl="8" w:tplc="0409001B" w:tentative="1">
+      <w:start w:val="1"/>
+      <w:numFmt w:val="lowerRoman"/>
+      <w:lvlText w:val="%9."/>
+      <w:lvlJc w:val="right"/>
+      <w:pPr>
+        <w:ind w:left="6480" w:hanging="180"/>
+      </w:pPr>
+    </w:lvl>
+  </w:abstractNum>
+  <w:abstractNum w:abstractNumId="9" w15:restartNumberingAfterBreak="0">
     <w:nsid w:val="5BD5494F"/>
     <w:multiLevelType w:val="hybridMultilevel"/>
     <w:tmpl w:val="1DD6E0B2"/>
@@ -4793,7 +5787,7 @@
       </w:rPr>
     </w:lvl>
   </w:abstractNum>
-  <w:abstractNum w:abstractNumId="6" w15:restartNumberingAfterBreak="0">
+  <w:abstractNum w:abstractNumId="10" w15:restartNumberingAfterBreak="0">
     <w:nsid w:val="610829CD"/>
     <w:multiLevelType w:val="hybridMultilevel"/>
     <w:tmpl w:val="BC4A165C"/>
@@ -4882,7 +5876,7 @@
       </w:pPr>
     </w:lvl>
   </w:abstractNum>
-  <w:abstractNum w:abstractNumId="7" w15:restartNumberingAfterBreak="0">
+  <w:abstractNum w:abstractNumId="11" w15:restartNumberingAfterBreak="0">
     <w:nsid w:val="73490412"/>
     <w:multiLevelType w:val="hybridMultilevel"/>
     <w:tmpl w:val="C13246B0"/>
@@ -4968,7 +5962,7 @@
       </w:pPr>
     </w:lvl>
   </w:abstractNum>
-  <w:abstractNum w:abstractNumId="8" w15:restartNumberingAfterBreak="0">
+  <w:abstractNum w:abstractNumId="12" w15:restartNumberingAfterBreak="0">
     <w:nsid w:val="7BE017E7"/>
     <w:multiLevelType w:val="multilevel"/>
     <w:tmpl w:val="4754D4CA"/>
@@ -5118,31 +6112,43 @@
     </w:lvl>
   </w:abstractNum>
   <w:num w:numId="1" w16cid:durableId="421486266">
+    <w:abstractNumId w:val="9"/>
+  </w:num>
+  <w:num w:numId="2" w16cid:durableId="55861547">
+    <w:abstractNumId w:val="7"/>
+  </w:num>
+  <w:num w:numId="3" w16cid:durableId="513963672">
+    <w:abstractNumId w:val="11"/>
+  </w:num>
+  <w:num w:numId="4" w16cid:durableId="766660796">
     <w:abstractNumId w:val="5"/>
   </w:num>
-  <w:num w:numId="2" w16cid:durableId="55861547">
+  <w:num w:numId="5" w16cid:durableId="1505894614">
     <w:abstractNumId w:val="4"/>
   </w:num>
-  <w:num w:numId="3" w16cid:durableId="513963672">
-    <w:abstractNumId w:val="7"/>
+  <w:num w:numId="6" w16cid:durableId="1886478259">
+    <w:abstractNumId w:val="1"/>
   </w:num>
-  <w:num w:numId="4" w16cid:durableId="766660796">
+  <w:num w:numId="7" w16cid:durableId="125124417">
+    <w:abstractNumId w:val="2"/>
+  </w:num>
+  <w:num w:numId="8" w16cid:durableId="1994483951">
+    <w:abstractNumId w:val="12"/>
+  </w:num>
+  <w:num w:numId="9" w16cid:durableId="1247111804">
+    <w:abstractNumId w:val="10"/>
+  </w:num>
+  <w:num w:numId="10" w16cid:durableId="1346635420">
+    <w:abstractNumId w:val="8"/>
+  </w:num>
+  <w:num w:numId="11" w16cid:durableId="1089547286">
+    <w:abstractNumId w:val="6"/>
+  </w:num>
+  <w:num w:numId="12" w16cid:durableId="142046742">
     <w:abstractNumId w:val="3"/>
   </w:num>
-  <w:num w:numId="5" w16cid:durableId="1505894614">
-    <w:abstractNumId w:val="2"/>
-  </w:num>
-  <w:num w:numId="6" w16cid:durableId="1886478259">
+  <w:num w:numId="13" w16cid:durableId="524291847">
     <w:abstractNumId w:val="0"/>
-  </w:num>
-  <w:num w:numId="7" w16cid:durableId="125124417">
-    <w:abstractNumId w:val="1"/>
-  </w:num>
-  <w:num w:numId="8" w16cid:durableId="1994483951">
-    <w:abstractNumId w:val="8"/>
-  </w:num>
-  <w:num w:numId="9" w16cid:durableId="1247111804">
-    <w:abstractNumId w:val="6"/>
   </w:num>
 </w:numbering>
 </file>

</xml_diff>

<commit_message>
Added my contribution to the Sprint 1 Sprint Retrospective
</commit_message>
<xml_diff>
--- a/sprints/sprint1/Sprint Retrospective/Sprint Retrospective Report.docx
+++ b/sprints/sprint1/Sprint Retrospective/Sprint Retrospective Report.docx
@@ -193,23 +193,7 @@
                 <w:b/>
                 <w:bCs/>
               </w:rPr>
-              <w:t xml:space="preserve">Comments (e.g., reasons why </w:t>
-            </w:r>
-            <w:proofErr w:type="gramStart"/>
-            <w:r>
-              <w:rPr>
-                <w:b/>
-                <w:bCs/>
-              </w:rPr>
-              <w:t>feature is</w:t>
-            </w:r>
-            <w:proofErr w:type="gramEnd"/>
-            <w:r>
-              <w:rPr>
-                <w:b/>
-                <w:bCs/>
-              </w:rPr>
-              <w:t xml:space="preserve"> incomplete)</w:t>
+              <w:t>Comments (e.g., reasons why feature is incomplete)</w:t>
             </w:r>
           </w:p>
         </w:tc>
@@ -259,7 +243,11 @@
           <w:tcPr>
             <w:tcW w:w="2316" w:type="dxa"/>
           </w:tcPr>
-          <w:p/>
+          <w:p>
+            <w:r>
+              <w:t>I was not able to dedicate the time to this task due to external factors.</w:t>
+            </w:r>
+          </w:p>
         </w:tc>
       </w:tr>
       <w:tr>
@@ -299,7 +287,7 @@
           </w:tcPr>
           <w:p>
             <w:r>
-              <w:t>Not Started</w:t>
+              <w:t>Incomplete</w:t>
             </w:r>
           </w:p>
         </w:tc>
@@ -307,7 +295,11 @@
           <w:tcPr>
             <w:tcW w:w="2316" w:type="dxa"/>
           </w:tcPr>
-          <w:p/>
+          <w:p>
+            <w:r>
+              <w:t>I was not able to dedicate the time to this task due to external factors.</w:t>
+            </w:r>
+          </w:p>
         </w:tc>
       </w:tr>
       <w:tr>
@@ -468,10 +460,7 @@
           </w:tcPr>
           <w:p>
             <w:r>
-              <w:t xml:space="preserve">The page was made but </w:t>
-            </w:r>
-            <w:r>
-              <w:t>really had no functionality because it needed to be connected to the Create Account page which wasn’t completed</w:t>
+              <w:t>The page was made but really had no functionality because it needed to be connected to the Create Account page which wasn’t completed</w:t>
             </w:r>
           </w:p>
         </w:tc>
@@ -668,6 +657,7 @@
                 <w:rFonts w:ascii="Calibri" w:hAnsi="Calibri" w:cs="Calibri"/>
                 <w:color w:val="000000"/>
               </w:rPr>
+              <w:lastRenderedPageBreak/>
               <w:t>Search for a specific food item</w:t>
             </w:r>
           </w:p>
@@ -815,11 +805,7 @@
           </w:tcPr>
           <w:p>
             <w:r>
-              <w:t xml:space="preserve">There are some back-end methods that can be used to implement </w:t>
-            </w:r>
-            <w:r>
-              <w:lastRenderedPageBreak/>
-              <w:t>this but there is no UI page to do the changes.</w:t>
+              <w:t>There are some back-end methods that can be used to implement this but there is no UI page to do the changes.</w:t>
             </w:r>
           </w:p>
         </w:tc>
@@ -842,7 +828,6 @@
                 <w:rFonts w:ascii="Calibri" w:hAnsi="Calibri" w:cs="Calibri"/>
                 <w:color w:val="000000"/>
               </w:rPr>
-              <w:lastRenderedPageBreak/>
               <w:t>Edit a meal item</w:t>
             </w:r>
           </w:p>
@@ -932,15 +917,7 @@
           </w:tcPr>
           <w:p>
             <w:r>
-              <w:t xml:space="preserve">Couldn’t be started because there was no account page made </w:t>
-            </w:r>
-            <w:proofErr w:type="gramStart"/>
-            <w:r>
-              <w:t>in order to</w:t>
-            </w:r>
-            <w:proofErr w:type="gramEnd"/>
-            <w:r>
-              <w:t xml:space="preserve"> access this setting.</w:t>
+              <w:t>Couldn’t be started because there was no account page made in order to access this setting.</w:t>
             </w:r>
           </w:p>
         </w:tc>
@@ -1054,7 +1031,11 @@
           <w:tcPr>
             <w:tcW w:w="2316" w:type="dxa"/>
           </w:tcPr>
-          <w:p/>
+          <w:p>
+            <w:r>
+              <w:t>Did not properly set aside time, and ran out of time to finish implementation</w:t>
+            </w:r>
+          </w:p>
         </w:tc>
       </w:tr>
       <w:tr>
@@ -1201,21 +1182,8 @@
           <w:numId w:val="1"/>
         </w:numPr>
       </w:pPr>
-      <w:proofErr w:type="gramStart"/>
-      <w:r>
-        <w:t>A git</w:t>
-      </w:r>
-      <w:proofErr w:type="gramEnd"/>
-      <w:r>
-        <w:t xml:space="preserve"> </w:t>
-      </w:r>
-      <w:proofErr w:type="gramStart"/>
-      <w:r>
-        <w:t>commit</w:t>
-      </w:r>
-      <w:proofErr w:type="gramEnd"/>
-      <w:r>
-        <w:t xml:space="preserve"> message (please include the commit ID and date/time)</w:t>
+      <w:r>
+        <w:t>A git commit message (please include the commit ID and date/time)</w:t>
       </w:r>
     </w:p>
     <w:p>
@@ -1280,15 +1248,7 @@
         </w:numPr>
       </w:pPr>
       <w:r>
-        <w:t xml:space="preserve">providing </w:t>
-      </w:r>
-      <w:proofErr w:type="gramStart"/>
-      <w:r>
-        <w:t>detail</w:t>
-      </w:r>
-      <w:proofErr w:type="gramEnd"/>
-      <w:r>
-        <w:t xml:space="preserve"> as to how to reproduce a bug</w:t>
+        <w:t>providing detail as to how to reproduce a bug</w:t>
       </w:r>
     </w:p>
     <w:p>
@@ -1417,7 +1377,6 @@
               <w:t xml:space="preserve">I've updated the product backlog, sprint backlog, and Planning meeting notes in the repo so that is all current after </w:t>
             </w:r>
             <w:proofErr w:type="spellStart"/>
-            <w:proofErr w:type="gramStart"/>
             <w:r>
               <w:rPr>
                 <w:rFonts w:ascii="Segoe UI" w:eastAsia="Times New Roman" w:hAnsi="Segoe UI" w:cs="Segoe UI"/>
@@ -1429,7 +1388,6 @@
               <w:t>todays</w:t>
             </w:r>
             <w:proofErr w:type="spellEnd"/>
-            <w:proofErr w:type="gramEnd"/>
             <w:r>
               <w:rPr>
                 <w:rFonts w:ascii="Segoe UI" w:eastAsia="Times New Roman" w:hAnsi="Segoe UI" w:cs="Segoe UI"/>
@@ -1464,29 +1422,7 @@
                 <w:szCs w:val="21"/>
                 <w14:ligatures w14:val="none"/>
               </w:rPr>
-              <w:t xml:space="preserve">Everyone needs to do the task descriptions of their assigned stuff in the sprint backlog and estimate their hours. If anyone decides that they have too much or not enough to reach roughly 25 hours for the </w:t>
-            </w:r>
-            <w:proofErr w:type="gramStart"/>
-            <w:r>
-              <w:rPr>
-                <w:rFonts w:ascii="Segoe UI" w:eastAsia="Times New Roman" w:hAnsi="Segoe UI" w:cs="Segoe UI"/>
-                <w:kern w:val="0"/>
-                <w:sz w:val="21"/>
-                <w:szCs w:val="21"/>
-                <w14:ligatures w14:val="none"/>
-              </w:rPr>
-              <w:t>sprint</w:t>
-            </w:r>
-            <w:proofErr w:type="gramEnd"/>
-            <w:r>
-              <w:rPr>
-                <w:rFonts w:ascii="Segoe UI" w:eastAsia="Times New Roman" w:hAnsi="Segoe UI" w:cs="Segoe UI"/>
-                <w:kern w:val="0"/>
-                <w:sz w:val="21"/>
-                <w:szCs w:val="21"/>
-                <w14:ligatures w14:val="none"/>
-              </w:rPr>
-              <w:t xml:space="preserve"> please reach out so we can discuss reallocating stuff. </w:t>
+              <w:t>Everyone needs to do the task descriptions of their assigned stuff in the sprint backlog and estimate their hours. If anyone decides that they have too much or not enough to reach roughly 25 hours for the sprint please reach out so we can discuss reallocating stuff. </w:t>
             </w:r>
           </w:p>
           <w:p>
@@ -1512,6 +1448,7 @@
                 <w:szCs w:val="21"/>
                 <w14:ligatures w14:val="none"/>
               </w:rPr>
+              <w:lastRenderedPageBreak/>
               <w:t>Anyone who still had documents from the last meeting that needed to be updated or added to the repository please get those added.</w:t>
             </w:r>
           </w:p>
@@ -1556,7 +1493,6 @@
                 <w14:ligatures w14:val="none"/>
               </w:rPr>
             </w:pPr>
-            <w:proofErr w:type="gramStart"/>
             <w:r>
               <w:rPr>
                 <w:rFonts w:ascii="Segoe UI" w:eastAsia="Times New Roman" w:hAnsi="Segoe UI" w:cs="Segoe UI"/>
@@ -1565,10 +1501,12 @@
                 <w:szCs w:val="21"/>
                 <w14:ligatures w14:val="none"/>
               </w:rPr>
-              <w:t>Everyone</w:t>
-            </w:r>
-            <w:proofErr w:type="gramEnd"/>
-            <w:r>
+              <w:t>Everyone when you add new classes and things to the code make sure you add them to the class diagram and that they are fully tested.</w:t>
+            </w:r>
+          </w:p>
+          <w:p>
+            <w:pPr>
+              <w:spacing w:before="100" w:beforeAutospacing="1" w:after="100" w:afterAutospacing="1"/>
               <w:rPr>
                 <w:rFonts w:ascii="Segoe UI" w:eastAsia="Times New Roman" w:hAnsi="Segoe UI" w:cs="Segoe UI"/>
                 <w:kern w:val="0"/>
@@ -1576,9 +1514,7 @@
                 <w:szCs w:val="21"/>
                 <w14:ligatures w14:val="none"/>
               </w:rPr>
-              <w:t xml:space="preserve"> when you add new classes and things to the </w:t>
-            </w:r>
-            <w:proofErr w:type="gramStart"/>
+            </w:pPr>
             <w:r>
               <w:rPr>
                 <w:rFonts w:ascii="Segoe UI" w:eastAsia="Times New Roman" w:hAnsi="Segoe UI" w:cs="Segoe UI"/>
@@ -1587,63 +1523,7 @@
                 <w:szCs w:val="21"/>
                 <w14:ligatures w14:val="none"/>
               </w:rPr>
-              <w:t>code</w:t>
-            </w:r>
-            <w:proofErr w:type="gramEnd"/>
-            <w:r>
-              <w:rPr>
-                <w:rFonts w:ascii="Segoe UI" w:eastAsia="Times New Roman" w:hAnsi="Segoe UI" w:cs="Segoe UI"/>
-                <w:kern w:val="0"/>
-                <w:sz w:val="21"/>
-                <w:szCs w:val="21"/>
-                <w14:ligatures w14:val="none"/>
-              </w:rPr>
-              <w:t xml:space="preserve"> make sure you add them to the class diagram and that they are fully tested.</w:t>
-            </w:r>
-          </w:p>
-          <w:p>
-            <w:pPr>
-              <w:spacing w:before="100" w:beforeAutospacing="1" w:after="100" w:afterAutospacing="1"/>
-              <w:rPr>
-                <w:rFonts w:ascii="Segoe UI" w:eastAsia="Times New Roman" w:hAnsi="Segoe UI" w:cs="Segoe UI"/>
-                <w:kern w:val="0"/>
-                <w:sz w:val="21"/>
-                <w:szCs w:val="21"/>
-                <w14:ligatures w14:val="none"/>
-              </w:rPr>
-            </w:pPr>
-            <w:r>
-              <w:rPr>
-                <w:rFonts w:ascii="Segoe UI" w:eastAsia="Times New Roman" w:hAnsi="Segoe UI" w:cs="Segoe UI"/>
-                <w:kern w:val="0"/>
-                <w:sz w:val="21"/>
-                <w:szCs w:val="21"/>
-                <w14:ligatures w14:val="none"/>
-              </w:rPr>
-              <w:lastRenderedPageBreak/>
-              <w:t xml:space="preserve">Everyone </w:t>
-            </w:r>
-            <w:proofErr w:type="gramStart"/>
-            <w:r>
-              <w:rPr>
-                <w:rFonts w:ascii="Segoe UI" w:eastAsia="Times New Roman" w:hAnsi="Segoe UI" w:cs="Segoe UI"/>
-                <w:kern w:val="0"/>
-                <w:sz w:val="21"/>
-                <w:szCs w:val="21"/>
-                <w14:ligatures w14:val="none"/>
-              </w:rPr>
-              <w:t>have</w:t>
-            </w:r>
-            <w:proofErr w:type="gramEnd"/>
-            <w:r>
-              <w:rPr>
-                <w:rFonts w:ascii="Segoe UI" w:eastAsia="Times New Roman" w:hAnsi="Segoe UI" w:cs="Segoe UI"/>
-                <w:kern w:val="0"/>
-                <w:sz w:val="21"/>
-                <w:szCs w:val="21"/>
-                <w14:ligatures w14:val="none"/>
-              </w:rPr>
-              <w:t xml:space="preserve"> a good weekend! </w:t>
+              <w:t>Everyone have a good weekend! </w:t>
             </w:r>
           </w:p>
         </w:tc>
@@ -1666,23 +1546,7 @@
           </w:tcPr>
           <w:p>
             <w:r>
-              <w:t xml:space="preserve">Just to </w:t>
-            </w:r>
-            <w:proofErr w:type="gramStart"/>
-            <w:r>
-              <w:t>list off</w:t>
-            </w:r>
-            <w:proofErr w:type="gramEnd"/>
-            <w:r>
-              <w:t xml:space="preserve"> our </w:t>
-            </w:r>
-            <w:proofErr w:type="gramStart"/>
-            <w:r>
-              <w:t>follow up</w:t>
-            </w:r>
-            <w:proofErr w:type="gramEnd"/>
-            <w:r>
-              <w:t xml:space="preserve"> tasks from the meeting.</w:t>
+              <w:t>Just to list off our follow up tasks from the meeting.</w:t>
             </w:r>
           </w:p>
           <w:p>
@@ -1697,15 +1561,7 @@
           </w:p>
           <w:p>
             <w:r>
-              <w:t xml:space="preserve">Emi will </w:t>
-            </w:r>
-            <w:proofErr w:type="gramStart"/>
-            <w:r>
-              <w:t>mock up</w:t>
-            </w:r>
-            <w:proofErr w:type="gramEnd"/>
-            <w:r>
-              <w:t xml:space="preserve"> some Wireframes</w:t>
+              <w:t>Emi will mock up some Wireframes</w:t>
             </w:r>
           </w:p>
           <w:p>
@@ -1715,31 +1571,7 @@
           </w:p>
           <w:p>
             <w:r>
-              <w:t xml:space="preserve">I will also post the product </w:t>
-            </w:r>
-            <w:proofErr w:type="gramStart"/>
-            <w:r>
-              <w:t>back log</w:t>
-            </w:r>
-            <w:proofErr w:type="gramEnd"/>
-            <w:r>
-              <w:t xml:space="preserve"> and sprint backlog in the shared documents on the </w:t>
-            </w:r>
-            <w:proofErr w:type="gramStart"/>
-            <w:r>
-              <w:t>teams</w:t>
-            </w:r>
-            <w:proofErr w:type="gramEnd"/>
-            <w:r>
-              <w:t xml:space="preserve"> channel. If anyone thinks of anything we need to add or </w:t>
-            </w:r>
-            <w:proofErr w:type="gramStart"/>
-            <w:r>
-              <w:t>edit on those</w:t>
-            </w:r>
-            <w:proofErr w:type="gramEnd"/>
-            <w:r>
-              <w:t xml:space="preserve"> over the next few days before our meeting just let me know. </w:t>
+              <w:t>I will also post the product back log and sprint backlog in the shared documents on the teams channel. If anyone thinks of anything we need to add or edit on those over the next few days before our meeting just let me know. </w:t>
             </w:r>
           </w:p>
         </w:tc>
@@ -1820,15 +1652,7 @@
               <w:t xml:space="preserve">Review and </w:t>
             </w:r>
             <w:r>
-              <w:t xml:space="preserve">Merges #18 and #19, c3fcd69 and </w:t>
-            </w:r>
-            <w:proofErr w:type="gramStart"/>
-            <w:r>
-              <w:t>de8a126 @</w:t>
-            </w:r>
-            <w:proofErr w:type="gramEnd"/>
-            <w:r>
-              <w:t xml:space="preserve"> 6:00 PM</w:t>
+              <w:t>Merges #18 and #19, c3fcd69 and de8a126 @ 6:00 PM</w:t>
             </w:r>
           </w:p>
         </w:tc>
@@ -1871,6 +1695,9 @@
         </w:tc>
       </w:tr>
       <w:tr>
+        <w:trPr>
+          <w:trHeight w:val="1484"/>
+        </w:trPr>
         <w:tc>
           <w:tcPr>
             <w:tcW w:w="1615" w:type="dxa"/>
@@ -1930,13 +1757,55 @@
           <w:tcPr>
             <w:tcW w:w="1615" w:type="dxa"/>
           </w:tcPr>
-          <w:p/>
+          <w:p>
+            <w:r>
+              <w:t>Emi Collins</w:t>
+            </w:r>
+          </w:p>
         </w:tc>
         <w:tc>
           <w:tcPr>
             <w:tcW w:w="7735" w:type="dxa"/>
           </w:tcPr>
-          <w:p/>
+          <w:p>
+            <w:r>
+              <w:t xml:space="preserve">Commit </w:t>
+            </w:r>
+            <w:r>
+              <w:t>c5bd5a3103300aac02aaa50e27b58575f045eb37</w:t>
+            </w:r>
+          </w:p>
+          <w:p>
+            <w:r>
+              <w:t>Date: Friday Mar 6 6:27 pm EST 2026</w:t>
+            </w:r>
+          </w:p>
+          <w:p>
+            <w:r>
+              <w:t xml:space="preserve">Updated the class diagram to include </w:t>
+            </w:r>
+            <w:proofErr w:type="spellStart"/>
+            <w:r>
+              <w:t>FoodItemCell</w:t>
+            </w:r>
+            <w:proofErr w:type="spellEnd"/>
+            <w:r>
+              <w:t xml:space="preserve">, </w:t>
+            </w:r>
+            <w:proofErr w:type="spellStart"/>
+            <w:r>
+              <w:t>HomeDashboardPageController</w:t>
+            </w:r>
+            <w:proofErr w:type="spellEnd"/>
+            <w:r>
+              <w:t xml:space="preserve">, and </w:t>
+            </w:r>
+            <w:proofErr w:type="spellStart"/>
+            <w:r>
+              <w:t>HomeDashboardViewModel</w:t>
+            </w:r>
+            <w:proofErr w:type="spellEnd"/>
+          </w:p>
         </w:tc>
       </w:tr>
       <w:tr>
@@ -1944,13 +1813,42 @@
           <w:tcPr>
             <w:tcW w:w="1615" w:type="dxa"/>
           </w:tcPr>
-          <w:p/>
+          <w:p>
+            <w:r>
+              <w:t>Emi Collins</w:t>
+            </w:r>
+          </w:p>
         </w:tc>
         <w:tc>
           <w:tcPr>
             <w:tcW w:w="7735" w:type="dxa"/>
           </w:tcPr>
-          <w:p/>
+          <w:p>
+            <w:r>
+              <w:t xml:space="preserve">Commit </w:t>
+            </w:r>
+            <w:r>
+              <w:t>714a48466598f27827f6b0b7cd41625ad77bb0fd</w:t>
+            </w:r>
+          </w:p>
+          <w:p>
+            <w:r>
+              <w:t>Date: Wednesday Mar 4 10:28 pm EST</w:t>
+            </w:r>
+          </w:p>
+          <w:p>
+            <w:r>
+              <w:t xml:space="preserve">Finished UI for Today's Food feature. Initialized new </w:t>
+            </w:r>
+            <w:proofErr w:type="spellStart"/>
+            <w:r>
+              <w:t>componenets</w:t>
+            </w:r>
+            <w:proofErr w:type="spellEnd"/>
+            <w:r>
+              <w:t xml:space="preserve"> in controller, bound, and added methods to View Model so that the page works properly with the features it has. The items in the list can be removed, but as of right now, the add button will not navigate since we do not have an add food page. A date can be selected, but the list will not yet update to that day based on data.</w:t>
+            </w:r>
+          </w:p>
         </w:tc>
       </w:tr>
     </w:tbl>
@@ -2022,6 +1920,7 @@
                 <w:b/>
                 <w:bCs/>
               </w:rPr>
+              <w:lastRenderedPageBreak/>
               <w:t>Priority</w:t>
             </w:r>
           </w:p>
@@ -2935,7 +2834,6 @@
                 <w:rFonts w:ascii="Calibri" w:hAnsi="Calibri" w:cs="Calibri"/>
                 <w:color w:val="000000"/>
               </w:rPr>
-              <w:lastRenderedPageBreak/>
               <w:t>4.1</w:t>
             </w:r>
           </w:p>
@@ -3820,23 +3718,7 @@
           <w:b/>
           <w:bCs/>
         </w:rPr>
-        <w:t xml:space="preserve"> session where you </w:t>
-      </w:r>
-      <w:proofErr w:type="gramStart"/>
-      <w:r>
-        <w:rPr>
-          <w:b/>
-          <w:bCs/>
-        </w:rPr>
-        <w:t>used</w:t>
-      </w:r>
-      <w:proofErr w:type="gramEnd"/>
-      <w:r>
-        <w:rPr>
-          <w:b/>
-          <w:bCs/>
-        </w:rPr>
-        <w:t xml:space="preserve"> generative AI, give the following:</w:t>
+        <w:t xml:space="preserve"> session where you used generative AI, give the following:</w:t>
       </w:r>
     </w:p>
     <w:p>
@@ -4160,7 +4042,6 @@
           <w:b/>
           <w:bCs/>
         </w:rPr>
-        <w:lastRenderedPageBreak/>
         <w:t>Justin Smith</w:t>
       </w:r>
     </w:p>
@@ -4263,23 +4144,7 @@
           <w:b/>
           <w:bCs/>
         </w:rPr>
-        <w:t xml:space="preserve">. </w:t>
-      </w:r>
-      <w:proofErr w:type="gramStart"/>
-      <w:r>
-        <w:rPr>
-          <w:b/>
-          <w:bCs/>
-        </w:rPr>
-        <w:t>Also</w:t>
-      </w:r>
-      <w:proofErr w:type="gramEnd"/>
-      <w:r>
-        <w:rPr>
-          <w:b/>
-          <w:bCs/>
-        </w:rPr>
-        <w:t xml:space="preserve"> with writing test cases for testing the </w:t>
+        <w:t xml:space="preserve">. Also with writing test cases for testing the </w:t>
       </w:r>
       <w:proofErr w:type="spellStart"/>
       <w:r>
@@ -7065,4 +6930,16 @@
     </a:ext>
   </a:extLst>
 </a:theme>
+</file>
+
+<file path=customXml/item1.xml><?xml version="1.0" encoding="utf-8"?>
+<b:Sources xmlns:b="http://schemas.openxmlformats.org/officeDocument/2006/bibliography" xmlns="http://schemas.openxmlformats.org/officeDocument/2006/bibliography" SelectedStyle="\APASixthEditionOfficeOnline.xsl" StyleName="APA" Version="6"/>
+</file>
+
+<file path=customXml/itemProps1.xml><?xml version="1.0" encoding="utf-8"?>
+<ds:datastoreItem xmlns:ds="http://schemas.openxmlformats.org/officeDocument/2006/customXml" ds:itemID="{B3ED3E2D-85DB-4A9C-8E52-703245E58E83}">
+  <ds:schemaRefs>
+    <ds:schemaRef ds:uri="http://schemas.openxmlformats.org/officeDocument/2006/bibliography"/>
+  </ds:schemaRefs>
+</ds:datastoreItem>
 </file>
</xml_diff>